<commit_message>
docs: hồ sơ thẩm định vòng 5 chuyển sang plugin 1.3.4; BC v6, HD v7 (kèm dòng trống người phụ trách thêm), BC tiếp thu v2 dựng lại; nghiệm thu ca 05, 07 trên 1.3.4 đạt 4/4
Co-Authored-By: Claude Opus 5.5 <noreply@anthropic.com>
</commit_message>
<xml_diff>
--- a/30-Ket-Qua/2026-09-27/Ho-So-Tham-Dinh-Vong-5/4-Van-ban/BC_Qua-trinh-xay-dung-bo-cong-cu-KTC-Quan-tri_20260928_v6_TrackChanges.docx
+++ b/30-Ket-Qua/2026-09-27/Ho-So-Tham-Dinh-Vong-5/4-Van-ban/BC_Qua-trinh-xay-dung-bo-cong-cu-KTC-Quan-tri_20260928_v6_TrackChanges.docx
@@ -1849,7 +1849,7 @@
                 <w:szCs w:val="28"/>
               </w:rPr>
             </w:pPr>
-            <w:del w:id="1001" w:author="Cập nhật QĐ 2119, bản 1.3.3 (Claude)" w:date="2026-09-28T11:35:13Z">
+            <w:del w:id="1001" w:author="Cập nhật QĐ 2119, bản 1.3.4 (Claude)" w:date="2026-09-28T13:45:30Z">
               <w:r>
                 <w:rPr>
                   <w:rFonts w:asciiTheme="majorHAnsi" w:hAnsiTheme="majorHAnsi" w:cstheme="majorHAnsi"/>
@@ -1859,7 +1859,7 @@
                 <w:delText xml:space="preserve">Bản 1.3.2 (hiện hành), mã SHA-256</w:delText>
               </w:r>
             </w:del>
-            <w:ins w:id="1002" w:author="Cập nhật QĐ 2119, bản 1.3.3 (Claude)" w:date="2026-09-28T11:35:13Z">
+            <w:ins w:id="1002" w:author="Cập nhật QĐ 2119, bản 1.3.4 (Claude)" w:date="2026-09-28T13:45:30Z">
               <w:r>
                 <w:rPr>
                   <w:rFonts w:asciiTheme="majorHAnsi" w:hAnsiTheme="majorHAnsi" w:cstheme="majorHAnsi"/>
@@ -1908,7 +1908,7 @@
       <w:tr>
         <w:trPr>
           <w:jc w:val="center"/>
-          <w:ins w:id="1003" w:author="Cập nhật QĐ 2119, bản 1.3.3 (Claude)" w:date="2026-09-28T11:35:13Z"/>
+          <w:ins w:id="1003" w:author="Cập nhật QĐ 2119, bản 1.3.4 (Claude)" w:date="2026-09-28T13:45:30Z"/>
         </w:trPr>
         <w:tc>
           <w:tcPr>
@@ -1920,13 +1920,13 @@
               <w:widowControl w:val="0"/>
               <w:jc w:val="center"/>
               <w:rPr>
-                <w:ins w:id="1005" w:author="Cập nhật QĐ 2119, bản 1.3.3 (Claude)" w:date="2026-09-28T11:35:13Z"/>
-                <w:rFonts w:asciiTheme="majorHAnsi" w:hAnsiTheme="majorHAnsi" w:cstheme="majorHAnsi"/>
-                <w:sz w:val="28"/>
-                <w:szCs w:val="28"/>
-              </w:rPr>
-            </w:pPr>
-            <w:ins w:id="1004" w:author="Cập nhật QĐ 2119, bản 1.3.3 (Claude)" w:date="2026-09-28T11:35:13Z">
+                <w:ins w:id="1005" w:author="Cập nhật QĐ 2119, bản 1.3.4 (Claude)" w:date="2026-09-28T13:45:30Z"/>
+                <w:rFonts w:asciiTheme="majorHAnsi" w:hAnsiTheme="majorHAnsi" w:cstheme="majorHAnsi"/>
+                <w:sz w:val="28"/>
+                <w:szCs w:val="28"/>
+              </w:rPr>
+            </w:pPr>
+            <w:ins w:id="1004" w:author="Cập nhật QĐ 2119, bản 1.3.4 (Claude)" w:date="2026-09-28T13:45:30Z">
               <w:r>
                 <w:rPr>
                   <w:rFonts w:asciiTheme="majorHAnsi" w:hAnsiTheme="majorHAnsi" w:cstheme="majorHAnsi"/>
@@ -1948,20 +1948,20 @@
               <w:widowControl w:val="0"/>
               <w:jc w:val="both"/>
               <w:rPr>
-                <w:ins w:id="1007" w:author="Cập nhật QĐ 2119, bản 1.3.3 (Claude)" w:date="2026-09-28T11:35:13Z"/>
-                <w:rFonts w:asciiTheme="majorHAnsi" w:hAnsiTheme="majorHAnsi" w:cstheme="majorHAnsi"/>
-                <w:sz w:val="28"/>
-                <w:szCs w:val="28"/>
-              </w:rPr>
-            </w:pPr>
-            <w:ins w:id="1006" w:author="Cập nhật QĐ 2119, bản 1.3.3 (Claude)" w:date="2026-09-28T11:35:13Z">
+                <w:ins w:id="1007" w:author="Cập nhật QĐ 2119, bản 1.3.4 (Claude)" w:date="2026-09-28T13:45:30Z"/>
+                <w:rFonts w:asciiTheme="majorHAnsi" w:hAnsiTheme="majorHAnsi" w:cstheme="majorHAnsi"/>
+                <w:sz w:val="28"/>
+                <w:szCs w:val="28"/>
+              </w:rPr>
+            </w:pPr>
+            <w:ins w:id="1006" w:author="Cập nhật QĐ 2119, bản 1.3.4 (Claude)" w:date="2026-09-28T13:45:30Z">
               <w:r>
                 <w:rPr>
                   <w:rFonts w:asciiTheme="majorHAnsi" w:hAnsiTheme="majorHAnsi" w:cstheme="majorHAnsi"/>
                   <w:sz w:val="28"/>
                   <w:szCs w:val="28"/>
                 </w:rPr>
-                <w:t xml:space="preserve">Cập nhật theo Quyết định số 2119/QĐ-CĐKT ngày 28/9/2026 ban hành Danh mục sản phẩm, công việc (thay thế danh mục dự thảo kèm Thông báo số 1052/TB-CĐKT): hệ số quy đổi tra theo từng sản phẩm của Danh mục chính thức; sửa thao tác chặn ghi chặn nhầm lệnh chỉ đọc kho</w:t>
+                <w:t xml:space="preserve">Cập nhật theo Quyết định số 2119/QĐ-CĐKT ngày 28/9/2026 ban hành Danh mục sản phẩm, công việc (thay thế danh mục dự thảo kèm Thông báo số 1052/TB-CĐKT): hệ số quy đổi tra theo từng sản phẩm của Danh mục chính thức; chuẩn phân loại 6 Trục ghi căn cứ Quyết định số 1923/QĐ-CĐKT (Phụ lục I, II) cho cột Điểm chấm, Hệ số quy đổi; sửa thao tác chặn ghi chặn nhầm lệnh chỉ đọc kho</w:t>
               </w:r>
             </w:ins>
           </w:p>
@@ -1976,20 +1976,20 @@
               <w:widowControl w:val="0"/>
               <w:jc w:val="both"/>
               <w:rPr>
-                <w:ins w:id="1009" w:author="Cập nhật QĐ 2119, bản 1.3.3 (Claude)" w:date="2026-09-28T11:35:13Z"/>
-                <w:rFonts w:asciiTheme="majorHAnsi" w:hAnsiTheme="majorHAnsi" w:cstheme="majorHAnsi"/>
-                <w:sz w:val="28"/>
-                <w:szCs w:val="28"/>
-              </w:rPr>
-            </w:pPr>
-            <w:ins w:id="1008" w:author="Cập nhật QĐ 2119, bản 1.3.3 (Claude)" w:date="2026-09-28T11:35:13Z">
+                <w:ins w:id="1009" w:author="Cập nhật QĐ 2119, bản 1.3.4 (Claude)" w:date="2026-09-28T13:45:30Z"/>
+                <w:rFonts w:asciiTheme="majorHAnsi" w:hAnsiTheme="majorHAnsi" w:cstheme="majorHAnsi"/>
+                <w:sz w:val="28"/>
+                <w:szCs w:val="28"/>
+              </w:rPr>
+            </w:pPr>
+            <w:ins w:id="1008" w:author="Cập nhật QĐ 2119, bản 1.3.4 (Claude)" w:date="2026-09-28T13:45:30Z">
               <w:r>
                 <w:rPr>
                   <w:rFonts w:asciiTheme="majorHAnsi" w:hAnsiTheme="majorHAnsi" w:cstheme="majorHAnsi"/>
                   <w:sz w:val="28"/>
                   <w:szCs w:val="28"/>
                 </w:rPr>
-                <w:t xml:space="preserve">Bản 1.3.3 (hiện hành), mã SHA-256 c1609207...ec1b, mã nguồn commit 720b853; hồ sơ bằng chứng kiểm thử</w:t>
+                <w:t xml:space="preserve">Bản 1.3.3, 1.3.4 (hiện hành), mã SHA-256 45c6199e...fa5e, mã nguồn commit a989cd9; hồ sơ bằng chứng kiểm thử</w:t>
               </w:r>
             </w:ins>
           </w:p>
@@ -2004,13 +2004,13 @@
               <w:widowControl w:val="0"/>
               <w:jc w:val="center"/>
               <w:rPr>
-                <w:ins w:id="1011" w:author="Cập nhật QĐ 2119, bản 1.3.3 (Claude)" w:date="2026-09-28T11:35:13Z"/>
-                <w:rFonts w:asciiTheme="majorHAnsi" w:hAnsiTheme="majorHAnsi" w:cstheme="majorHAnsi"/>
-                <w:sz w:val="28"/>
-                <w:szCs w:val="28"/>
-              </w:rPr>
-            </w:pPr>
-            <w:ins w:id="1010" w:author="Cập nhật QĐ 2119, bản 1.3.3 (Claude)" w:date="2026-09-28T11:35:13Z">
+                <w:ins w:id="1011" w:author="Cập nhật QĐ 2119, bản 1.3.4 (Claude)" w:date="2026-09-28T13:45:30Z"/>
+                <w:rFonts w:asciiTheme="majorHAnsi" w:hAnsiTheme="majorHAnsi" w:cstheme="majorHAnsi"/>
+                <w:sz w:val="28"/>
+                <w:szCs w:val="28"/>
+              </w:rPr>
+            </w:pPr>
+            <w:ins w:id="1010" w:author="Cập nhật QĐ 2119, bản 1.3.4 (Claude)" w:date="2026-09-28T13:45:30Z">
               <w:r>
                 <w:rPr>
                   <w:rFonts w:asciiTheme="majorHAnsi" w:hAnsiTheme="majorHAnsi" w:cstheme="majorHAnsi"/>
@@ -2043,7 +2043,7 @@
         </w:rPr>
         <w:t xml:space="preserve">Toàn bộ quá trình được lưu vết: </w:t>
       </w:r>
-      <w:del w:id="1012" w:author="Cập nhật QĐ 2119, bản 1.3.3 (Claude)" w:date="2026-09-28T11:35:13Z">
+      <w:del w:id="1012" w:author="Cập nhật QĐ 2119, bản 1.3.4 (Claude)" w:date="2026-09-28T13:45:30Z">
         <w:r>
           <w:rPr>
             <w:rFonts w:asciiTheme="majorHAnsi" w:hAnsiTheme="majorHAnsi" w:cstheme="majorHAnsi"/>
@@ -2053,14 +2053,14 @@
           <w:delText xml:space="preserve">87 lần cập nhật trên kho mã nguồn (từ 18/9/2026), nhật ký thay đổi 28 phiên bản, 26</w:delText>
         </w:r>
       </w:del>
-      <w:ins w:id="1013" w:author="Cập nhật QĐ 2119, bản 1.3.3 (Claude)" w:date="2026-09-28T11:35:13Z">
+      <w:ins w:id="1013" w:author="Cập nhật QĐ 2119, bản 1.3.4 (Claude)" w:date="2026-09-28T13:45:30Z">
         <w:r>
           <w:rPr>
             <w:rFonts w:asciiTheme="majorHAnsi" w:hAnsiTheme="majorHAnsi" w:cstheme="majorHAnsi"/>
             <w:sz w:val="28"/>
             <w:szCs w:val="28"/>
           </w:rPr>
-          <w:t xml:space="preserve">94 lần cập nhật trên kho mã nguồn (từ 18/9/2026), nhật ký thay đổi 29 phiên bản, 27</w:t>
+          <w:t xml:space="preserve">98 lần cập nhật trên kho mã nguồn (từ 18/9/2026), nhật ký thay đổi 30 phiên bản, 28</w:t>
         </w:r>
       </w:ins>
       <w:r>
@@ -2323,7 +2323,7 @@
               </w:rPr>
               <w:t xml:space="preserve">Kiểm kê kho KTC-Database (8 kho), mẫu Phụ lục TB 736, TB 817, </w:t>
             </w:r>
-            <w:del w:id="1014" w:author="Cập nhật QĐ 2119, bản 1.3.3 (Claude)" w:date="2026-09-28T11:35:13Z">
+            <w:del w:id="1014" w:author="Cập nhật QĐ 2119, bản 1.3.4 (Claude)" w:date="2026-09-28T13:45:30Z">
               <w:r>
                 <w:rPr>
                   <w:rFonts w:asciiTheme="majorHAnsi" w:hAnsiTheme="majorHAnsi" w:cstheme="majorHAnsi"/>
@@ -2333,7 +2333,7 @@
                 <w:delText xml:space="preserve">Quyết định số 1923/QĐ-CĐKT, TB 1052, 6 mẫu Kế hoạch + KPI</w:delText>
               </w:r>
             </w:del>
-            <w:ins w:id="1015" w:author="Cập nhật QĐ 2119, bản 1.3.3 (Claude)" w:date="2026-09-28T11:35:13Z">
+            <w:ins w:id="1015" w:author="Cập nhật QĐ 2119, bản 1.3.4 (Claude)" w:date="2026-09-28T13:45:30Z">
               <w:r>
                 <w:rPr>
                   <w:rFonts w:asciiTheme="majorHAnsi" w:hAnsiTheme="majorHAnsi" w:cstheme="majorHAnsi"/>
@@ -2650,7 +2650,7 @@
                 <w:szCs w:val="28"/>
               </w:rPr>
             </w:pPr>
-            <w:del w:id="1016" w:author="Cập nhật QĐ 2119, bản 1.3.3 (Claude)" w:date="2026-09-28T11:35:13Z">
+            <w:del w:id="1016" w:author="Cập nhật QĐ 2119, bản 1.3.4 (Claude)" w:date="2026-09-28T13:45:30Z">
               <w:r>
                 <w:rPr>
                   <w:rFonts w:asciiTheme="majorHAnsi" w:hAnsiTheme="majorHAnsi" w:cstheme="majorHAnsi"/>
@@ -2660,14 +2660,14 @@
                 <w:delText xml:space="preserve">Dừng, không tự đặt quy tắc đối với: hai thang điểm quy đổi khối lượng công việc chưa có văn bản phân định; </w:delText>
               </w:r>
             </w:del>
-            <w:ins w:id="1017" w:author="Cập nhật QĐ 2119, bản 1.3.3 (Claude)" w:date="2026-09-28T11:35:13Z">
+            <w:ins w:id="1017" w:author="Cập nhật QĐ 2119, bản 1.3.4 (Claude)" w:date="2026-09-28T13:45:30Z">
               <w:r>
                 <w:rPr>
                   <w:rFonts w:asciiTheme="majorHAnsi" w:hAnsiTheme="majorHAnsi" w:cstheme="majorHAnsi"/>
                   <w:sz w:val="28"/>
                   <w:szCs w:val="28"/>
                 </w:rPr>
-                <w:t xml:space="preserve">Dừng, không tự đặt quy tắc đối với: hai thang điểm quy đổi khối lượng công việc chưa có văn bản phân định (đã có văn bản: Quyết định số 2119/QĐ-CĐKT ngày 28/9/2026, Bộ công cụ áp dụng từ bản 1.3.3; quy ước nhân hệ số sản phẩm với hệ số mức độ công việc chưa có văn bản, vẫn cảnh báo); </w:t>
+                <w:t xml:space="preserve">Dừng, không tự đặt quy tắc đối với: hai thang điểm quy đổi khối lượng công việc chưa có văn bản phân định (đã có văn bản: Quyết định số 2119/QĐ-CĐKT ngày 28/9/2026, Bộ công cụ áp dụng từ bản 1.3.3; cột Điểm chấm, Hệ số quy đổi của kế hoạch, báo cáo giữ 4 mức theo Quyết định số 1923/QĐ-CĐKT Phụ lục I, II; quy ước nhân hệ số sản phẩm với hệ số mức độ công việc chưa có văn bản, vẫn cảnh báo); </w:t>
               </w:r>
             </w:ins>
             <w:r>
@@ -3141,7 +3141,7 @@
           <w:szCs w:val="28"/>
         </w:rPr>
       </w:pPr>
-      <w:del w:id="1018" w:author="Cập nhật QĐ 2119, bản 1.3.3 (Claude)" w:date="2026-09-28T11:35:13Z">
+      <w:del w:id="1018" w:author="Cập nhật QĐ 2119, bản 1.3.4 (Claude)" w:date="2026-09-28T13:45:30Z">
         <w:r>
           <w:rPr>
             <w:rFonts w:asciiTheme="majorHAnsi" w:hAnsiTheme="majorHAnsi" w:cstheme="majorHAnsi"/>
@@ -3153,7 +3153,7 @@
           <w:delText xml:space="preserve">4. Kết quả kiểm thử (chạy lại ngày 27/9/2026, bản 1.3.2)</w:delText>
         </w:r>
       </w:del>
-      <w:ins w:id="1019" w:author="Cập nhật QĐ 2119, bản 1.3.3 (Claude)" w:date="2026-09-28T11:35:13Z">
+      <w:ins w:id="1019" w:author="Cập nhật QĐ 2119, bản 1.3.4 (Claude)" w:date="2026-09-28T13:45:30Z">
         <w:r>
           <w:rPr>
             <w:rFonts w:asciiTheme="majorHAnsi" w:hAnsiTheme="majorHAnsi" w:cstheme="majorHAnsi"/>
@@ -3162,7 +3162,7 @@
             <w:sz w:val="28"/>
             <w:szCs w:val="28"/>
           </w:rPr>
-          <w:t xml:space="preserve">4. Kết quả kiểm thử (chạy lại ngày 28/9/2026, bản 1.3.3)</w:t>
+          <w:t xml:space="preserve">4. Kết quả kiểm thử (chạy lại ngày 28/9/2026, bản 1.3.4)</w:t>
         </w:r>
       </w:ins>
     </w:p>
@@ -3464,7 +3464,7 @@
               </w:rPr>
               <w:t xml:space="preserve">21 bộ ca thử hồi quy (tính KPI, xếp loại, biểu mẫu, viện dẫn, thể thức, minh chứng, Track Changes, nhật ký, </w:t>
             </w:r>
-            <w:del w:id="1020" w:author="Cập nhật QĐ 2119, bản 1.3.3 (Claude)" w:date="2026-09-28T11:35:13Z">
+            <w:del w:id="1020" w:author="Cập nhật QĐ 2119, bản 1.3.4 (Claude)" w:date="2026-09-28T13:45:30Z">
               <w:r>
                 <w:rPr>
                   <w:rFonts w:asciiTheme="majorHAnsi" w:hAnsiTheme="majorHAnsi" w:cstheme="majorHAnsi"/>
@@ -3474,7 +3474,7 @@
                 <w:delText xml:space="preserve">thao tác chặn ghi và bản dựng 1.3.0, 1.3.1)</w:delText>
               </w:r>
             </w:del>
-            <w:ins w:id="1021" w:author="Cập nhật QĐ 2119, bản 1.3.3 (Claude)" w:date="2026-09-28T11:35:13Z">
+            <w:ins w:id="1021" w:author="Cập nhật QĐ 2119, bản 1.3.4 (Claude)" w:date="2026-09-28T13:45:30Z">
               <w:r>
                 <w:rPr>
                   <w:rFonts w:asciiTheme="majorHAnsi" w:hAnsiTheme="majorHAnsi" w:cstheme="majorHAnsi"/>
@@ -3526,7 +3526,7 @@
                 <w:szCs w:val="28"/>
               </w:rPr>
             </w:pPr>
-            <w:del w:id="1022" w:author="Cập nhật QĐ 2119, bản 1.3.3 (Claude)" w:date="2026-09-28T11:35:13Z">
+            <w:del w:id="1022" w:author="Cập nhật QĐ 2119, bản 1.3.4 (Claude)" w:date="2026-09-28T13:45:30Z">
               <w:r>
                 <w:rPr>
                   <w:rFonts w:asciiTheme="majorHAnsi" w:hAnsiTheme="majorHAnsi" w:cstheme="majorHAnsi"/>
@@ -3536,7 +3536,7 @@
                 <w:delText>20/20 đạt</w:delText>
               </w:r>
             </w:del>
-            <w:ins w:id="1023" w:author="Cập nhật QĐ 2119, bản 1.3.3 (Claude)" w:date="2026-09-28T11:35:13Z">
+            <w:ins w:id="1023" w:author="Cập nhật QĐ 2119, bản 1.3.4 (Claude)" w:date="2026-09-28T13:45:30Z">
               <w:r>
                 <w:rPr>
                   <w:rFonts w:asciiTheme="majorHAnsi" w:hAnsiTheme="majorHAnsi" w:cstheme="majorHAnsi"/>
@@ -4038,7 +4038,7 @@
                 <w:szCs w:val="28"/>
               </w:rPr>
             </w:pPr>
-            <w:del w:id="1024" w:author="Cập nhật QĐ 2119, bản 1.3.3 (Claude)" w:date="2026-09-28T11:35:13Z">
+            <w:del w:id="1024" w:author="Cập nhật QĐ 2119, bản 1.3.4 (Claude)" w:date="2026-09-28T13:45:30Z">
               <w:r>
                 <w:rPr>
                   <w:rFonts w:asciiTheme="majorHAnsi" w:hAnsiTheme="majorHAnsi" w:cstheme="majorHAnsi"/>
@@ -4048,7 +4048,7 @@
                 <w:delText xml:space="preserve">Bản 1.3.2; ngày 27/9/2026</w:delText>
               </w:r>
             </w:del>
-            <w:ins w:id="1025" w:author="Cập nhật QĐ 2119, bản 1.3.3 (Claude)" w:date="2026-09-28T11:35:13Z">
+            <w:ins w:id="1025" w:author="Cập nhật QĐ 2119, bản 1.3.4 (Claude)" w:date="2026-09-28T13:45:30Z">
               <w:r>
                 <w:rPr>
                   <w:rFonts w:asciiTheme="majorHAnsi" w:hAnsiTheme="majorHAnsi" w:cstheme="majorHAnsi"/>
@@ -4075,7 +4075,7 @@
                 <w:szCs w:val="28"/>
               </w:rPr>
             </w:pPr>
-            <w:del w:id="1026" w:author="Cập nhật QĐ 2119, bản 1.3.3 (Claude)" w:date="2026-09-28T11:35:13Z">
+            <w:del w:id="1026" w:author="Cập nhật QĐ 2119, bản 1.3.4 (Claude)" w:date="2026-09-28T13:45:30Z">
               <w:r>
                 <w:rPr>
                   <w:rFonts w:asciiTheme="majorHAnsi" w:hAnsiTheme="majorHAnsi" w:cstheme="majorHAnsi"/>
@@ -4085,7 +4085,7 @@
                 <w:delText>15/15 ca, 30/30 lượt đạt</w:delText>
               </w:r>
             </w:del>
-            <w:ins w:id="1027" w:author="Cập nhật QĐ 2119, bản 1.3.3 (Claude)" w:date="2026-09-28T11:35:13Z">
+            <w:ins w:id="1027" w:author="Cập nhật QĐ 2119, bản 1.3.4 (Claude)" w:date="2026-09-28T13:45:30Z">
               <w:r>
                 <w:rPr>
                   <w:rFonts w:asciiTheme="majorHAnsi" w:hAnsiTheme="majorHAnsi" w:cstheme="majorHAnsi"/>
@@ -4142,7 +4142,7 @@
                 <w:szCs w:val="28"/>
               </w:rPr>
             </w:pPr>
-            <w:del w:id="1028" w:author="Cập nhật QĐ 2119, bản 1.3.3 (Claude)" w:date="2026-09-28T11:35:13Z">
+            <w:del w:id="1028" w:author="Cập nhật QĐ 2119, bản 1.3.4 (Claude)" w:date="2026-09-28T13:45:30Z">
               <w:r>
                 <w:rPr>
                   <w:rFonts w:asciiTheme="majorHAnsi" w:hAnsiTheme="majorHAnsi" w:cstheme="majorHAnsi"/>
@@ -4152,14 +4152,14 @@
                 <w:delText xml:space="preserve">Thao tác chặn ghi: chạy lại 1.653 câu lệnh thật trong nhật ký vận hành</w:delText>
               </w:r>
             </w:del>
-            <w:ins w:id="1029" w:author="Cập nhật QĐ 2119, bản 1.3.3 (Claude)" w:date="2026-09-28T11:35:13Z">
+            <w:ins w:id="1029" w:author="Cập nhật QĐ 2119, bản 1.3.4 (Claude)" w:date="2026-09-28T13:45:30Z">
               <w:r>
                 <w:rPr>
                   <w:rFonts w:asciiTheme="majorHAnsi" w:hAnsiTheme="majorHAnsi" w:cstheme="majorHAnsi"/>
                   <w:sz w:val="28"/>
                   <w:szCs w:val="28"/>
                 </w:rPr>
-                <w:t xml:space="preserve">Thao tác chặn ghi: chạy lại 2.241 câu lệnh thật trong nhật ký vận hành</w:t>
+                <w:t xml:space="preserve">Thao tác chặn ghi: chạy lại 2.289 câu lệnh thật trong nhật ký vận hành</w:t>
               </w:r>
             </w:ins>
           </w:p>
@@ -4179,7 +4179,7 @@
                 <w:szCs w:val="28"/>
               </w:rPr>
             </w:pPr>
-            <w:del w:id="1030" w:author="Cập nhật QĐ 2119, bản 1.3.3 (Claude)" w:date="2026-09-28T11:35:13Z">
+            <w:del w:id="1030" w:author="Cập nhật QĐ 2119, bản 1.3.4 (Claude)" w:date="2026-09-28T13:45:30Z">
               <w:r>
                 <w:rPr>
                   <w:rFonts w:asciiTheme="majorHAnsi" w:hAnsiTheme="majorHAnsi" w:cstheme="majorHAnsi"/>
@@ -4189,14 +4189,14 @@
                 <w:delText xml:space="preserve">Bản 1.3.2; gồm các lệnh vượt chặn do thẩm định lần 3, lần 4 phát hiện (ca thử riêng)</w:delText>
               </w:r>
             </w:del>
-            <w:ins w:id="1031" w:author="Cập nhật QĐ 2119, bản 1.3.3 (Claude)" w:date="2026-09-28T11:35:13Z">
+            <w:ins w:id="1031" w:author="Cập nhật QĐ 2119, bản 1.3.4 (Claude)" w:date="2026-09-28T13:45:30Z">
               <w:r>
                 <w:rPr>
                   <w:rFonts w:asciiTheme="majorHAnsi" w:hAnsiTheme="majorHAnsi" w:cstheme="majorHAnsi"/>
                   <w:sz w:val="28"/>
                   <w:szCs w:val="28"/>
                 </w:rPr>
-                <w:t xml:space="preserve">Bản 1.3.3 so với 1.3.2; gồm các lệnh vượt chặn do thẩm định lần 3, lần 4 phát hiện, lệnh bị chặn nhầm ngày 28/9/2026 (ca thử riêng)</w:t>
+                <w:t xml:space="preserve">Bản 1.3.4 so với 1.3.2; gồm các lệnh vượt chặn do thẩm định lần 3, lần 4 phát hiện, các lệnh bị chặn nhầm ngày 28/9/2026 (ca thử riêng)</w:t>
               </w:r>
             </w:ins>
           </w:p>
@@ -4216,7 +4216,7 @@
                 <w:szCs w:val="28"/>
               </w:rPr>
             </w:pPr>
-            <w:del w:id="1032" w:author="Cập nhật QĐ 2119, bản 1.3.3 (Claude)" w:date="2026-09-28T11:35:13Z">
+            <w:del w:id="1032" w:author="Cập nhật QĐ 2119, bản 1.3.4 (Claude)" w:date="2026-09-28T13:45:30Z">
               <w:r>
                 <w:rPr>
                   <w:rFonts w:asciiTheme="majorHAnsi" w:hAnsiTheme="majorHAnsi" w:cstheme="majorHAnsi"/>
@@ -4226,14 +4226,14 @@
                 <w:delText xml:space="preserve">0 chặn nhầm</w:delText>
               </w:r>
             </w:del>
-            <w:ins w:id="1033" w:author="Cập nhật QĐ 2119, bản 1.3.3 (Claude)" w:date="2026-09-28T11:35:13Z">
+            <w:ins w:id="1033" w:author="Cập nhật QĐ 2119, bản 1.3.4 (Claude)" w:date="2026-09-28T13:45:30Z">
               <w:r>
                 <w:rPr>
                   <w:rFonts w:asciiTheme="majorHAnsi" w:hAnsiTheme="majorHAnsi" w:cstheme="majorHAnsi"/>
                   <w:sz w:val="28"/>
                   <w:szCs w:val="28"/>
                 </w:rPr>
-                <w:t xml:space="preserve">Bỏ 22 lần chặn nhầm (lệnh chỉ đọc kho); 0 lần chặn mới</w:t>
+                <w:t xml:space="preserve">Bỏ 25 lần chặn nhầm (lệnh chỉ đọc kho); 0 lần chặn mới</w:t>
               </w:r>
             </w:ins>
           </w:p>
@@ -4396,7 +4396,7 @@
               </w:rPr>
               <w:t xml:space="preserve">Vận hành thực tế: người phụ trách dùng Bộ công cụ trong công việc của Phòng TH-HC&amp;QT </w:t>
             </w:r>
-            <w:del w:id="1034" w:author="Cập nhật QĐ 2119, bản 1.3.3 (Claude)" w:date="2026-09-28T11:35:13Z">
+            <w:del w:id="1034" w:author="Cập nhật QĐ 2119, bản 1.3.4 (Claude)" w:date="2026-09-28T13:45:31Z">
               <w:r>
                 <w:rPr>
                   <w:rFonts w:asciiTheme="majorHAnsi" w:hAnsiTheme="majorHAnsi" w:cstheme="majorHAnsi"/>
@@ -4406,7 +4406,7 @@
                 <w:delText xml:space="preserve">trên Claude Code (18 - 27/9/2026)</w:delText>
               </w:r>
             </w:del>
-            <w:ins w:id="1035" w:author="Cập nhật QĐ 2119, bản 1.3.3 (Claude)" w:date="2026-09-28T11:35:13Z">
+            <w:ins w:id="1035" w:author="Cập nhật QĐ 2119, bản 1.3.4 (Claude)" w:date="2026-09-28T13:45:31Z">
               <w:r>
                 <w:rPr>
                   <w:rFonts w:asciiTheme="majorHAnsi" w:hAnsiTheme="majorHAnsi" w:cstheme="majorHAnsi"/>
@@ -4458,7 +4458,7 @@
                 <w:szCs w:val="28"/>
               </w:rPr>
             </w:pPr>
-            <w:del w:id="1036" w:author="Cập nhật QĐ 2119, bản 1.3.3 (Claude)" w:date="2026-09-28T11:35:13Z">
+            <w:del w:id="1036" w:author="Cập nhật QĐ 2119, bản 1.3.4 (Claude)" w:date="2026-09-28T13:45:31Z">
               <w:r>
                 <w:rPr>
                   <w:rFonts w:asciiTheme="majorHAnsi" w:hAnsiTheme="majorHAnsi" w:cstheme="majorHAnsi"/>
@@ -4468,7 +4468,7 @@
                 <w:delText xml:space="preserve">10 ngày, 37 phiên, 2.024 thao tác</w:delText>
               </w:r>
             </w:del>
-            <w:ins w:id="1037" w:author="Cập nhật QĐ 2119, bản 1.3.3 (Claude)" w:date="2026-09-28T11:35:13Z">
+            <w:ins w:id="1037" w:author="Cập nhật QĐ 2119, bản 1.3.4 (Claude)" w:date="2026-09-28T13:45:31Z">
               <w:r>
                 <w:rPr>
                   <w:rFonts w:asciiTheme="majorHAnsi" w:hAnsiTheme="majorHAnsi" w:cstheme="majorHAnsi"/>
@@ -4492,7 +4492,7 @@
       <w:tr>
         <w:trPr>
           <w:jc w:val="center"/>
-          <w:ins w:id="1038" w:author="Cập nhật QĐ 2119, bản 1.3.3 (Claude)" w:date="2026-09-28T11:35:13Z"/>
+          <w:ins w:id="1038" w:author="Cập nhật QĐ 2119, bản 1.3.4 (Claude)" w:date="2026-09-28T13:45:31Z"/>
         </w:trPr>
         <w:tc>
           <w:tcPr>
@@ -4504,13 +4504,13 @@
               <w:widowControl w:val="0"/>
               <w:jc w:val="center"/>
               <w:rPr>
-                <w:ins w:id="1040" w:author="Cập nhật QĐ 2119, bản 1.3.3 (Claude)" w:date="2026-09-28T11:35:13Z"/>
-                <w:rFonts w:asciiTheme="majorHAnsi" w:hAnsiTheme="majorHAnsi" w:cstheme="majorHAnsi"/>
-                <w:sz w:val="28"/>
-                <w:szCs w:val="28"/>
-              </w:rPr>
-            </w:pPr>
-            <w:ins w:id="1039" w:author="Cập nhật QĐ 2119, bản 1.3.3 (Claude)" w:date="2026-09-28T11:35:13Z">
+                <w:ins w:id="1040" w:author="Cập nhật QĐ 2119, bản 1.3.4 (Claude)" w:date="2026-09-28T13:45:31Z"/>
+                <w:rFonts w:asciiTheme="majorHAnsi" w:hAnsiTheme="majorHAnsi" w:cstheme="majorHAnsi"/>
+                <w:sz w:val="28"/>
+                <w:szCs w:val="28"/>
+              </w:rPr>
+            </w:pPr>
+            <w:ins w:id="1039" w:author="Cập nhật QĐ 2119, bản 1.3.4 (Claude)" w:date="2026-09-28T13:45:31Z">
               <w:r>
                 <w:rPr>
                   <w:rFonts w:asciiTheme="majorHAnsi" w:hAnsiTheme="majorHAnsi" w:cstheme="majorHAnsi"/>
@@ -4532,20 +4532,20 @@
               <w:widowControl w:val="0"/>
               <w:jc w:val="both"/>
               <w:rPr>
-                <w:ins w:id="1042" w:author="Cập nhật QĐ 2119, bản 1.3.3 (Claude)" w:date="2026-09-28T11:35:13Z"/>
-                <w:rFonts w:asciiTheme="majorHAnsi" w:hAnsiTheme="majorHAnsi" w:cstheme="majorHAnsi"/>
-                <w:sz w:val="28"/>
-                <w:szCs w:val="28"/>
-              </w:rPr>
-            </w:pPr>
-            <w:ins w:id="1041" w:author="Cập nhật QĐ 2119, bản 1.3.3 (Claude)" w:date="2026-09-28T11:35:13Z">
+                <w:ins w:id="1042" w:author="Cập nhật QĐ 2119, bản 1.3.4 (Claude)" w:date="2026-09-28T13:45:31Z"/>
+                <w:rFonts w:asciiTheme="majorHAnsi" w:hAnsiTheme="majorHAnsi" w:cstheme="majorHAnsi"/>
+                <w:sz w:val="28"/>
+                <w:szCs w:val="28"/>
+              </w:rPr>
+            </w:pPr>
+            <w:ins w:id="1041" w:author="Cập nhật QĐ 2119, bản 1.3.4 (Claude)" w:date="2026-09-28T13:45:31Z">
               <w:r>
                 <w:rPr>
                   <w:rFonts w:asciiTheme="majorHAnsi" w:hAnsiTheme="majorHAnsi" w:cstheme="majorHAnsi"/>
                   <w:sz w:val="28"/>
                   <w:szCs w:val="28"/>
                 </w:rPr>
-                <w:t xml:space="preserve">Nghiệm thu lại 4 ca về hệ số quy đổi, KPI (thang điểm dự thảo, thiếu dữ liệu, tự phê duyệt) trên bản 1.3.3 (claude plugin eval, 2 lượt mỗi ca); tiêu chí chấm cập nhật theo Quyết định số 2119/QĐ-CĐKT</w:t>
+                <w:t xml:space="preserve">Nghiệm thu lại 4 ca về hệ số quy đổi, KPI (thang điểm dự thảo, thiếu dữ liệu, tự phê duyệt) trên bản 1.3.3, 1.3.4 (claude plugin eval, 2 lượt mỗi ca); tiêu chí chấm cập nhật theo Quyết định số 2119/QĐ-CĐKT</w:t>
               </w:r>
             </w:ins>
           </w:p>
@@ -4560,20 +4560,20 @@
               <w:widowControl w:val="0"/>
               <w:jc w:val="both"/>
               <w:rPr>
-                <w:ins w:id="1044" w:author="Cập nhật QĐ 2119, bản 1.3.3 (Claude)" w:date="2026-09-28T11:35:13Z"/>
-                <w:rFonts w:asciiTheme="majorHAnsi" w:hAnsiTheme="majorHAnsi" w:cstheme="majorHAnsi"/>
-                <w:sz w:val="28"/>
-                <w:szCs w:val="28"/>
-              </w:rPr>
-            </w:pPr>
-            <w:ins w:id="1043" w:author="Cập nhật QĐ 2119, bản 1.3.3 (Claude)" w:date="2026-09-28T11:35:13Z">
+                <w:ins w:id="1044" w:author="Cập nhật QĐ 2119, bản 1.3.4 (Claude)" w:date="2026-09-28T13:45:31Z"/>
+                <w:rFonts w:asciiTheme="majorHAnsi" w:hAnsiTheme="majorHAnsi" w:cstheme="majorHAnsi"/>
+                <w:sz w:val="28"/>
+                <w:szCs w:val="28"/>
+              </w:rPr>
+            </w:pPr>
+            <w:ins w:id="1043" w:author="Cập nhật QĐ 2119, bản 1.3.4 (Claude)" w:date="2026-09-28T13:45:31Z">
               <w:r>
                 <w:rPr>
                   <w:rFonts w:asciiTheme="majorHAnsi" w:hAnsiTheme="majorHAnsi" w:cstheme="majorHAnsi"/>
                   <w:sz w:val="28"/>
                   <w:szCs w:val="28"/>
                 </w:rPr>
-                <w:t xml:space="preserve">Bản 1.3.3; ngày 28/9/2026</w:t>
+                <w:t xml:space="preserve">Bản 1.3.3 (ca 05, 07, 08, 09), bản 1.3.4 (ca 05, 07); ngày 28/9/2026</w:t>
               </w:r>
             </w:ins>
           </w:p>
@@ -4588,20 +4588,20 @@
               <w:widowControl w:val="0"/>
               <w:jc w:val="center"/>
               <w:rPr>
-                <w:ins w:id="1046" w:author="Cập nhật QĐ 2119, bản 1.3.3 (Claude)" w:date="2026-09-28T11:35:13Z"/>
-                <w:rFonts w:asciiTheme="majorHAnsi" w:hAnsiTheme="majorHAnsi" w:cstheme="majorHAnsi"/>
-                <w:sz w:val="28"/>
-                <w:szCs w:val="28"/>
-              </w:rPr>
-            </w:pPr>
-            <w:ins w:id="1045" w:author="Cập nhật QĐ 2119, bản 1.3.3 (Claude)" w:date="2026-09-28T11:35:13Z">
+                <w:ins w:id="1046" w:author="Cập nhật QĐ 2119, bản 1.3.4 (Claude)" w:date="2026-09-28T13:45:31Z"/>
+                <w:rFonts w:asciiTheme="majorHAnsi" w:hAnsiTheme="majorHAnsi" w:cstheme="majorHAnsi"/>
+                <w:sz w:val="28"/>
+                <w:szCs w:val="28"/>
+              </w:rPr>
+            </w:pPr>
+            <w:ins w:id="1045" w:author="Cập nhật QĐ 2119, bản 1.3.4 (Claude)" w:date="2026-09-28T13:45:31Z">
               <w:r>
                 <w:rPr>
                   <w:rFonts w:asciiTheme="majorHAnsi" w:hAnsiTheme="majorHAnsi" w:cstheme="majorHAnsi"/>
                   <w:sz w:val="28"/>
                   <w:szCs w:val="28"/>
                 </w:rPr>
-                <w:t xml:space="preserve">4/4 ca, 8/8 lượt đạt</w:t>
+                <w:t xml:space="preserve">4/4 ca, 8/8 lượt đạt (bản 1.3.3); 4/4 lượt đạt (bản 1.3.4)</w:t>
               </w:r>
             </w:ins>
           </w:p>
@@ -4701,7 +4701,7 @@
           <w:shd w:val="clear" w:color="auto" w:fill="FFFFFF"/>
         </w:rPr>
       </w:pPr>
-      <w:del w:id="1047" w:author="Cập nhật QĐ 2119, bản 1.3.3 (Claude)" w:date="2026-09-28T11:35:13Z">
+      <w:del w:id="1047" w:author="Cập nhật QĐ 2119, bản 1.3.4 (Claude)" w:date="2026-09-28T13:45:31Z">
         <w:r>
           <w:rPr>
             <w:rFonts w:asciiTheme="majorHAnsi" w:hAnsiTheme="majorHAnsi" w:cstheme="majorHAnsi"/>
@@ -4712,7 +4712,7 @@
           <w:delText xml:space="preserve">- Hai thang điểm quy đổi khối lượng công việc chưa có văn bản phân định; một số nội dung đánh giá KPI chờ ý kiến Phòng TCCB&amp;CTHSSV;</w:delText>
         </w:r>
       </w:del>
-      <w:ins w:id="1048" w:author="Cập nhật QĐ 2119, bản 1.3.3 (Claude)" w:date="2026-09-28T11:35:13Z">
+      <w:ins w:id="1048" w:author="Cập nhật QĐ 2119, bản 1.3.4 (Claude)" w:date="2026-09-28T13:45:31Z">
         <w:r>
           <w:rPr>
             <w:rFonts w:asciiTheme="majorHAnsi" w:hAnsiTheme="majorHAnsi" w:cstheme="majorHAnsi"/>
@@ -5063,7 +5063,7 @@
                 <w:szCs w:val="28"/>
               </w:rPr>
             </w:pPr>
-            <w:del w:id="1049" w:author="Cập nhật QĐ 2119, bản 1.3.3 (Claude)" w:date="2026-09-28T11:35:13Z">
+            <w:del w:id="1049" w:author="Cập nhật QĐ 2119, bản 1.3.4 (Claude)" w:date="2026-09-28T13:45:31Z">
               <w:r>
                 <w:rPr>
                   <w:rFonts w:asciiTheme="majorHAnsi" w:hAnsiTheme="majorHAnsi" w:cstheme="majorHAnsi"/>
@@ -5075,7 +5075,7 @@
                 <w:delText>Trạng thái ngày 27/9/2026</w:delText>
               </w:r>
             </w:del>
-            <w:ins w:id="1050" w:author="Cập nhật QĐ 2119, bản 1.3.3 (Claude)" w:date="2026-09-28T11:35:13Z">
+            <w:ins w:id="1050" w:author="Cập nhật QĐ 2119, bản 1.3.4 (Claude)" w:date="2026-09-28T13:45:31Z">
               <w:r>
                 <w:rPr>
                   <w:rFonts w:asciiTheme="majorHAnsi" w:hAnsiTheme="majorHAnsi" w:cstheme="majorHAnsi"/>
@@ -6043,7 +6043,7 @@
               </w:rPr>
               <w:t xml:space="preserve">nâng 1.2.1 lên 1.3.0, </w:t>
             </w:r>
-            <w:del w:id="1051" w:author="Cập nhật QĐ 2119, bản 1.3.3 (Claude)" w:date="2026-09-28T11:35:13Z">
+            <w:del w:id="1051" w:author="Cập nhật QĐ 2119, bản 1.3.4 (Claude)" w:date="2026-09-28T13:45:31Z">
               <w:r>
                 <w:rPr>
                   <w:rFonts w:asciiTheme="majorHAnsi" w:hAnsiTheme="majorHAnsi" w:cstheme="majorHAnsi"/>
@@ -6053,14 +6053,14 @@
                 <w:delText xml:space="preserve">ngày 27/9/2026 lên 1.3.1, 1.3.2,</w:delText>
               </w:r>
             </w:del>
-            <w:ins w:id="1052" w:author="Cập nhật QĐ 2119, bản 1.3.3 (Claude)" w:date="2026-09-28T11:35:13Z">
+            <w:ins w:id="1052" w:author="Cập nhật QĐ 2119, bản 1.3.4 (Claude)" w:date="2026-09-28T13:45:31Z">
               <w:r>
                 <w:rPr>
                   <w:rFonts w:asciiTheme="majorHAnsi" w:hAnsiTheme="majorHAnsi" w:cstheme="majorHAnsi"/>
                   <w:sz w:val="24"/>
                   <w:szCs w:val="24"/>
                 </w:rPr>
-                <w:t xml:space="preserve">ngày 27/9/2026 lên 1.3.1, 1.3.2, ngày 28/9/2026 lên 1.3.3,</w:t>
+                <w:t xml:space="preserve">ngày 27/9/2026 lên 1.3.1, 1.3.2, ngày 28/9/2026 lên 1.3.3, 1.3.4,</w:t>
               </w:r>
             </w:ins>
             <w:r>
@@ -6798,7 +6798,7 @@
                 <w:szCs w:val="28"/>
               </w:rPr>
             </w:pPr>
-            <w:del w:id="1053" w:author="Cập nhật QĐ 2119, bản 1.3.3 (Claude)" w:date="2026-09-28T11:35:13Z">
+            <w:del w:id="1053" w:author="Cập nhật QĐ 2119, bản 1.3.4 (Claude)" w:date="2026-09-28T13:45:31Z">
               <w:r>
                 <w:rPr>
                   <w:rFonts w:asciiTheme="majorHAnsi" w:hAnsiTheme="majorHAnsi" w:cstheme="majorHAnsi"/>
@@ -6808,7 +6808,7 @@
                 <w:delText xml:space="preserve">Có số liệu vận hành của Phòng TH-HC&amp;QT (18 - 27/9/2026)</w:delText>
               </w:r>
             </w:del>
-            <w:ins w:id="1054" w:author="Cập nhật QĐ 2119, bản 1.3.3 (Claude)" w:date="2026-09-28T11:35:13Z">
+            <w:ins w:id="1054" w:author="Cập nhật QĐ 2119, bản 1.3.4 (Claude)" w:date="2026-09-28T13:45:31Z">
               <w:r>
                 <w:rPr>
                   <w:rFonts w:asciiTheme="majorHAnsi" w:hAnsiTheme="majorHAnsi" w:cstheme="majorHAnsi"/>
@@ -6962,7 +6962,7 @@
       <w:tr>
         <w:trPr>
           <w:jc w:val="center"/>
-          <w:ins w:id="1055" w:author="Cập nhật QĐ 2119, bản 1.3.3 (Claude)" w:date="2026-09-28T11:35:13Z"/>
+          <w:ins w:id="1055" w:author="Cập nhật QĐ 2119, bản 1.3.4 (Claude)" w:date="2026-09-28T13:45:31Z"/>
         </w:trPr>
         <w:tc>
           <w:tcPr>
@@ -6974,13 +6974,13 @@
               <w:widowControl w:val="0"/>
               <w:jc w:val="center"/>
               <w:rPr>
-                <w:ins w:id="1057" w:author="Cập nhật QĐ 2119, bản 1.3.3 (Claude)" w:date="2026-09-28T11:35:13Z"/>
-                <w:rFonts w:asciiTheme="majorHAnsi" w:hAnsiTheme="majorHAnsi" w:cstheme="majorHAnsi"/>
-                <w:sz w:val="28"/>
-                <w:szCs w:val="28"/>
-              </w:rPr>
-            </w:pPr>
-            <w:ins w:id="1056" w:author="Cập nhật QĐ 2119, bản 1.3.3 (Claude)" w:date="2026-09-28T11:35:13Z">
+                <w:ins w:id="1057" w:author="Cập nhật QĐ 2119, bản 1.3.4 (Claude)" w:date="2026-09-28T13:45:31Z"/>
+                <w:rFonts w:asciiTheme="majorHAnsi" w:hAnsiTheme="majorHAnsi" w:cstheme="majorHAnsi"/>
+                <w:sz w:val="28"/>
+                <w:szCs w:val="28"/>
+              </w:rPr>
+            </w:pPr>
+            <w:ins w:id="1056" w:author="Cập nhật QĐ 2119, bản 1.3.4 (Claude)" w:date="2026-09-28T13:45:31Z">
               <w:r>
                 <w:rPr>
                   <w:rFonts w:asciiTheme="majorHAnsi" w:hAnsiTheme="majorHAnsi" w:cstheme="majorHAnsi"/>
@@ -7002,13 +7002,13 @@
               <w:widowControl w:val="0"/>
               <w:jc w:val="both"/>
               <w:rPr>
-                <w:ins w:id="1059" w:author="Cập nhật QĐ 2119, bản 1.3.3 (Claude)" w:date="2026-09-28T11:35:13Z"/>
-                <w:rFonts w:asciiTheme="majorHAnsi" w:hAnsiTheme="majorHAnsi" w:cstheme="majorHAnsi"/>
-                <w:sz w:val="28"/>
-                <w:szCs w:val="28"/>
-              </w:rPr>
-            </w:pPr>
-            <w:ins w:id="1058" w:author="Cập nhật QĐ 2119, bản 1.3.3 (Claude)" w:date="2026-09-28T11:35:13Z">
+                <w:ins w:id="1059" w:author="Cập nhật QĐ 2119, bản 1.3.4 (Claude)" w:date="2026-09-28T13:45:31Z"/>
+                <w:rFonts w:asciiTheme="majorHAnsi" w:hAnsiTheme="majorHAnsi" w:cstheme="majorHAnsi"/>
+                <w:sz w:val="28"/>
+                <w:szCs w:val="28"/>
+              </w:rPr>
+            </w:pPr>
+            <w:ins w:id="1058" w:author="Cập nhật QĐ 2119, bản 1.3.4 (Claude)" w:date="2026-09-28T13:45:31Z">
               <w:r>
                 <w:rPr>
                   <w:rFonts w:asciiTheme="majorHAnsi" w:hAnsiTheme="majorHAnsi" w:cstheme="majorHAnsi"/>
@@ -7030,20 +7030,20 @@
               <w:widowControl w:val="0"/>
               <w:jc w:val="both"/>
               <w:rPr>
-                <w:ins w:id="1061" w:author="Cập nhật QĐ 2119, bản 1.3.3 (Claude)" w:date="2026-09-28T11:35:13Z"/>
-                <w:rFonts w:asciiTheme="majorHAnsi" w:hAnsiTheme="majorHAnsi" w:cstheme="majorHAnsi"/>
-                <w:sz w:val="28"/>
-                <w:szCs w:val="28"/>
-              </w:rPr>
-            </w:pPr>
-            <w:ins w:id="1060" w:author="Cập nhật QĐ 2119, bản 1.3.3 (Claude)" w:date="2026-09-28T11:35:13Z">
+                <w:ins w:id="1061" w:author="Cập nhật QĐ 2119, bản 1.3.4 (Claude)" w:date="2026-09-28T13:45:31Z"/>
+                <w:rFonts w:asciiTheme="majorHAnsi" w:hAnsiTheme="majorHAnsi" w:cstheme="majorHAnsi"/>
+                <w:sz w:val="28"/>
+                <w:szCs w:val="28"/>
+              </w:rPr>
+            </w:pPr>
+            <w:ins w:id="1060" w:author="Cập nhật QĐ 2119, bản 1.3.4 (Claude)" w:date="2026-09-28T13:45:31Z">
               <w:r>
                 <w:rPr>
                   <w:rFonts w:asciiTheme="majorHAnsi" w:hAnsiTheme="majorHAnsi" w:cstheme="majorHAnsi"/>
                   <w:sz w:val="24"/>
                   <w:szCs w:val="24"/>
                 </w:rPr>
-                <w:t xml:space="preserve">Đã có văn bản: Quyết định số 2119/QĐ-CĐKT ngày 28/9/2026 ban hành Danh mục sản phẩm, công việc chính thức (416 sản phẩm, hệ số theo từng sản phẩm); bản 1.3.3 tra hệ số theo Danh mục; quy ước nhân với hệ số mức độ công việc chưa có văn bản, giữ cảnh báo</w:t>
+                <w:t xml:space="preserve">Đã có văn bản: Quyết định số 2119/QĐ-CĐKT ngày 28/9/2026 ban hành Danh mục sản phẩm, công việc chính thức (416 sản phẩm, hệ số theo từng sản phẩm); bản 1.3.3 tra hệ số theo Danh mục; cột Điểm chấm, Hệ số của kế hoạch, báo cáo giữ 4 mức theo Quyết định số 1923/QĐ-CĐKT Phụ lục I, II (bản 1.3.4); quy ước nhân với hệ số mức độ công việc chưa có văn bản, giữ cảnh báo</w:t>
               </w:r>
             </w:ins>
           </w:p>
@@ -7058,13 +7058,13 @@
               <w:widowControl w:val="0"/>
               <w:jc w:val="both"/>
               <w:rPr>
-                <w:ins w:id="1063" w:author="Cập nhật QĐ 2119, bản 1.3.3 (Claude)" w:date="2026-09-28T11:35:13Z"/>
-                <w:rFonts w:asciiTheme="majorHAnsi" w:hAnsiTheme="majorHAnsi" w:cstheme="majorHAnsi"/>
-                <w:sz w:val="28"/>
-                <w:szCs w:val="28"/>
-              </w:rPr>
-            </w:pPr>
-            <w:ins w:id="1062" w:author="Cập nhật QĐ 2119, bản 1.3.3 (Claude)" w:date="2026-09-28T11:35:13Z">
+                <w:ins w:id="1063" w:author="Cập nhật QĐ 2119, bản 1.3.4 (Claude)" w:date="2026-09-28T13:45:31Z"/>
+                <w:rFonts w:asciiTheme="majorHAnsi" w:hAnsiTheme="majorHAnsi" w:cstheme="majorHAnsi"/>
+                <w:sz w:val="28"/>
+                <w:szCs w:val="28"/>
+              </w:rPr>
+            </w:pPr>
+            <w:ins w:id="1062" w:author="Cập nhật QĐ 2119, bản 1.3.4 (Claude)" w:date="2026-09-28T13:45:31Z">
               <w:r>
                 <w:rPr>
                   <w:rFonts w:asciiTheme="majorHAnsi" w:hAnsiTheme="majorHAnsi" w:cstheme="majorHAnsi"/>
@@ -7080,7 +7080,7 @@
       <w:tr>
         <w:trPr>
           <w:jc w:val="center"/>
-          <w:ins w:id="1064" w:author="Cập nhật QĐ 2119, bản 1.3.3 (Claude)" w:date="2026-09-28T11:35:13Z"/>
+          <w:ins w:id="1064" w:author="Cập nhật QĐ 2119, bản 1.3.4 (Claude)" w:date="2026-09-28T13:45:31Z"/>
         </w:trPr>
         <w:tc>
           <w:tcPr>
@@ -7092,14 +7092,14 @@
               <w:widowControl w:val="0"/>
               <w:jc w:val="center"/>
               <w:rPr>
-                <w:ins w:id="1066" w:author="Cập nhật QĐ 2119, bản 1.3.3 (Claude)" w:date="2026-09-28T11:35:13Z"/>
-                <w:ins w:id="1057" w:author="Cập nhật QĐ 2119, bản 1.3.3 (Claude)" w:date="2026-09-28T11:35:13Z"/>
-                <w:rFonts w:asciiTheme="majorHAnsi" w:hAnsiTheme="majorHAnsi" w:cstheme="majorHAnsi"/>
-                <w:sz w:val="28"/>
-                <w:szCs w:val="28"/>
-              </w:rPr>
-            </w:pPr>
-            <w:ins w:id="1065" w:author="Cập nhật QĐ 2119, bản 1.3.3 (Claude)" w:date="2026-09-28T11:35:13Z">
+                <w:ins w:id="1066" w:author="Cập nhật QĐ 2119, bản 1.3.4 (Claude)" w:date="2026-09-28T13:45:31Z"/>
+                <w:ins w:id="1057" w:author="Cập nhật QĐ 2119, bản 1.3.4 (Claude)" w:date="2026-09-28T13:45:31Z"/>
+                <w:rFonts w:asciiTheme="majorHAnsi" w:hAnsiTheme="majorHAnsi" w:cstheme="majorHAnsi"/>
+                <w:sz w:val="28"/>
+                <w:szCs w:val="28"/>
+              </w:rPr>
+            </w:pPr>
+            <w:ins w:id="1065" w:author="Cập nhật QĐ 2119, bản 1.3.4 (Claude)" w:date="2026-09-28T13:45:31Z">
               <w:r>
                 <w:rPr>
                   <w:rFonts w:asciiTheme="majorHAnsi" w:hAnsiTheme="majorHAnsi" w:cstheme="majorHAnsi"/>
@@ -7121,14 +7121,14 @@
               <w:widowControl w:val="0"/>
               <w:jc w:val="both"/>
               <w:rPr>
-                <w:ins w:id="1068" w:author="Cập nhật QĐ 2119, bản 1.3.3 (Claude)" w:date="2026-09-28T11:35:13Z"/>
-                <w:ins w:id="1059" w:author="Cập nhật QĐ 2119, bản 1.3.3 (Claude)" w:date="2026-09-28T11:35:13Z"/>
-                <w:rFonts w:asciiTheme="majorHAnsi" w:hAnsiTheme="majorHAnsi" w:cstheme="majorHAnsi"/>
-                <w:sz w:val="28"/>
-                <w:szCs w:val="28"/>
-              </w:rPr>
-            </w:pPr>
-            <w:ins w:id="1067" w:author="Cập nhật QĐ 2119, bản 1.3.3 (Claude)" w:date="2026-09-28T11:35:13Z">
+                <w:ins w:id="1068" w:author="Cập nhật QĐ 2119, bản 1.3.4 (Claude)" w:date="2026-09-28T13:45:31Z"/>
+                <w:ins w:id="1059" w:author="Cập nhật QĐ 2119, bản 1.3.4 (Claude)" w:date="2026-09-28T13:45:31Z"/>
+                <w:rFonts w:asciiTheme="majorHAnsi" w:hAnsiTheme="majorHAnsi" w:cstheme="majorHAnsi"/>
+                <w:sz w:val="28"/>
+                <w:szCs w:val="28"/>
+              </w:rPr>
+            </w:pPr>
+            <w:ins w:id="1067" w:author="Cập nhật QĐ 2119, bản 1.3.4 (Claude)" w:date="2026-09-28T13:45:31Z">
               <w:r>
                 <w:rPr>
                   <w:rFonts w:asciiTheme="majorHAnsi" w:hAnsiTheme="majorHAnsi" w:cstheme="majorHAnsi"/>
@@ -7150,21 +7150,21 @@
               <w:widowControl w:val="0"/>
               <w:jc w:val="both"/>
               <w:rPr>
-                <w:ins w:id="1070" w:author="Cập nhật QĐ 2119, bản 1.3.3 (Claude)" w:date="2026-09-28T11:35:13Z"/>
-                <w:ins w:id="1061" w:author="Cập nhật QĐ 2119, bản 1.3.3 (Claude)" w:date="2026-09-28T11:35:13Z"/>
-                <w:rFonts w:asciiTheme="majorHAnsi" w:hAnsiTheme="majorHAnsi" w:cstheme="majorHAnsi"/>
-                <w:sz w:val="28"/>
-                <w:szCs w:val="28"/>
-              </w:rPr>
-            </w:pPr>
-            <w:ins w:id="1069" w:author="Cập nhật QĐ 2119, bản 1.3.3 (Claude)" w:date="2026-09-28T11:35:13Z">
+                <w:ins w:id="1070" w:author="Cập nhật QĐ 2119, bản 1.3.4 (Claude)" w:date="2026-09-28T13:45:31Z"/>
+                <w:ins w:id="1061" w:author="Cập nhật QĐ 2119, bản 1.3.4 (Claude)" w:date="2026-09-28T13:45:31Z"/>
+                <w:rFonts w:asciiTheme="majorHAnsi" w:hAnsiTheme="majorHAnsi" w:cstheme="majorHAnsi"/>
+                <w:sz w:val="28"/>
+                <w:szCs w:val="28"/>
+              </w:rPr>
+            </w:pPr>
+            <w:ins w:id="1069" w:author="Cập nhật QĐ 2119, bản 1.3.4 (Claude)" w:date="2026-09-28T13:45:31Z">
               <w:r>
                 <w:rPr>
                   <w:rFonts w:asciiTheme="majorHAnsi" w:hAnsiTheme="majorHAnsi" w:cstheme="majorHAnsi"/>
                   <w:sz w:val="24"/>
                   <w:szCs w:val="24"/>
                 </w:rPr>
-                <w:t xml:space="preserve">Đã khắc phục trong bản 1.3.3; chạy lại 2.241 lệnh thật: bỏ 22 lần chặn nhầm, không phát sinh lần chặn mới</w:t>
+                <w:t xml:space="preserve">Đã khắc phục trong bản 1.3.3, 1.3.4; chạy lại 2.289 lệnh thật: bỏ 25 lần chặn nhầm, không phát sinh lần chặn mới</w:t>
               </w:r>
             </w:ins>
           </w:p>
@@ -7179,14 +7179,14 @@
               <w:widowControl w:val="0"/>
               <w:jc w:val="both"/>
               <w:rPr>
-                <w:ins w:id="1072" w:author="Cập nhật QĐ 2119, bản 1.3.3 (Claude)" w:date="2026-09-28T11:35:13Z"/>
-                <w:ins w:id="1063" w:author="Cập nhật QĐ 2119, bản 1.3.3 (Claude)" w:date="2026-09-28T11:35:13Z"/>
-                <w:rFonts w:asciiTheme="majorHAnsi" w:hAnsiTheme="majorHAnsi" w:cstheme="majorHAnsi"/>
-                <w:sz w:val="28"/>
-                <w:szCs w:val="28"/>
-              </w:rPr>
-            </w:pPr>
-            <w:ins w:id="1071" w:author="Cập nhật QĐ 2119, bản 1.3.3 (Claude)" w:date="2026-09-28T11:35:13Z">
+                <w:ins w:id="1072" w:author="Cập nhật QĐ 2119, bản 1.3.4 (Claude)" w:date="2026-09-28T13:45:31Z"/>
+                <w:ins w:id="1063" w:author="Cập nhật QĐ 2119, bản 1.3.4 (Claude)" w:date="2026-09-28T13:45:31Z"/>
+                <w:rFonts w:asciiTheme="majorHAnsi" w:hAnsiTheme="majorHAnsi" w:cstheme="majorHAnsi"/>
+                <w:sz w:val="28"/>
+                <w:szCs w:val="28"/>
+              </w:rPr>
+            </w:pPr>
+            <w:ins w:id="1071" w:author="Cập nhật QĐ 2119, bản 1.3.4 (Claude)" w:date="2026-09-28T13:45:31Z">
               <w:r>
                 <w:rPr>
                   <w:rFonts w:asciiTheme="majorHAnsi" w:hAnsiTheme="majorHAnsi" w:cstheme="majorHAnsi"/>
@@ -7316,7 +7316,7 @@
         </w:rPr>
         <w:t xml:space="preserve">- Tài liệu đầu vào: Thông báo số 736/TB-CĐKT, Thông báo số 817/TB-CĐKT, </w:t>
       </w:r>
-      <w:del w:id="1073" w:author="Cập nhật QĐ 2119, bản 1.3.3 (Claude)" w:date="2026-09-28T11:35:13Z">
+      <w:del w:id="1073" w:author="Cập nhật QĐ 2119, bản 1.3.4 (Claude)" w:date="2026-09-28T13:45:31Z">
         <w:r>
           <w:rPr>
             <w:rFonts w:asciiTheme="majorHAnsi" w:hAnsiTheme="majorHAnsi" w:cstheme="majorHAnsi"/>
@@ -7327,7 +7327,7 @@
           <w:delText xml:space="preserve">Quyết định số 1923/QĐ-CĐKT, Thông báo số 1052/TB-CĐKT, mẫu Phụ lục</w:delText>
         </w:r>
       </w:del>
-      <w:ins w:id="1074" w:author="Cập nhật QĐ 2119, bản 1.3.3 (Claude)" w:date="2026-09-28T11:35:13Z">
+      <w:ins w:id="1074" w:author="Cập nhật QĐ 2119, bản 1.3.4 (Claude)" w:date="2026-09-28T13:45:31Z">
         <w:r>
           <w:rPr>
             <w:rFonts w:asciiTheme="majorHAnsi" w:hAnsiTheme="majorHAnsi" w:cstheme="majorHAnsi"/>
@@ -7470,14 +7470,14 @@
         <w:ind w:firstLine="720"/>
         <w:jc w:val="both"/>
         <w:rPr>
-          <w:ins w:id="1076" w:author="Cập nhật QĐ 2119, bản 1.3.3 (Claude)" w:date="2026-09-28T11:35:13Z"/>
+          <w:ins w:id="1076" w:author="Cập nhật QĐ 2119, bản 1.3.4 (Claude)" w:date="2026-09-28T13:45:31Z"/>
           <w:rFonts w:asciiTheme="majorHAnsi" w:hAnsiTheme="majorHAnsi" w:cstheme="majorHAnsi"/>
           <w:sz w:val="28"/>
           <w:szCs w:val="28"/>
           <w:shd w:val="clear" w:color="auto" w:fill="FFFFFF"/>
         </w:rPr>
       </w:pPr>
-      <w:ins w:id="1075" w:author="Cập nhật QĐ 2119, bản 1.3.3 (Claude)" w:date="2026-09-28T11:35:13Z">
+      <w:ins w:id="1075" w:author="Cập nhật QĐ 2119, bản 1.3.4 (Claude)" w:date="2026-09-28T13:45:31Z">
         <w:r>
           <w:rPr>
             <w:rFonts w:asciiTheme="majorHAnsi" w:hAnsiTheme="majorHAnsi" w:cstheme="majorHAnsi"/>
@@ -7485,7 +7485,7 @@
             <w:szCs w:val="28"/>
             <w:shd w:val="clear" w:color="auto" w:fill="FFFFFF"/>
           </w:rPr>
-          <w:t xml:space="preserve">- Cập nhật ngày 28/9/2026 theo Quyết định số 2119/QĐ-CĐKT ngày 28/9/2026: tệp plugin bản 1.3.3, mã SHA-256, hồ sơ bằng chứng kiểm thử, kết quả nghiệm thu lại 4 ca, phiếu nghiệm thu trên Claude, Cowork bản 1.3.3; Báo cáo quá trình xây dựng bản 6, Tài liệu hướng dẫn bản 7, Báo cáo tiếp thu, giải trình lần 4 bản 2 (Track Changes và bản sạch).</w:t>
+          <w:t xml:space="preserve">- Cập nhật ngày 28/9/2026 theo Quyết định số 2119/QĐ-CĐKT ngày 28/9/2026: tệp plugin bản 1.3.4, mã SHA-256, hồ sơ bằng chứng kiểm thử, kết quả nghiệm thu lại các ca liên quan, phiếu nghiệm thu trên Claude, Cowork bản 1.3.4; Báo cáo quá trình xây dựng bản 6, Tài liệu hướng dẫn bản 7, Báo cáo tiếp thu, giải trình lần 4 bản 2 (Track Changes và bản sạch).</w:t>
         </w:r>
       </w:ins>
     </w:p>
@@ -7525,7 +7525,7 @@
         </w:rPr>
         <w:t xml:space="preserve">(i) thẩm định độc lập bổ sung </w:t>
       </w:r>
-      <w:del w:id="1077" w:author="Cập nhật QĐ 2119, bản 1.3.3 (Claude)" w:date="2026-09-28T11:35:13Z">
+      <w:del w:id="1077" w:author="Cập nhật QĐ 2119, bản 1.3.4 (Claude)" w:date="2026-09-28T13:45:31Z">
         <w:r>
           <w:rPr>
             <w:rFonts w:asciiTheme="majorHAnsi" w:hAnsiTheme="majorHAnsi" w:cstheme="majorHAnsi"/>
@@ -7538,7 +7538,7 @@
           <w:delText xml:space="preserve">(vòng 5) trên tệp plugin bản 1.3.2 để xác nhận</w:delText>
         </w:r>
       </w:del>
-      <w:ins w:id="1078" w:author="Cập nhật QĐ 2119, bản 1.3.3 (Claude)" w:date="2026-09-28T11:35:13Z">
+      <w:ins w:id="1078" w:author="Cập nhật QĐ 2119, bản 1.3.4 (Claude)" w:date="2026-09-28T13:45:31Z">
         <w:r>
           <w:rPr>
             <w:rFonts w:asciiTheme="majorHAnsi" w:hAnsiTheme="majorHAnsi" w:cstheme="majorHAnsi"/>
@@ -7548,7 +7548,7 @@
             <w:szCs w:val="28"/>
             <w:shd w:val="clear" w:color="auto" w:fill="FFFFFF"/>
           </w:rPr>
-          <w:t xml:space="preserve">(vòng 5) trên tệp plugin bản 1.3.3 để xác nhận</w:t>
+          <w:t xml:space="preserve">(vòng 5) trên tệp plugin bản 1.3.4 để xác nhận</w:t>
         </w:r>
       </w:ins>
       <w:r>
@@ -7573,7 +7573,7 @@
         </w:rPr>
         <w:t xml:space="preserve">; (ii) kiểm thử nghiệm thu trên Claude (trò chuyện) và Claude Cowork; (iii) kiểm kê, thu hồi phiên bản cũ ở cấp tổ chức; phân quyền chỉ đọc kho KTC-Database có biên bản; (iv) rà soát bằng Skill “ktc-ra-soat-897” phần sửa đổi lần 3 của dự thảo Thông báo, Tài liệu hướng dẫn (2 vòng đối với Thông báo bản 5, Tài liệu hướng dẫn bản 4 đã thực hiện; Thông báo số 917/TB-CĐKT, 924/TB-CĐKT, 948/TB-CĐKT </w:t>
       </w:r>
-      <w:del w:id="1079" w:author="Cập nhật QĐ 2119, bản 1.3.3 (Claude)" w:date="2026-09-28T11:35:13Z">
+      <w:del w:id="1079" w:author="Cập nhật QĐ 2119, bản 1.3.4 (Claude)" w:date="2026-09-28T13:45:31Z">
         <w:r>
           <w:rPr>
             <w:rFonts w:asciiTheme="majorHAnsi" w:hAnsiTheme="majorHAnsi" w:cstheme="majorHAnsi"/>
@@ -7586,7 +7586,7 @@
           <w:delText xml:space="preserve">đã đối chiếu bản gốc ngày 27/9/2026)</w:delText>
         </w:r>
       </w:del>
-      <w:ins w:id="1080" w:author="Cập nhật QĐ 2119, bản 1.3.3 (Claude)" w:date="2026-09-28T11:35:13Z">
+      <w:ins w:id="1080" w:author="Cập nhật QĐ 2119, bản 1.3.4 (Claude)" w:date="2026-09-28T13:45:31Z">
         <w:r>
           <w:rPr>
             <w:rFonts w:asciiTheme="majorHAnsi" w:hAnsiTheme="majorHAnsi" w:cstheme="majorHAnsi"/>

</xml_diff>

<commit_message>
docs: hồ sơ vòng 5 chuyển sang plugin 1.3.5 (kết nối thư mục đơn vị); HD v7 thêm mục kết nối thư mục; sửa tiêu chí ca 01 (không lấy mã đơn vị đoán làm đáp án); DL-20260928-003
Co-Authored-By: Claude Opus 5.5 <noreply@anthropic.com>
</commit_message>
<xml_diff>
--- a/30-Ket-Qua/2026-09-27/Ho-So-Tham-Dinh-Vong-5/4-Van-ban/BC_Qua-trinh-xay-dung-bo-cong-cu-KTC-Quan-tri_20260928_v6_TrackChanges.docx
+++ b/30-Ket-Qua/2026-09-27/Ho-So-Tham-Dinh-Vong-5/4-Van-ban/BC_Qua-trinh-xay-dung-bo-cong-cu-KTC-Quan-tri_20260928_v6_TrackChanges.docx
@@ -1849,7 +1849,7 @@
                 <w:szCs w:val="28"/>
               </w:rPr>
             </w:pPr>
-            <w:del w:id="1001" w:author="Cập nhật QĐ 2119, bản 1.3.4 (Claude)" w:date="2026-09-28T13:45:30Z">
+            <w:del w:id="1001" w:author="Cập nhật 28/9, bản 1.3.5 (Claude)" w:date="2026-09-28T14:38:48Z">
               <w:r>
                 <w:rPr>
                   <w:rFonts w:asciiTheme="majorHAnsi" w:hAnsiTheme="majorHAnsi" w:cstheme="majorHAnsi"/>
@@ -1859,7 +1859,7 @@
                 <w:delText xml:space="preserve">Bản 1.3.2 (hiện hành), mã SHA-256</w:delText>
               </w:r>
             </w:del>
-            <w:ins w:id="1002" w:author="Cập nhật QĐ 2119, bản 1.3.4 (Claude)" w:date="2026-09-28T13:45:30Z">
+            <w:ins w:id="1002" w:author="Cập nhật 28/9, bản 1.3.5 (Claude)" w:date="2026-09-28T14:38:48Z">
               <w:r>
                 <w:rPr>
                   <w:rFonts w:asciiTheme="majorHAnsi" w:hAnsiTheme="majorHAnsi" w:cstheme="majorHAnsi"/>
@@ -1908,7 +1908,7 @@
       <w:tr>
         <w:trPr>
           <w:jc w:val="center"/>
-          <w:ins w:id="1003" w:author="Cập nhật QĐ 2119, bản 1.3.4 (Claude)" w:date="2026-09-28T13:45:30Z"/>
+          <w:ins w:id="1003" w:author="Cập nhật 28/9, bản 1.3.5 (Claude)" w:date="2026-09-28T14:38:48Z"/>
         </w:trPr>
         <w:tc>
           <w:tcPr>
@@ -1920,13 +1920,13 @@
               <w:widowControl w:val="0"/>
               <w:jc w:val="center"/>
               <w:rPr>
-                <w:ins w:id="1005" w:author="Cập nhật QĐ 2119, bản 1.3.4 (Claude)" w:date="2026-09-28T13:45:30Z"/>
-                <w:rFonts w:asciiTheme="majorHAnsi" w:hAnsiTheme="majorHAnsi" w:cstheme="majorHAnsi"/>
-                <w:sz w:val="28"/>
-                <w:szCs w:val="28"/>
-              </w:rPr>
-            </w:pPr>
-            <w:ins w:id="1004" w:author="Cập nhật QĐ 2119, bản 1.3.4 (Claude)" w:date="2026-09-28T13:45:30Z">
+                <w:ins w:id="1005" w:author="Cập nhật 28/9, bản 1.3.5 (Claude)" w:date="2026-09-28T14:38:48Z"/>
+                <w:rFonts w:asciiTheme="majorHAnsi" w:hAnsiTheme="majorHAnsi" w:cstheme="majorHAnsi"/>
+                <w:sz w:val="28"/>
+                <w:szCs w:val="28"/>
+              </w:rPr>
+            </w:pPr>
+            <w:ins w:id="1004" w:author="Cập nhật 28/9, bản 1.3.5 (Claude)" w:date="2026-09-28T14:38:48Z">
               <w:r>
                 <w:rPr>
                   <w:rFonts w:asciiTheme="majorHAnsi" w:hAnsiTheme="majorHAnsi" w:cstheme="majorHAnsi"/>
@@ -1948,20 +1948,20 @@
               <w:widowControl w:val="0"/>
               <w:jc w:val="both"/>
               <w:rPr>
-                <w:ins w:id="1007" w:author="Cập nhật QĐ 2119, bản 1.3.4 (Claude)" w:date="2026-09-28T13:45:30Z"/>
-                <w:rFonts w:asciiTheme="majorHAnsi" w:hAnsiTheme="majorHAnsi" w:cstheme="majorHAnsi"/>
-                <w:sz w:val="28"/>
-                <w:szCs w:val="28"/>
-              </w:rPr>
-            </w:pPr>
-            <w:ins w:id="1006" w:author="Cập nhật QĐ 2119, bản 1.3.4 (Claude)" w:date="2026-09-28T13:45:30Z">
+                <w:ins w:id="1007" w:author="Cập nhật 28/9, bản 1.3.5 (Claude)" w:date="2026-09-28T14:38:48Z"/>
+                <w:rFonts w:asciiTheme="majorHAnsi" w:hAnsiTheme="majorHAnsi" w:cstheme="majorHAnsi"/>
+                <w:sz w:val="28"/>
+                <w:szCs w:val="28"/>
+              </w:rPr>
+            </w:pPr>
+            <w:ins w:id="1006" w:author="Cập nhật 28/9, bản 1.3.5 (Claude)" w:date="2026-09-28T14:38:48Z">
               <w:r>
                 <w:rPr>
                   <w:rFonts w:asciiTheme="majorHAnsi" w:hAnsiTheme="majorHAnsi" w:cstheme="majorHAnsi"/>
                   <w:sz w:val="28"/>
                   <w:szCs w:val="28"/>
                 </w:rPr>
-                <w:t xml:space="preserve">Cập nhật theo Quyết định số 2119/QĐ-CĐKT ngày 28/9/2026 ban hành Danh mục sản phẩm, công việc (thay thế danh mục dự thảo kèm Thông báo số 1052/TB-CĐKT): hệ số quy đổi tra theo từng sản phẩm của Danh mục chính thức; chuẩn phân loại 6 Trục ghi căn cứ Quyết định số 1923/QĐ-CĐKT (Phụ lục I, II) cho cột Điểm chấm, Hệ số quy đổi; sửa thao tác chặn ghi chặn nhầm lệnh chỉ đọc kho</w:t>
+                <w:t xml:space="preserve">Cập nhật theo Quyết định số 2119/QĐ-CĐKT ngày 28/9/2026 ban hành Danh mục sản phẩm, công việc (thay thế danh mục dự thảo kèm Thông báo số 1052/TB-CĐKT): hệ số quy đổi tra theo từng sản phẩm của Danh mục chính thức; chuẩn phân loại 6 Trục ghi căn cứ Quyết định số 1923/QĐ-CĐKT (Phụ lục I, II) cho cột Điểm chấm, Hệ số quy đổi; sửa thao tác chặn ghi chặn nhầm lệnh chỉ đọc kho; kết nối thư mục đầu vào, đầu ra cho tài khoản thành viên trên Cowork</w:t>
               </w:r>
             </w:ins>
           </w:p>
@@ -1976,20 +1976,20 @@
               <w:widowControl w:val="0"/>
               <w:jc w:val="both"/>
               <w:rPr>
-                <w:ins w:id="1009" w:author="Cập nhật QĐ 2119, bản 1.3.4 (Claude)" w:date="2026-09-28T13:45:30Z"/>
-                <w:rFonts w:asciiTheme="majorHAnsi" w:hAnsiTheme="majorHAnsi" w:cstheme="majorHAnsi"/>
-                <w:sz w:val="28"/>
-                <w:szCs w:val="28"/>
-              </w:rPr>
-            </w:pPr>
-            <w:ins w:id="1008" w:author="Cập nhật QĐ 2119, bản 1.3.4 (Claude)" w:date="2026-09-28T13:45:30Z">
+                <w:ins w:id="1009" w:author="Cập nhật 28/9, bản 1.3.5 (Claude)" w:date="2026-09-28T14:38:48Z"/>
+                <w:rFonts w:asciiTheme="majorHAnsi" w:hAnsiTheme="majorHAnsi" w:cstheme="majorHAnsi"/>
+                <w:sz w:val="28"/>
+                <w:szCs w:val="28"/>
+              </w:rPr>
+            </w:pPr>
+            <w:ins w:id="1008" w:author="Cập nhật 28/9, bản 1.3.5 (Claude)" w:date="2026-09-28T14:38:48Z">
               <w:r>
                 <w:rPr>
                   <w:rFonts w:asciiTheme="majorHAnsi" w:hAnsiTheme="majorHAnsi" w:cstheme="majorHAnsi"/>
                   <w:sz w:val="28"/>
                   <w:szCs w:val="28"/>
                 </w:rPr>
-                <w:t xml:space="preserve">Bản 1.3.3, 1.3.4 (hiện hành), mã SHA-256 45c6199e...fa5e, mã nguồn commit a989cd9; hồ sơ bằng chứng kiểm thử</w:t>
+                <w:t xml:space="preserve">Bản 1.3.3 - 1.3.5 (hiện hành), mã SHA-256 228926d5...d929, mã nguồn commit b0c1824; hồ sơ bằng chứng kiểm thử</w:t>
               </w:r>
             </w:ins>
           </w:p>
@@ -2004,13 +2004,13 @@
               <w:widowControl w:val="0"/>
               <w:jc w:val="center"/>
               <w:rPr>
-                <w:ins w:id="1011" w:author="Cập nhật QĐ 2119, bản 1.3.4 (Claude)" w:date="2026-09-28T13:45:30Z"/>
-                <w:rFonts w:asciiTheme="majorHAnsi" w:hAnsiTheme="majorHAnsi" w:cstheme="majorHAnsi"/>
-                <w:sz w:val="28"/>
-                <w:szCs w:val="28"/>
-              </w:rPr>
-            </w:pPr>
-            <w:ins w:id="1010" w:author="Cập nhật QĐ 2119, bản 1.3.4 (Claude)" w:date="2026-09-28T13:45:30Z">
+                <w:ins w:id="1011" w:author="Cập nhật 28/9, bản 1.3.5 (Claude)" w:date="2026-09-28T14:38:48Z"/>
+                <w:rFonts w:asciiTheme="majorHAnsi" w:hAnsiTheme="majorHAnsi" w:cstheme="majorHAnsi"/>
+                <w:sz w:val="28"/>
+                <w:szCs w:val="28"/>
+              </w:rPr>
+            </w:pPr>
+            <w:ins w:id="1010" w:author="Cập nhật 28/9, bản 1.3.5 (Claude)" w:date="2026-09-28T14:38:48Z">
               <w:r>
                 <w:rPr>
                   <w:rFonts w:asciiTheme="majorHAnsi" w:hAnsiTheme="majorHAnsi" w:cstheme="majorHAnsi"/>
@@ -2043,7 +2043,7 @@
         </w:rPr>
         <w:t xml:space="preserve">Toàn bộ quá trình được lưu vết: </w:t>
       </w:r>
-      <w:del w:id="1012" w:author="Cập nhật QĐ 2119, bản 1.3.4 (Claude)" w:date="2026-09-28T13:45:30Z">
+      <w:del w:id="1012" w:author="Cập nhật 28/9, bản 1.3.5 (Claude)" w:date="2026-09-28T14:38:48Z">
         <w:r>
           <w:rPr>
             <w:rFonts w:asciiTheme="majorHAnsi" w:hAnsiTheme="majorHAnsi" w:cstheme="majorHAnsi"/>
@@ -2053,14 +2053,14 @@
           <w:delText xml:space="preserve">87 lần cập nhật trên kho mã nguồn (từ 18/9/2026), nhật ký thay đổi 28 phiên bản, 26</w:delText>
         </w:r>
       </w:del>
-      <w:ins w:id="1013" w:author="Cập nhật QĐ 2119, bản 1.3.4 (Claude)" w:date="2026-09-28T13:45:30Z">
+      <w:ins w:id="1013" w:author="Cập nhật 28/9, bản 1.3.5 (Claude)" w:date="2026-09-28T14:38:48Z">
         <w:r>
           <w:rPr>
             <w:rFonts w:asciiTheme="majorHAnsi" w:hAnsiTheme="majorHAnsi" w:cstheme="majorHAnsi"/>
             <w:sz w:val="28"/>
             <w:szCs w:val="28"/>
           </w:rPr>
-          <w:t xml:space="preserve">98 lần cập nhật trên kho mã nguồn (từ 18/9/2026), nhật ký thay đổi 30 phiên bản, 28</w:t>
+          <w:t xml:space="preserve">101 lần cập nhật trên kho mã nguồn (từ 18/9/2026), nhật ký thay đổi 31 phiên bản, 28</w:t>
         </w:r>
       </w:ins>
       <w:r>
@@ -2323,7 +2323,7 @@
               </w:rPr>
               <w:t xml:space="preserve">Kiểm kê kho KTC-Database (8 kho), mẫu Phụ lục TB 736, TB 817, </w:t>
             </w:r>
-            <w:del w:id="1014" w:author="Cập nhật QĐ 2119, bản 1.3.4 (Claude)" w:date="2026-09-28T13:45:30Z">
+            <w:del w:id="1014" w:author="Cập nhật 28/9, bản 1.3.5 (Claude)" w:date="2026-09-28T14:38:48Z">
               <w:r>
                 <w:rPr>
                   <w:rFonts w:asciiTheme="majorHAnsi" w:hAnsiTheme="majorHAnsi" w:cstheme="majorHAnsi"/>
@@ -2333,7 +2333,7 @@
                 <w:delText xml:space="preserve">Quyết định số 1923/QĐ-CĐKT, TB 1052, 6 mẫu Kế hoạch + KPI</w:delText>
               </w:r>
             </w:del>
-            <w:ins w:id="1015" w:author="Cập nhật QĐ 2119, bản 1.3.4 (Claude)" w:date="2026-09-28T13:45:30Z">
+            <w:ins w:id="1015" w:author="Cập nhật 28/9, bản 1.3.5 (Claude)" w:date="2026-09-28T14:38:48Z">
               <w:r>
                 <w:rPr>
                   <w:rFonts w:asciiTheme="majorHAnsi" w:hAnsiTheme="majorHAnsi" w:cstheme="majorHAnsi"/>
@@ -2650,7 +2650,7 @@
                 <w:szCs w:val="28"/>
               </w:rPr>
             </w:pPr>
-            <w:del w:id="1016" w:author="Cập nhật QĐ 2119, bản 1.3.4 (Claude)" w:date="2026-09-28T13:45:30Z">
+            <w:del w:id="1016" w:author="Cập nhật 28/9, bản 1.3.5 (Claude)" w:date="2026-09-28T14:38:48Z">
               <w:r>
                 <w:rPr>
                   <w:rFonts w:asciiTheme="majorHAnsi" w:hAnsiTheme="majorHAnsi" w:cstheme="majorHAnsi"/>
@@ -2660,7 +2660,7 @@
                 <w:delText xml:space="preserve">Dừng, không tự đặt quy tắc đối với: hai thang điểm quy đổi khối lượng công việc chưa có văn bản phân định; </w:delText>
               </w:r>
             </w:del>
-            <w:ins w:id="1017" w:author="Cập nhật QĐ 2119, bản 1.3.4 (Claude)" w:date="2026-09-28T13:45:30Z">
+            <w:ins w:id="1017" w:author="Cập nhật 28/9, bản 1.3.5 (Claude)" w:date="2026-09-28T14:38:48Z">
               <w:r>
                 <w:rPr>
                   <w:rFonts w:asciiTheme="majorHAnsi" w:hAnsiTheme="majorHAnsi" w:cstheme="majorHAnsi"/>
@@ -3141,7 +3141,7 @@
           <w:szCs w:val="28"/>
         </w:rPr>
       </w:pPr>
-      <w:del w:id="1018" w:author="Cập nhật QĐ 2119, bản 1.3.4 (Claude)" w:date="2026-09-28T13:45:30Z">
+      <w:del w:id="1018" w:author="Cập nhật 28/9, bản 1.3.5 (Claude)" w:date="2026-09-28T14:38:48Z">
         <w:r>
           <w:rPr>
             <w:rFonts w:asciiTheme="majorHAnsi" w:hAnsiTheme="majorHAnsi" w:cstheme="majorHAnsi"/>
@@ -3153,7 +3153,7 @@
           <w:delText xml:space="preserve">4. Kết quả kiểm thử (chạy lại ngày 27/9/2026, bản 1.3.2)</w:delText>
         </w:r>
       </w:del>
-      <w:ins w:id="1019" w:author="Cập nhật QĐ 2119, bản 1.3.4 (Claude)" w:date="2026-09-28T13:45:30Z">
+      <w:ins w:id="1019" w:author="Cập nhật 28/9, bản 1.3.5 (Claude)" w:date="2026-09-28T14:38:48Z">
         <w:r>
           <w:rPr>
             <w:rFonts w:asciiTheme="majorHAnsi" w:hAnsiTheme="majorHAnsi" w:cstheme="majorHAnsi"/>
@@ -3162,7 +3162,7 @@
             <w:sz w:val="28"/>
             <w:szCs w:val="28"/>
           </w:rPr>
-          <w:t xml:space="preserve">4. Kết quả kiểm thử (chạy lại ngày 28/9/2026, bản 1.3.4)</w:t>
+          <w:t xml:space="preserve">4. Kết quả kiểm thử (chạy lại ngày 28/9/2026, bản 1.3.5)</w:t>
         </w:r>
       </w:ins>
     </w:p>
@@ -3456,15 +3456,35 @@
                 <w:szCs w:val="28"/>
               </w:rPr>
             </w:pPr>
-            <w:r>
-              <w:rPr>
-                <w:rFonts w:asciiTheme="majorHAnsi" w:hAnsiTheme="majorHAnsi" w:cstheme="majorHAnsi"/>
-                <w:sz w:val="28"/>
-                <w:szCs w:val="28"/>
-              </w:rPr>
-              <w:t xml:space="preserve">21 bộ ca thử hồi quy (tính KPI, xếp loại, biểu mẫu, viện dẫn, thể thức, minh chứng, Track Changes, nhật ký, </w:t>
-            </w:r>
-            <w:del w:id="1020" w:author="Cập nhật QĐ 2119, bản 1.3.4 (Claude)" w:date="2026-09-28T13:45:30Z">
+            <w:del w:id="1024" w:author="Cập nhật 28/9, bản 1.3.5 (Claude)" w:date="2026-09-28T14:38:48Z">
+              <w:r>
+                <w:rPr>
+                  <w:rFonts w:asciiTheme="majorHAnsi" w:hAnsiTheme="majorHAnsi" w:cstheme="majorHAnsi"/>
+                  <w:sz w:val="28"/>
+                  <w:szCs w:val="28"/>
+                </w:rPr>
+                <w:delText xml:space="preserve">21 bộ ca thử hồi quy (</w:delText>
+              </w:r>
+            </w:del>
+            <w:ins w:id="1025" w:author="Cập nhật 28/9, bản 1.3.5 (Claude)" w:date="2026-09-28T14:38:48Z">
+              <w:r>
+                <w:rPr>
+                  <w:rFonts w:asciiTheme="majorHAnsi" w:hAnsiTheme="majorHAnsi" w:cstheme="majorHAnsi"/>
+                  <w:sz w:val="28"/>
+                  <w:szCs w:val="28"/>
+                </w:rPr>
+                <w:t xml:space="preserve">22 bộ ca thử hồi quy (kết nối thư mục đơn vị, </w:t>
+              </w:r>
+            </w:ins>
+            <w:r>
+              <w:rPr>
+                <w:rFonts w:asciiTheme="majorHAnsi" w:hAnsiTheme="majorHAnsi" w:cstheme="majorHAnsi"/>
+                <w:sz w:val="28"/>
+                <w:szCs w:val="28"/>
+              </w:rPr>
+              <w:t xml:space="preserve">tính KPI, xếp loại, biểu mẫu, viện dẫn, thể thức, minh chứng, Track Changes, nhật ký, </w:t>
+            </w:r>
+            <w:del w:id="1020" w:author="Cập nhật 28/9, bản 1.3.5 (Claude)" w:date="2026-09-28T14:38:48Z">
               <w:r>
                 <w:rPr>
                   <w:rFonts w:asciiTheme="majorHAnsi" w:hAnsiTheme="majorHAnsi" w:cstheme="majorHAnsi"/>
@@ -3474,7 +3494,7 @@
                 <w:delText xml:space="preserve">thao tác chặn ghi và bản dựng 1.3.0, 1.3.1)</w:delText>
               </w:r>
             </w:del>
-            <w:ins w:id="1021" w:author="Cập nhật QĐ 2119, bản 1.3.4 (Claude)" w:date="2026-09-28T13:45:30Z">
+            <w:ins w:id="1021" w:author="Cập nhật 28/9, bản 1.3.5 (Claude)" w:date="2026-09-28T14:38:48Z">
               <w:r>
                 <w:rPr>
                   <w:rFonts w:asciiTheme="majorHAnsi" w:hAnsiTheme="majorHAnsi" w:cstheme="majorHAnsi"/>
@@ -3526,7 +3546,7 @@
                 <w:szCs w:val="28"/>
               </w:rPr>
             </w:pPr>
-            <w:del w:id="1022" w:author="Cập nhật QĐ 2119, bản 1.3.4 (Claude)" w:date="2026-09-28T13:45:30Z">
+            <w:del w:id="1022" w:author="Cập nhật 28/9, bản 1.3.5 (Claude)" w:date="2026-09-28T14:38:48Z">
               <w:r>
                 <w:rPr>
                   <w:rFonts w:asciiTheme="majorHAnsi" w:hAnsiTheme="majorHAnsi" w:cstheme="majorHAnsi"/>
@@ -3536,14 +3556,14 @@
                 <w:delText>20/20 đạt</w:delText>
               </w:r>
             </w:del>
-            <w:ins w:id="1023" w:author="Cập nhật QĐ 2119, bản 1.3.4 (Claude)" w:date="2026-09-28T13:45:30Z">
+            <w:ins w:id="1023" w:author="Cập nhật 28/9, bản 1.3.5 (Claude)" w:date="2026-09-28T14:38:48Z">
               <w:r>
                 <w:rPr>
                   <w:rFonts w:asciiTheme="majorHAnsi" w:hAnsiTheme="majorHAnsi" w:cstheme="majorHAnsi"/>
                   <w:sz w:val="28"/>
                   <w:szCs w:val="28"/>
                 </w:rPr>
-                <w:t xml:space="preserve">21/21 đạt</w:t>
+                <w:t xml:space="preserve">22/22 đạt</w:t>
               </w:r>
             </w:ins>
           </w:p>
@@ -4038,7 +4058,7 @@
                 <w:szCs w:val="28"/>
               </w:rPr>
             </w:pPr>
-            <w:del w:id="1024" w:author="Cập nhật QĐ 2119, bản 1.3.4 (Claude)" w:date="2026-09-28T13:45:30Z">
+            <w:del w:id="1026" w:author="Cập nhật 28/9, bản 1.3.5 (Claude)" w:date="2026-09-28T14:38:48Z">
               <w:r>
                 <w:rPr>
                   <w:rFonts w:asciiTheme="majorHAnsi" w:hAnsiTheme="majorHAnsi" w:cstheme="majorHAnsi"/>
@@ -4048,7 +4068,7 @@
                 <w:delText xml:space="preserve">Bản 1.3.2; ngày 27/9/2026</w:delText>
               </w:r>
             </w:del>
-            <w:ins w:id="1025" w:author="Cập nhật QĐ 2119, bản 1.3.4 (Claude)" w:date="2026-09-28T13:45:30Z">
+            <w:ins w:id="1027" w:author="Cập nhật 28/9, bản 1.3.5 (Claude)" w:date="2026-09-28T14:38:48Z">
               <w:r>
                 <w:rPr>
                   <w:rFonts w:asciiTheme="majorHAnsi" w:hAnsiTheme="majorHAnsi" w:cstheme="majorHAnsi"/>
@@ -4075,7 +4095,7 @@
                 <w:szCs w:val="28"/>
               </w:rPr>
             </w:pPr>
-            <w:del w:id="1026" w:author="Cập nhật QĐ 2119, bản 1.3.4 (Claude)" w:date="2026-09-28T13:45:30Z">
+            <w:del w:id="1028" w:author="Cập nhật 28/9, bản 1.3.5 (Claude)" w:date="2026-09-28T14:38:48Z">
               <w:r>
                 <w:rPr>
                   <w:rFonts w:asciiTheme="majorHAnsi" w:hAnsiTheme="majorHAnsi" w:cstheme="majorHAnsi"/>
@@ -4085,7 +4105,7 @@
                 <w:delText>15/15 ca, 30/30 lượt đạt</w:delText>
               </w:r>
             </w:del>
-            <w:ins w:id="1027" w:author="Cập nhật QĐ 2119, bản 1.3.4 (Claude)" w:date="2026-09-28T13:45:30Z">
+            <w:ins w:id="1029" w:author="Cập nhật 28/9, bản 1.3.5 (Claude)" w:date="2026-09-28T14:38:48Z">
               <w:r>
                 <w:rPr>
                   <w:rFonts w:asciiTheme="majorHAnsi" w:hAnsiTheme="majorHAnsi" w:cstheme="majorHAnsi"/>
@@ -4142,7 +4162,7 @@
                 <w:szCs w:val="28"/>
               </w:rPr>
             </w:pPr>
-            <w:del w:id="1028" w:author="Cập nhật QĐ 2119, bản 1.3.4 (Claude)" w:date="2026-09-28T13:45:30Z">
+            <w:del w:id="1030" w:author="Cập nhật 28/9, bản 1.3.5 (Claude)" w:date="2026-09-28T14:38:48Z">
               <w:r>
                 <w:rPr>
                   <w:rFonts w:asciiTheme="majorHAnsi" w:hAnsiTheme="majorHAnsi" w:cstheme="majorHAnsi"/>
@@ -4152,7 +4172,7 @@
                 <w:delText xml:space="preserve">Thao tác chặn ghi: chạy lại 1.653 câu lệnh thật trong nhật ký vận hành</w:delText>
               </w:r>
             </w:del>
-            <w:ins w:id="1029" w:author="Cập nhật QĐ 2119, bản 1.3.4 (Claude)" w:date="2026-09-28T13:45:30Z">
+            <w:ins w:id="1031" w:author="Cập nhật 28/9, bản 1.3.5 (Claude)" w:date="2026-09-28T14:38:48Z">
               <w:r>
                 <w:rPr>
                   <w:rFonts w:asciiTheme="majorHAnsi" w:hAnsiTheme="majorHAnsi" w:cstheme="majorHAnsi"/>
@@ -4179,7 +4199,7 @@
                 <w:szCs w:val="28"/>
               </w:rPr>
             </w:pPr>
-            <w:del w:id="1030" w:author="Cập nhật QĐ 2119, bản 1.3.4 (Claude)" w:date="2026-09-28T13:45:30Z">
+            <w:del w:id="1032" w:author="Cập nhật 28/9, bản 1.3.5 (Claude)" w:date="2026-09-28T14:38:48Z">
               <w:r>
                 <w:rPr>
                   <w:rFonts w:asciiTheme="majorHAnsi" w:hAnsiTheme="majorHAnsi" w:cstheme="majorHAnsi"/>
@@ -4189,14 +4209,14 @@
                 <w:delText xml:space="preserve">Bản 1.3.2; gồm các lệnh vượt chặn do thẩm định lần 3, lần 4 phát hiện (ca thử riêng)</w:delText>
               </w:r>
             </w:del>
-            <w:ins w:id="1031" w:author="Cập nhật QĐ 2119, bản 1.3.4 (Claude)" w:date="2026-09-28T13:45:30Z">
+            <w:ins w:id="1033" w:author="Cập nhật 28/9, bản 1.3.5 (Claude)" w:date="2026-09-28T14:38:48Z">
               <w:r>
                 <w:rPr>
                   <w:rFonts w:asciiTheme="majorHAnsi" w:hAnsiTheme="majorHAnsi" w:cstheme="majorHAnsi"/>
                   <w:sz w:val="28"/>
                   <w:szCs w:val="28"/>
                 </w:rPr>
-                <w:t xml:space="preserve">Bản 1.3.4 so với 1.3.2; gồm các lệnh vượt chặn do thẩm định lần 3, lần 4 phát hiện, các lệnh bị chặn nhầm ngày 28/9/2026 (ca thử riêng)</w:t>
+                <w:t xml:space="preserve">Bản 1.3.5 so với 1.3.2; gồm các lệnh vượt chặn do thẩm định lần 3, lần 4 phát hiện, các lệnh bị chặn nhầm ngày 28/9/2026 (ca thử riêng)</w:t>
               </w:r>
             </w:ins>
           </w:p>
@@ -4216,7 +4236,7 @@
                 <w:szCs w:val="28"/>
               </w:rPr>
             </w:pPr>
-            <w:del w:id="1032" w:author="Cập nhật QĐ 2119, bản 1.3.4 (Claude)" w:date="2026-09-28T13:45:30Z">
+            <w:del w:id="1034" w:author="Cập nhật 28/9, bản 1.3.5 (Claude)" w:date="2026-09-28T14:38:48Z">
               <w:r>
                 <w:rPr>
                   <w:rFonts w:asciiTheme="majorHAnsi" w:hAnsiTheme="majorHAnsi" w:cstheme="majorHAnsi"/>
@@ -4226,7 +4246,7 @@
                 <w:delText xml:space="preserve">0 chặn nhầm</w:delText>
               </w:r>
             </w:del>
-            <w:ins w:id="1033" w:author="Cập nhật QĐ 2119, bản 1.3.4 (Claude)" w:date="2026-09-28T13:45:30Z">
+            <w:ins w:id="1035" w:author="Cập nhật 28/9, bản 1.3.5 (Claude)" w:date="2026-09-28T14:38:48Z">
               <w:r>
                 <w:rPr>
                   <w:rFonts w:asciiTheme="majorHAnsi" w:hAnsiTheme="majorHAnsi" w:cstheme="majorHAnsi"/>
@@ -4396,7 +4416,7 @@
               </w:rPr>
               <w:t xml:space="preserve">Vận hành thực tế: người phụ trách dùng Bộ công cụ trong công việc của Phòng TH-HC&amp;QT </w:t>
             </w:r>
-            <w:del w:id="1034" w:author="Cập nhật QĐ 2119, bản 1.3.4 (Claude)" w:date="2026-09-28T13:45:31Z">
+            <w:del w:id="1036" w:author="Cập nhật 28/9, bản 1.3.5 (Claude)" w:date="2026-09-28T14:38:48Z">
               <w:r>
                 <w:rPr>
                   <w:rFonts w:asciiTheme="majorHAnsi" w:hAnsiTheme="majorHAnsi" w:cstheme="majorHAnsi"/>
@@ -4406,7 +4426,7 @@
                 <w:delText xml:space="preserve">trên Claude Code (18 - 27/9/2026)</w:delText>
               </w:r>
             </w:del>
-            <w:ins w:id="1035" w:author="Cập nhật QĐ 2119, bản 1.3.4 (Claude)" w:date="2026-09-28T13:45:31Z">
+            <w:ins w:id="1037" w:author="Cập nhật 28/9, bản 1.3.5 (Claude)" w:date="2026-09-28T14:38:48Z">
               <w:r>
                 <w:rPr>
                   <w:rFonts w:asciiTheme="majorHAnsi" w:hAnsiTheme="majorHAnsi" w:cstheme="majorHAnsi"/>
@@ -4458,7 +4478,7 @@
                 <w:szCs w:val="28"/>
               </w:rPr>
             </w:pPr>
-            <w:del w:id="1036" w:author="Cập nhật QĐ 2119, bản 1.3.4 (Claude)" w:date="2026-09-28T13:45:31Z">
+            <w:del w:id="1038" w:author="Cập nhật 28/9, bản 1.3.5 (Claude)" w:date="2026-09-28T14:38:48Z">
               <w:r>
                 <w:rPr>
                   <w:rFonts w:asciiTheme="majorHAnsi" w:hAnsiTheme="majorHAnsi" w:cstheme="majorHAnsi"/>
@@ -4468,7 +4488,7 @@
                 <w:delText xml:space="preserve">10 ngày, 37 phiên, 2.024 thao tác</w:delText>
               </w:r>
             </w:del>
-            <w:ins w:id="1037" w:author="Cập nhật QĐ 2119, bản 1.3.4 (Claude)" w:date="2026-09-28T13:45:31Z">
+            <w:ins w:id="1039" w:author="Cập nhật 28/9, bản 1.3.5 (Claude)" w:date="2026-09-28T14:38:48Z">
               <w:r>
                 <w:rPr>
                   <w:rFonts w:asciiTheme="majorHAnsi" w:hAnsiTheme="majorHAnsi" w:cstheme="majorHAnsi"/>
@@ -4492,7 +4512,7 @@
       <w:tr>
         <w:trPr>
           <w:jc w:val="center"/>
-          <w:ins w:id="1038" w:author="Cập nhật QĐ 2119, bản 1.3.4 (Claude)" w:date="2026-09-28T13:45:31Z"/>
+          <w:ins w:id="1040" w:author="Cập nhật 28/9, bản 1.3.5 (Claude)" w:date="2026-09-28T14:38:48Z"/>
         </w:trPr>
         <w:tc>
           <w:tcPr>
@@ -4504,13 +4524,13 @@
               <w:widowControl w:val="0"/>
               <w:jc w:val="center"/>
               <w:rPr>
-                <w:ins w:id="1040" w:author="Cập nhật QĐ 2119, bản 1.3.4 (Claude)" w:date="2026-09-28T13:45:31Z"/>
-                <w:rFonts w:asciiTheme="majorHAnsi" w:hAnsiTheme="majorHAnsi" w:cstheme="majorHAnsi"/>
-                <w:sz w:val="28"/>
-                <w:szCs w:val="28"/>
-              </w:rPr>
-            </w:pPr>
-            <w:ins w:id="1039" w:author="Cập nhật QĐ 2119, bản 1.3.4 (Claude)" w:date="2026-09-28T13:45:31Z">
+                <w:ins w:id="1042" w:author="Cập nhật 28/9, bản 1.3.5 (Claude)" w:date="2026-09-28T14:38:48Z"/>
+                <w:rFonts w:asciiTheme="majorHAnsi" w:hAnsiTheme="majorHAnsi" w:cstheme="majorHAnsi"/>
+                <w:sz w:val="28"/>
+                <w:szCs w:val="28"/>
+              </w:rPr>
+            </w:pPr>
+            <w:ins w:id="1041" w:author="Cập nhật 28/9, bản 1.3.5 (Claude)" w:date="2026-09-28T14:38:48Z">
               <w:r>
                 <w:rPr>
                   <w:rFonts w:asciiTheme="majorHAnsi" w:hAnsiTheme="majorHAnsi" w:cstheme="majorHAnsi"/>
@@ -4532,20 +4552,20 @@
               <w:widowControl w:val="0"/>
               <w:jc w:val="both"/>
               <w:rPr>
-                <w:ins w:id="1042" w:author="Cập nhật QĐ 2119, bản 1.3.4 (Claude)" w:date="2026-09-28T13:45:31Z"/>
-                <w:rFonts w:asciiTheme="majorHAnsi" w:hAnsiTheme="majorHAnsi" w:cstheme="majorHAnsi"/>
-                <w:sz w:val="28"/>
-                <w:szCs w:val="28"/>
-              </w:rPr>
-            </w:pPr>
-            <w:ins w:id="1041" w:author="Cập nhật QĐ 2119, bản 1.3.4 (Claude)" w:date="2026-09-28T13:45:31Z">
+                <w:ins w:id="1044" w:author="Cập nhật 28/9, bản 1.3.5 (Claude)" w:date="2026-09-28T14:38:48Z"/>
+                <w:rFonts w:asciiTheme="majorHAnsi" w:hAnsiTheme="majorHAnsi" w:cstheme="majorHAnsi"/>
+                <w:sz w:val="28"/>
+                <w:szCs w:val="28"/>
+              </w:rPr>
+            </w:pPr>
+            <w:ins w:id="1043" w:author="Cập nhật 28/9, bản 1.3.5 (Claude)" w:date="2026-09-28T14:38:48Z">
               <w:r>
                 <w:rPr>
                   <w:rFonts w:asciiTheme="majorHAnsi" w:hAnsiTheme="majorHAnsi" w:cstheme="majorHAnsi"/>
                   <w:sz w:val="28"/>
                   <w:szCs w:val="28"/>
                 </w:rPr>
-                <w:t xml:space="preserve">Nghiệm thu lại 4 ca về hệ số quy đổi, KPI (thang điểm dự thảo, thiếu dữ liệu, tự phê duyệt) trên bản 1.3.3, 1.3.4 (claude plugin eval, 2 lượt mỗi ca); tiêu chí chấm cập nhật theo Quyết định số 2119/QĐ-CĐKT</w:t>
+                <w:t xml:space="preserve">Nghiệm thu lại các ca về hệ số quy đổi, KPI (thang điểm dự thảo, thiếu dữ liệu, tự phê duyệt), kích hoạt kỹ năng, ghi kho chuẩn trên bản 1.3.3 - 1.3.5 (claude plugin eval, 2 lượt mỗi ca); tiêu chí chấm cập nhật theo Quyết định số 2119/QĐ-CĐKT</w:t>
               </w:r>
             </w:ins>
           </w:p>
@@ -4560,20 +4580,20 @@
               <w:widowControl w:val="0"/>
               <w:jc w:val="both"/>
               <w:rPr>
-                <w:ins w:id="1044" w:author="Cập nhật QĐ 2119, bản 1.3.4 (Claude)" w:date="2026-09-28T13:45:31Z"/>
-                <w:rFonts w:asciiTheme="majorHAnsi" w:hAnsiTheme="majorHAnsi" w:cstheme="majorHAnsi"/>
-                <w:sz w:val="28"/>
-                <w:szCs w:val="28"/>
-              </w:rPr>
-            </w:pPr>
-            <w:ins w:id="1043" w:author="Cập nhật QĐ 2119, bản 1.3.4 (Claude)" w:date="2026-09-28T13:45:31Z">
+                <w:ins w:id="1046" w:author="Cập nhật 28/9, bản 1.3.5 (Claude)" w:date="2026-09-28T14:38:48Z"/>
+                <w:rFonts w:asciiTheme="majorHAnsi" w:hAnsiTheme="majorHAnsi" w:cstheme="majorHAnsi"/>
+                <w:sz w:val="28"/>
+                <w:szCs w:val="28"/>
+              </w:rPr>
+            </w:pPr>
+            <w:ins w:id="1045" w:author="Cập nhật 28/9, bản 1.3.5 (Claude)" w:date="2026-09-28T14:38:48Z">
               <w:r>
                 <w:rPr>
                   <w:rFonts w:asciiTheme="majorHAnsi" w:hAnsiTheme="majorHAnsi" w:cstheme="majorHAnsi"/>
                   <w:sz w:val="28"/>
                   <w:szCs w:val="28"/>
                 </w:rPr>
-                <w:t xml:space="preserve">Bản 1.3.3 (ca 05, 07, 08, 09), bản 1.3.4 (ca 05, 07); ngày 28/9/2026</w:t>
+                <w:t xml:space="preserve">Bản 1.3.3 (ca 05, 07, 08, 09), 1.3.4 (ca 05, 07), 1.3.5 (ca 01, 04, 05, 06); ngày 28/9/2026</w:t>
               </w:r>
             </w:ins>
           </w:p>
@@ -4588,20 +4608,20 @@
               <w:widowControl w:val="0"/>
               <w:jc w:val="center"/>
               <w:rPr>
-                <w:ins w:id="1046" w:author="Cập nhật QĐ 2119, bản 1.3.4 (Claude)" w:date="2026-09-28T13:45:31Z"/>
-                <w:rFonts w:asciiTheme="majorHAnsi" w:hAnsiTheme="majorHAnsi" w:cstheme="majorHAnsi"/>
-                <w:sz w:val="28"/>
-                <w:szCs w:val="28"/>
-              </w:rPr>
-            </w:pPr>
-            <w:ins w:id="1045" w:author="Cập nhật QĐ 2119, bản 1.3.4 (Claude)" w:date="2026-09-28T13:45:31Z">
+                <w:ins w:id="1048" w:author="Cập nhật 28/9, bản 1.3.5 (Claude)" w:date="2026-09-28T14:38:48Z"/>
+                <w:rFonts w:asciiTheme="majorHAnsi" w:hAnsiTheme="majorHAnsi" w:cstheme="majorHAnsi"/>
+                <w:sz w:val="28"/>
+                <w:szCs w:val="28"/>
+              </w:rPr>
+            </w:pPr>
+            <w:ins w:id="1047" w:author="Cập nhật 28/9, bản 1.3.5 (Claude)" w:date="2026-09-28T14:38:48Z">
               <w:r>
                 <w:rPr>
                   <w:rFonts w:asciiTheme="majorHAnsi" w:hAnsiTheme="majorHAnsi" w:cstheme="majorHAnsi"/>
                   <w:sz w:val="28"/>
                   <w:szCs w:val="28"/>
                 </w:rPr>
-                <w:t xml:space="preserve">4/4 ca, 8/8 lượt đạt (bản 1.3.3); 4/4 lượt đạt (bản 1.3.4)</w:t>
+                <w:t xml:space="preserve">4/4 ca, 8/8 lượt đạt (bản 1.3.3); 4/4 lượt đạt (bản 1.3.4); 6/8 lượt đạt (bản 1.3.5; 2 lượt ca 01 bị chấm trượt do tiêu chí lấy mã đơn vị đoán làm đáp án, đã sửa tiêu chí, chạy lại ca 01: 2/2 lượt đạt)</w:t>
               </w:r>
             </w:ins>
           </w:p>
@@ -4701,7 +4721,7 @@
           <w:shd w:val="clear" w:color="auto" w:fill="FFFFFF"/>
         </w:rPr>
       </w:pPr>
-      <w:del w:id="1047" w:author="Cập nhật QĐ 2119, bản 1.3.4 (Claude)" w:date="2026-09-28T13:45:31Z">
+      <w:del w:id="1049" w:author="Cập nhật 28/9, bản 1.3.5 (Claude)" w:date="2026-09-28T14:38:48Z">
         <w:r>
           <w:rPr>
             <w:rFonts w:asciiTheme="majorHAnsi" w:hAnsiTheme="majorHAnsi" w:cstheme="majorHAnsi"/>
@@ -4712,7 +4732,7 @@
           <w:delText xml:space="preserve">- Hai thang điểm quy đổi khối lượng công việc chưa có văn bản phân định; một số nội dung đánh giá KPI chờ ý kiến Phòng TCCB&amp;CTHSSV;</w:delText>
         </w:r>
       </w:del>
-      <w:ins w:id="1048" w:author="Cập nhật QĐ 2119, bản 1.3.4 (Claude)" w:date="2026-09-28T13:45:31Z">
+      <w:ins w:id="1050" w:author="Cập nhật 28/9, bản 1.3.5 (Claude)" w:date="2026-09-28T14:38:48Z">
         <w:r>
           <w:rPr>
             <w:rFonts w:asciiTheme="majorHAnsi" w:hAnsiTheme="majorHAnsi" w:cstheme="majorHAnsi"/>
@@ -5063,7 +5083,7 @@
                 <w:szCs w:val="28"/>
               </w:rPr>
             </w:pPr>
-            <w:del w:id="1049" w:author="Cập nhật QĐ 2119, bản 1.3.4 (Claude)" w:date="2026-09-28T13:45:31Z">
+            <w:del w:id="1051" w:author="Cập nhật 28/9, bản 1.3.5 (Claude)" w:date="2026-09-28T14:38:48Z">
               <w:r>
                 <w:rPr>
                   <w:rFonts w:asciiTheme="majorHAnsi" w:hAnsiTheme="majorHAnsi" w:cstheme="majorHAnsi"/>
@@ -5075,7 +5095,7 @@
                 <w:delText>Trạng thái ngày 27/9/2026</w:delText>
               </w:r>
             </w:del>
-            <w:ins w:id="1050" w:author="Cập nhật QĐ 2119, bản 1.3.4 (Claude)" w:date="2026-09-28T13:45:31Z">
+            <w:ins w:id="1052" w:author="Cập nhật 28/9, bản 1.3.5 (Claude)" w:date="2026-09-28T14:38:48Z">
               <w:r>
                 <w:rPr>
                   <w:rFonts w:asciiTheme="majorHAnsi" w:hAnsiTheme="majorHAnsi" w:cstheme="majorHAnsi"/>
@@ -6043,7 +6063,7 @@
               </w:rPr>
               <w:t xml:space="preserve">nâng 1.2.1 lên 1.3.0, </w:t>
             </w:r>
-            <w:del w:id="1051" w:author="Cập nhật QĐ 2119, bản 1.3.4 (Claude)" w:date="2026-09-28T13:45:31Z">
+            <w:del w:id="1053" w:author="Cập nhật 28/9, bản 1.3.5 (Claude)" w:date="2026-09-28T14:38:48Z">
               <w:r>
                 <w:rPr>
                   <w:rFonts w:asciiTheme="majorHAnsi" w:hAnsiTheme="majorHAnsi" w:cstheme="majorHAnsi"/>
@@ -6053,14 +6073,14 @@
                 <w:delText xml:space="preserve">ngày 27/9/2026 lên 1.3.1, 1.3.2,</w:delText>
               </w:r>
             </w:del>
-            <w:ins w:id="1052" w:author="Cập nhật QĐ 2119, bản 1.3.4 (Claude)" w:date="2026-09-28T13:45:31Z">
+            <w:ins w:id="1054" w:author="Cập nhật 28/9, bản 1.3.5 (Claude)" w:date="2026-09-28T14:38:48Z">
               <w:r>
                 <w:rPr>
                   <w:rFonts w:asciiTheme="majorHAnsi" w:hAnsiTheme="majorHAnsi" w:cstheme="majorHAnsi"/>
                   <w:sz w:val="24"/>
                   <w:szCs w:val="24"/>
                 </w:rPr>
-                <w:t xml:space="preserve">ngày 27/9/2026 lên 1.3.1, 1.3.2, ngày 28/9/2026 lên 1.3.3, 1.3.4,</w:t>
+                <w:t xml:space="preserve">ngày 27/9/2026 lên 1.3.1, 1.3.2, ngày 28/9/2026 lên 1.3.3 - 1.3.5,</w:t>
               </w:r>
             </w:ins>
             <w:r>
@@ -6798,7 +6818,7 @@
                 <w:szCs w:val="28"/>
               </w:rPr>
             </w:pPr>
-            <w:del w:id="1053" w:author="Cập nhật QĐ 2119, bản 1.3.4 (Claude)" w:date="2026-09-28T13:45:31Z">
+            <w:del w:id="1055" w:author="Cập nhật 28/9, bản 1.3.5 (Claude)" w:date="2026-09-28T14:38:48Z">
               <w:r>
                 <w:rPr>
                   <w:rFonts w:asciiTheme="majorHAnsi" w:hAnsiTheme="majorHAnsi" w:cstheme="majorHAnsi"/>
@@ -6808,7 +6828,7 @@
                 <w:delText xml:space="preserve">Có số liệu vận hành của Phòng TH-HC&amp;QT (18 - 27/9/2026)</w:delText>
               </w:r>
             </w:del>
-            <w:ins w:id="1054" w:author="Cập nhật QĐ 2119, bản 1.3.4 (Claude)" w:date="2026-09-28T13:45:31Z">
+            <w:ins w:id="1056" w:author="Cập nhật 28/9, bản 1.3.5 (Claude)" w:date="2026-09-28T14:38:48Z">
               <w:r>
                 <w:rPr>
                   <w:rFonts w:asciiTheme="majorHAnsi" w:hAnsiTheme="majorHAnsi" w:cstheme="majorHAnsi"/>
@@ -6962,7 +6982,7 @@
       <w:tr>
         <w:trPr>
           <w:jc w:val="center"/>
-          <w:ins w:id="1055" w:author="Cập nhật QĐ 2119, bản 1.3.4 (Claude)" w:date="2026-09-28T13:45:31Z"/>
+          <w:ins w:id="1057" w:author="Cập nhật 28/9, bản 1.3.5 (Claude)" w:date="2026-09-28T14:38:48Z"/>
         </w:trPr>
         <w:tc>
           <w:tcPr>
@@ -6974,13 +6994,13 @@
               <w:widowControl w:val="0"/>
               <w:jc w:val="center"/>
               <w:rPr>
-                <w:ins w:id="1057" w:author="Cập nhật QĐ 2119, bản 1.3.4 (Claude)" w:date="2026-09-28T13:45:31Z"/>
-                <w:rFonts w:asciiTheme="majorHAnsi" w:hAnsiTheme="majorHAnsi" w:cstheme="majorHAnsi"/>
-                <w:sz w:val="28"/>
-                <w:szCs w:val="28"/>
-              </w:rPr>
-            </w:pPr>
-            <w:ins w:id="1056" w:author="Cập nhật QĐ 2119, bản 1.3.4 (Claude)" w:date="2026-09-28T13:45:31Z">
+                <w:ins w:id="1059" w:author="Cập nhật 28/9, bản 1.3.5 (Claude)" w:date="2026-09-28T14:38:48Z"/>
+                <w:rFonts w:asciiTheme="majorHAnsi" w:hAnsiTheme="majorHAnsi" w:cstheme="majorHAnsi"/>
+                <w:sz w:val="28"/>
+                <w:szCs w:val="28"/>
+              </w:rPr>
+            </w:pPr>
+            <w:ins w:id="1058" w:author="Cập nhật 28/9, bản 1.3.5 (Claude)" w:date="2026-09-28T14:38:48Z">
               <w:r>
                 <w:rPr>
                   <w:rFonts w:asciiTheme="majorHAnsi" w:hAnsiTheme="majorHAnsi" w:cstheme="majorHAnsi"/>
@@ -7002,13 +7022,13 @@
               <w:widowControl w:val="0"/>
               <w:jc w:val="both"/>
               <w:rPr>
-                <w:ins w:id="1059" w:author="Cập nhật QĐ 2119, bản 1.3.4 (Claude)" w:date="2026-09-28T13:45:31Z"/>
-                <w:rFonts w:asciiTheme="majorHAnsi" w:hAnsiTheme="majorHAnsi" w:cstheme="majorHAnsi"/>
-                <w:sz w:val="28"/>
-                <w:szCs w:val="28"/>
-              </w:rPr>
-            </w:pPr>
-            <w:ins w:id="1058" w:author="Cập nhật QĐ 2119, bản 1.3.4 (Claude)" w:date="2026-09-28T13:45:31Z">
+                <w:ins w:id="1061" w:author="Cập nhật 28/9, bản 1.3.5 (Claude)" w:date="2026-09-28T14:38:48Z"/>
+                <w:rFonts w:asciiTheme="majorHAnsi" w:hAnsiTheme="majorHAnsi" w:cstheme="majorHAnsi"/>
+                <w:sz w:val="28"/>
+                <w:szCs w:val="28"/>
+              </w:rPr>
+            </w:pPr>
+            <w:ins w:id="1060" w:author="Cập nhật 28/9, bản 1.3.5 (Claude)" w:date="2026-09-28T14:38:48Z">
               <w:r>
                 <w:rPr>
                   <w:rFonts w:asciiTheme="majorHAnsi" w:hAnsiTheme="majorHAnsi" w:cstheme="majorHAnsi"/>
@@ -7030,13 +7050,13 @@
               <w:widowControl w:val="0"/>
               <w:jc w:val="both"/>
               <w:rPr>
-                <w:ins w:id="1061" w:author="Cập nhật QĐ 2119, bản 1.3.4 (Claude)" w:date="2026-09-28T13:45:31Z"/>
-                <w:rFonts w:asciiTheme="majorHAnsi" w:hAnsiTheme="majorHAnsi" w:cstheme="majorHAnsi"/>
-                <w:sz w:val="28"/>
-                <w:szCs w:val="28"/>
-              </w:rPr>
-            </w:pPr>
-            <w:ins w:id="1060" w:author="Cập nhật QĐ 2119, bản 1.3.4 (Claude)" w:date="2026-09-28T13:45:31Z">
+                <w:ins w:id="1063" w:author="Cập nhật 28/9, bản 1.3.5 (Claude)" w:date="2026-09-28T14:38:48Z"/>
+                <w:rFonts w:asciiTheme="majorHAnsi" w:hAnsiTheme="majorHAnsi" w:cstheme="majorHAnsi"/>
+                <w:sz w:val="28"/>
+                <w:szCs w:val="28"/>
+              </w:rPr>
+            </w:pPr>
+            <w:ins w:id="1062" w:author="Cập nhật 28/9, bản 1.3.5 (Claude)" w:date="2026-09-28T14:38:48Z">
               <w:r>
                 <w:rPr>
                   <w:rFonts w:asciiTheme="majorHAnsi" w:hAnsiTheme="majorHAnsi" w:cstheme="majorHAnsi"/>
@@ -7058,13 +7078,13 @@
               <w:widowControl w:val="0"/>
               <w:jc w:val="both"/>
               <w:rPr>
-                <w:ins w:id="1063" w:author="Cập nhật QĐ 2119, bản 1.3.4 (Claude)" w:date="2026-09-28T13:45:31Z"/>
-                <w:rFonts w:asciiTheme="majorHAnsi" w:hAnsiTheme="majorHAnsi" w:cstheme="majorHAnsi"/>
-                <w:sz w:val="28"/>
-                <w:szCs w:val="28"/>
-              </w:rPr>
-            </w:pPr>
-            <w:ins w:id="1062" w:author="Cập nhật QĐ 2119, bản 1.3.4 (Claude)" w:date="2026-09-28T13:45:31Z">
+                <w:ins w:id="1065" w:author="Cập nhật 28/9, bản 1.3.5 (Claude)" w:date="2026-09-28T14:38:48Z"/>
+                <w:rFonts w:asciiTheme="majorHAnsi" w:hAnsiTheme="majorHAnsi" w:cstheme="majorHAnsi"/>
+                <w:sz w:val="28"/>
+                <w:szCs w:val="28"/>
+              </w:rPr>
+            </w:pPr>
+            <w:ins w:id="1064" w:author="Cập nhật 28/9, bản 1.3.5 (Claude)" w:date="2026-09-28T14:38:48Z">
               <w:r>
                 <w:rPr>
                   <w:rFonts w:asciiTheme="majorHAnsi" w:hAnsiTheme="majorHAnsi" w:cstheme="majorHAnsi"/>
@@ -7080,7 +7100,7 @@
       <w:tr>
         <w:trPr>
           <w:jc w:val="center"/>
-          <w:ins w:id="1064" w:author="Cập nhật QĐ 2119, bản 1.3.4 (Claude)" w:date="2026-09-28T13:45:31Z"/>
+          <w:ins w:id="1066" w:author="Cập nhật 28/9, bản 1.3.5 (Claude)" w:date="2026-09-28T14:38:48Z"/>
         </w:trPr>
         <w:tc>
           <w:tcPr>
@@ -7092,14 +7112,14 @@
               <w:widowControl w:val="0"/>
               <w:jc w:val="center"/>
               <w:rPr>
-                <w:ins w:id="1066" w:author="Cập nhật QĐ 2119, bản 1.3.4 (Claude)" w:date="2026-09-28T13:45:31Z"/>
-                <w:ins w:id="1057" w:author="Cập nhật QĐ 2119, bản 1.3.4 (Claude)" w:date="2026-09-28T13:45:31Z"/>
-                <w:rFonts w:asciiTheme="majorHAnsi" w:hAnsiTheme="majorHAnsi" w:cstheme="majorHAnsi"/>
-                <w:sz w:val="28"/>
-                <w:szCs w:val="28"/>
-              </w:rPr>
-            </w:pPr>
-            <w:ins w:id="1065" w:author="Cập nhật QĐ 2119, bản 1.3.4 (Claude)" w:date="2026-09-28T13:45:31Z">
+                <w:ins w:id="1068" w:author="Cập nhật 28/9, bản 1.3.5 (Claude)" w:date="2026-09-28T14:38:48Z"/>
+                <w:ins w:id="1059" w:author="Cập nhật 28/9, bản 1.3.5 (Claude)" w:date="2026-09-28T14:38:48Z"/>
+                <w:rFonts w:asciiTheme="majorHAnsi" w:hAnsiTheme="majorHAnsi" w:cstheme="majorHAnsi"/>
+                <w:sz w:val="28"/>
+                <w:szCs w:val="28"/>
+              </w:rPr>
+            </w:pPr>
+            <w:ins w:id="1067" w:author="Cập nhật 28/9, bản 1.3.5 (Claude)" w:date="2026-09-28T14:38:48Z">
               <w:r>
                 <w:rPr>
                   <w:rFonts w:asciiTheme="majorHAnsi" w:hAnsiTheme="majorHAnsi" w:cstheme="majorHAnsi"/>
@@ -7121,14 +7141,14 @@
               <w:widowControl w:val="0"/>
               <w:jc w:val="both"/>
               <w:rPr>
-                <w:ins w:id="1068" w:author="Cập nhật QĐ 2119, bản 1.3.4 (Claude)" w:date="2026-09-28T13:45:31Z"/>
-                <w:ins w:id="1059" w:author="Cập nhật QĐ 2119, bản 1.3.4 (Claude)" w:date="2026-09-28T13:45:31Z"/>
-                <w:rFonts w:asciiTheme="majorHAnsi" w:hAnsiTheme="majorHAnsi" w:cstheme="majorHAnsi"/>
-                <w:sz w:val="28"/>
-                <w:szCs w:val="28"/>
-              </w:rPr>
-            </w:pPr>
-            <w:ins w:id="1067" w:author="Cập nhật QĐ 2119, bản 1.3.4 (Claude)" w:date="2026-09-28T13:45:31Z">
+                <w:ins w:id="1070" w:author="Cập nhật 28/9, bản 1.3.5 (Claude)" w:date="2026-09-28T14:38:48Z"/>
+                <w:ins w:id="1061" w:author="Cập nhật 28/9, bản 1.3.5 (Claude)" w:date="2026-09-28T14:38:48Z"/>
+                <w:rFonts w:asciiTheme="majorHAnsi" w:hAnsiTheme="majorHAnsi" w:cstheme="majorHAnsi"/>
+                <w:sz w:val="28"/>
+                <w:szCs w:val="28"/>
+              </w:rPr>
+            </w:pPr>
+            <w:ins w:id="1069" w:author="Cập nhật 28/9, bản 1.3.5 (Claude)" w:date="2026-09-28T14:38:48Z">
               <w:r>
                 <w:rPr>
                   <w:rFonts w:asciiTheme="majorHAnsi" w:hAnsiTheme="majorHAnsi" w:cstheme="majorHAnsi"/>
@@ -7150,14 +7170,14 @@
               <w:widowControl w:val="0"/>
               <w:jc w:val="both"/>
               <w:rPr>
-                <w:ins w:id="1070" w:author="Cập nhật QĐ 2119, bản 1.3.4 (Claude)" w:date="2026-09-28T13:45:31Z"/>
-                <w:ins w:id="1061" w:author="Cập nhật QĐ 2119, bản 1.3.4 (Claude)" w:date="2026-09-28T13:45:31Z"/>
-                <w:rFonts w:asciiTheme="majorHAnsi" w:hAnsiTheme="majorHAnsi" w:cstheme="majorHAnsi"/>
-                <w:sz w:val="28"/>
-                <w:szCs w:val="28"/>
-              </w:rPr>
-            </w:pPr>
-            <w:ins w:id="1069" w:author="Cập nhật QĐ 2119, bản 1.3.4 (Claude)" w:date="2026-09-28T13:45:31Z">
+                <w:ins w:id="1072" w:author="Cập nhật 28/9, bản 1.3.5 (Claude)" w:date="2026-09-28T14:38:48Z"/>
+                <w:ins w:id="1063" w:author="Cập nhật 28/9, bản 1.3.5 (Claude)" w:date="2026-09-28T14:38:48Z"/>
+                <w:rFonts w:asciiTheme="majorHAnsi" w:hAnsiTheme="majorHAnsi" w:cstheme="majorHAnsi"/>
+                <w:sz w:val="28"/>
+                <w:szCs w:val="28"/>
+              </w:rPr>
+            </w:pPr>
+            <w:ins w:id="1071" w:author="Cập nhật 28/9, bản 1.3.5 (Claude)" w:date="2026-09-28T14:38:48Z">
               <w:r>
                 <w:rPr>
                   <w:rFonts w:asciiTheme="majorHAnsi" w:hAnsiTheme="majorHAnsi" w:cstheme="majorHAnsi"/>
@@ -7179,14 +7199,14 @@
               <w:widowControl w:val="0"/>
               <w:jc w:val="both"/>
               <w:rPr>
-                <w:ins w:id="1072" w:author="Cập nhật QĐ 2119, bản 1.3.4 (Claude)" w:date="2026-09-28T13:45:31Z"/>
-                <w:ins w:id="1063" w:author="Cập nhật QĐ 2119, bản 1.3.4 (Claude)" w:date="2026-09-28T13:45:31Z"/>
-                <w:rFonts w:asciiTheme="majorHAnsi" w:hAnsiTheme="majorHAnsi" w:cstheme="majorHAnsi"/>
-                <w:sz w:val="28"/>
-                <w:szCs w:val="28"/>
-              </w:rPr>
-            </w:pPr>
-            <w:ins w:id="1071" w:author="Cập nhật QĐ 2119, bản 1.3.4 (Claude)" w:date="2026-09-28T13:45:31Z">
+                <w:ins w:id="1074" w:author="Cập nhật 28/9, bản 1.3.5 (Claude)" w:date="2026-09-28T14:38:48Z"/>
+                <w:ins w:id="1065" w:author="Cập nhật 28/9, bản 1.3.5 (Claude)" w:date="2026-09-28T14:38:48Z"/>
+                <w:rFonts w:asciiTheme="majorHAnsi" w:hAnsiTheme="majorHAnsi" w:cstheme="majorHAnsi"/>
+                <w:sz w:val="28"/>
+                <w:szCs w:val="28"/>
+              </w:rPr>
+            </w:pPr>
+            <w:ins w:id="1073" w:author="Cập nhật 28/9, bản 1.3.5 (Claude)" w:date="2026-09-28T14:38:48Z">
               <w:r>
                 <w:rPr>
                   <w:rFonts w:asciiTheme="majorHAnsi" w:hAnsiTheme="majorHAnsi" w:cstheme="majorHAnsi"/>
@@ -7316,7 +7336,7 @@
         </w:rPr>
         <w:t xml:space="preserve">- Tài liệu đầu vào: Thông báo số 736/TB-CĐKT, Thông báo số 817/TB-CĐKT, </w:t>
       </w:r>
-      <w:del w:id="1073" w:author="Cập nhật QĐ 2119, bản 1.3.4 (Claude)" w:date="2026-09-28T13:45:31Z">
+      <w:del w:id="1075" w:author="Cập nhật 28/9, bản 1.3.5 (Claude)" w:date="2026-09-28T14:38:48Z">
         <w:r>
           <w:rPr>
             <w:rFonts w:asciiTheme="majorHAnsi" w:hAnsiTheme="majorHAnsi" w:cstheme="majorHAnsi"/>
@@ -7327,7 +7347,7 @@
           <w:delText xml:space="preserve">Quyết định số 1923/QĐ-CĐKT, Thông báo số 1052/TB-CĐKT, mẫu Phụ lục</w:delText>
         </w:r>
       </w:del>
-      <w:ins w:id="1074" w:author="Cập nhật QĐ 2119, bản 1.3.4 (Claude)" w:date="2026-09-28T13:45:31Z">
+      <w:ins w:id="1076" w:author="Cập nhật 28/9, bản 1.3.5 (Claude)" w:date="2026-09-28T14:38:48Z">
         <w:r>
           <w:rPr>
             <w:rFonts w:asciiTheme="majorHAnsi" w:hAnsiTheme="majorHAnsi" w:cstheme="majorHAnsi"/>
@@ -7470,14 +7490,14 @@
         <w:ind w:firstLine="720"/>
         <w:jc w:val="both"/>
         <w:rPr>
-          <w:ins w:id="1076" w:author="Cập nhật QĐ 2119, bản 1.3.4 (Claude)" w:date="2026-09-28T13:45:31Z"/>
+          <w:ins w:id="1078" w:author="Cập nhật 28/9, bản 1.3.5 (Claude)" w:date="2026-09-28T14:38:48Z"/>
           <w:rFonts w:asciiTheme="majorHAnsi" w:hAnsiTheme="majorHAnsi" w:cstheme="majorHAnsi"/>
           <w:sz w:val="28"/>
           <w:szCs w:val="28"/>
           <w:shd w:val="clear" w:color="auto" w:fill="FFFFFF"/>
         </w:rPr>
       </w:pPr>
-      <w:ins w:id="1075" w:author="Cập nhật QĐ 2119, bản 1.3.4 (Claude)" w:date="2026-09-28T13:45:31Z">
+      <w:ins w:id="1077" w:author="Cập nhật 28/9, bản 1.3.5 (Claude)" w:date="2026-09-28T14:38:48Z">
         <w:r>
           <w:rPr>
             <w:rFonts w:asciiTheme="majorHAnsi" w:hAnsiTheme="majorHAnsi" w:cstheme="majorHAnsi"/>
@@ -7485,7 +7505,7 @@
             <w:szCs w:val="28"/>
             <w:shd w:val="clear" w:color="auto" w:fill="FFFFFF"/>
           </w:rPr>
-          <w:t xml:space="preserve">- Cập nhật ngày 28/9/2026 theo Quyết định số 2119/QĐ-CĐKT ngày 28/9/2026: tệp plugin bản 1.3.4, mã SHA-256, hồ sơ bằng chứng kiểm thử, kết quả nghiệm thu lại các ca liên quan, phiếu nghiệm thu trên Claude, Cowork bản 1.3.4; Báo cáo quá trình xây dựng bản 6, Tài liệu hướng dẫn bản 7, Báo cáo tiếp thu, giải trình lần 4 bản 2 (Track Changes và bản sạch).</w:t>
+          <w:t xml:space="preserve">- Cập nhật ngày 28/9/2026 theo Quyết định số 2119/QĐ-CĐKT ngày 28/9/2026: tệp plugin bản 1.3.5 (kết nối thư mục đầu vào, đầu ra cho tài khoản thành viên), mã SHA-256, hồ sơ bằng chứng kiểm thử, kết quả nghiệm thu lại các ca liên quan, phiếu nghiệm thu trên Claude, Cowork bản 1.3.5; Báo cáo quá trình xây dựng bản 6, Tài liệu hướng dẫn bản 7, Báo cáo tiếp thu, giải trình lần 4 bản 2 (Track Changes và bản sạch).</w:t>
         </w:r>
       </w:ins>
     </w:p>
@@ -7525,7 +7545,7 @@
         </w:rPr>
         <w:t xml:space="preserve">(i) thẩm định độc lập bổ sung </w:t>
       </w:r>
-      <w:del w:id="1077" w:author="Cập nhật QĐ 2119, bản 1.3.4 (Claude)" w:date="2026-09-28T13:45:31Z">
+      <w:del w:id="1079" w:author="Cập nhật 28/9, bản 1.3.5 (Claude)" w:date="2026-09-28T14:38:48Z">
         <w:r>
           <w:rPr>
             <w:rFonts w:asciiTheme="majorHAnsi" w:hAnsiTheme="majorHAnsi" w:cstheme="majorHAnsi"/>
@@ -7538,7 +7558,7 @@
           <w:delText xml:space="preserve">(vòng 5) trên tệp plugin bản 1.3.2 để xác nhận</w:delText>
         </w:r>
       </w:del>
-      <w:ins w:id="1078" w:author="Cập nhật QĐ 2119, bản 1.3.4 (Claude)" w:date="2026-09-28T13:45:31Z">
+      <w:ins w:id="1080" w:author="Cập nhật 28/9, bản 1.3.5 (Claude)" w:date="2026-09-28T14:38:48Z">
         <w:r>
           <w:rPr>
             <w:rFonts w:asciiTheme="majorHAnsi" w:hAnsiTheme="majorHAnsi" w:cstheme="majorHAnsi"/>
@@ -7548,7 +7568,7 @@
             <w:szCs w:val="28"/>
             <w:shd w:val="clear" w:color="auto" w:fill="FFFFFF"/>
           </w:rPr>
-          <w:t xml:space="preserve">(vòng 5) trên tệp plugin bản 1.3.4 để xác nhận</w:t>
+          <w:t xml:space="preserve">(vòng 5) trên tệp plugin bản 1.3.5 để xác nhận</w:t>
         </w:r>
       </w:ins>
       <w:r>
@@ -7573,7 +7593,7 @@
         </w:rPr>
         <w:t xml:space="preserve">; (ii) kiểm thử nghiệm thu trên Claude (trò chuyện) và Claude Cowork; (iii) kiểm kê, thu hồi phiên bản cũ ở cấp tổ chức; phân quyền chỉ đọc kho KTC-Database có biên bản; (iv) rà soát bằng Skill “ktc-ra-soat-897” phần sửa đổi lần 3 của dự thảo Thông báo, Tài liệu hướng dẫn (2 vòng đối với Thông báo bản 5, Tài liệu hướng dẫn bản 4 đã thực hiện; Thông báo số 917/TB-CĐKT, 924/TB-CĐKT, 948/TB-CĐKT </w:t>
       </w:r>
-      <w:del w:id="1079" w:author="Cập nhật QĐ 2119, bản 1.3.4 (Claude)" w:date="2026-09-28T13:45:31Z">
+      <w:del w:id="1081" w:author="Cập nhật 28/9, bản 1.3.5 (Claude)" w:date="2026-09-28T14:38:48Z">
         <w:r>
           <w:rPr>
             <w:rFonts w:asciiTheme="majorHAnsi" w:hAnsiTheme="majorHAnsi" w:cstheme="majorHAnsi"/>
@@ -7586,7 +7606,7 @@
           <w:delText xml:space="preserve">đã đối chiếu bản gốc ngày 27/9/2026)</w:delText>
         </w:r>
       </w:del>
-      <w:ins w:id="1080" w:author="Cập nhật QĐ 2119, bản 1.3.4 (Claude)" w:date="2026-09-28T13:45:31Z">
+      <w:ins w:id="1082" w:author="Cập nhật 28/9, bản 1.3.5 (Claude)" w:date="2026-09-28T14:38:48Z">
         <w:r>
           <w:rPr>
             <w:rFonts w:asciiTheme="majorHAnsi" w:hAnsiTheme="majorHAnsi" w:cstheme="majorHAnsi"/>

</xml_diff>

<commit_message>
docs: hồ sơ thẩm định vòng 5 chuyển sang plugin 1.3.12 (80 tệp, kiem_ho_so sạch)
- BC quá trình v6, HD v7, BC tiếp thu lần 4 v2 dựng lại Track Changes trên bản
  nền 27/9: cập nhật 1.3.3 - 1.3.12 (QĐ 2119, báo cáo tháng từ bản đã ban hành,
  plugin tự đủ, dựng văn bản từ mẫu, đo thể thức ánh xạ 897); giữ dòng người
  phụ trách thêm trong HD.
- Thêm sản phẩm chạy độc lập báo cáo tháng 9 (1.3.6), phiếu nghiệm thu 1.3.12.
- Ghi rõ: bản 1.3.6 - 1.3.12 chưa chạy lại bộ nghiệm thu 15 ca; phần cập nhật
  28 - 29/9 chưa rà soát bằng ktc-ra-soat-897.

Co-Authored-By: Claude Opus 5.5 <noreply@anthropic.com>
</commit_message>
<xml_diff>
--- a/30-Ket-Qua/2026-09-27/Ho-So-Tham-Dinh-Vong-5/4-Van-ban/BC_Qua-trinh-xay-dung-bo-cong-cu-KTC-Quan-tri_20260928_v6_TrackChanges.docx
+++ b/30-Ket-Qua/2026-09-27/Ho-So-Tham-Dinh-Vong-5/4-Van-ban/BC_Qua-trinh-xay-dung-bo-cong-cu-KTC-Quan-tri_20260928_v6_TrackChanges.docx
@@ -1849,7 +1849,7 @@
                 <w:szCs w:val="28"/>
               </w:rPr>
             </w:pPr>
-            <w:del w:id="1001" w:author="Cập nhật 28/9, bản 1.3.5 (Claude)" w:date="2026-09-28T14:38:48Z">
+            <w:del w:id="1001" w:author="Cập nhật 28 - 29/9, bản 1.3.12 (Claude)" w:date="2026-09-29T08:21:37Z">
               <w:r>
                 <w:rPr>
                   <w:rFonts w:asciiTheme="majorHAnsi" w:hAnsiTheme="majorHAnsi" w:cstheme="majorHAnsi"/>
@@ -1859,7 +1859,7 @@
                 <w:delText xml:space="preserve">Bản 1.3.2 (hiện hành), mã SHA-256</w:delText>
               </w:r>
             </w:del>
-            <w:ins w:id="1002" w:author="Cập nhật 28/9, bản 1.3.5 (Claude)" w:date="2026-09-28T14:38:48Z">
+            <w:ins w:id="1002" w:author="Cập nhật 28 - 29/9, bản 1.3.12 (Claude)" w:date="2026-09-29T08:21:37Z">
               <w:r>
                 <w:rPr>
                   <w:rFonts w:asciiTheme="majorHAnsi" w:hAnsiTheme="majorHAnsi" w:cstheme="majorHAnsi"/>
@@ -1908,7 +1908,7 @@
       <w:tr>
         <w:trPr>
           <w:jc w:val="center"/>
-          <w:ins w:id="1003" w:author="Cập nhật 28/9, bản 1.3.5 (Claude)" w:date="2026-09-28T14:38:48Z"/>
+          <w:ins w:id="1003" w:author="Cập nhật 28 - 29/9, bản 1.3.12 (Claude)" w:date="2026-09-29T08:21:37Z"/>
         </w:trPr>
         <w:tc>
           <w:tcPr>
@@ -1920,13 +1920,13 @@
               <w:widowControl w:val="0"/>
               <w:jc w:val="center"/>
               <w:rPr>
-                <w:ins w:id="1005" w:author="Cập nhật 28/9, bản 1.3.5 (Claude)" w:date="2026-09-28T14:38:48Z"/>
-                <w:rFonts w:asciiTheme="majorHAnsi" w:hAnsiTheme="majorHAnsi" w:cstheme="majorHAnsi"/>
-                <w:sz w:val="28"/>
-                <w:szCs w:val="28"/>
-              </w:rPr>
-            </w:pPr>
-            <w:ins w:id="1004" w:author="Cập nhật 28/9, bản 1.3.5 (Claude)" w:date="2026-09-28T14:38:48Z">
+                <w:ins w:id="1005" w:author="Cập nhật 28 - 29/9, bản 1.3.12 (Claude)" w:date="2026-09-29T08:21:37Z"/>
+                <w:rFonts w:asciiTheme="majorHAnsi" w:hAnsiTheme="majorHAnsi" w:cstheme="majorHAnsi"/>
+                <w:sz w:val="28"/>
+                <w:szCs w:val="28"/>
+              </w:rPr>
+            </w:pPr>
+            <w:ins w:id="1004" w:author="Cập nhật 28 - 29/9, bản 1.3.12 (Claude)" w:date="2026-09-29T08:21:37Z">
               <w:r>
                 <w:rPr>
                   <w:rFonts w:asciiTheme="majorHAnsi" w:hAnsiTheme="majorHAnsi" w:cstheme="majorHAnsi"/>
@@ -1948,20 +1948,20 @@
               <w:widowControl w:val="0"/>
               <w:jc w:val="both"/>
               <w:rPr>
-                <w:ins w:id="1007" w:author="Cập nhật 28/9, bản 1.3.5 (Claude)" w:date="2026-09-28T14:38:48Z"/>
-                <w:rFonts w:asciiTheme="majorHAnsi" w:hAnsiTheme="majorHAnsi" w:cstheme="majorHAnsi"/>
-                <w:sz w:val="28"/>
-                <w:szCs w:val="28"/>
-              </w:rPr>
-            </w:pPr>
-            <w:ins w:id="1006" w:author="Cập nhật 28/9, bản 1.3.5 (Claude)" w:date="2026-09-28T14:38:48Z">
+                <w:ins w:id="1007" w:author="Cập nhật 28 - 29/9, bản 1.3.12 (Claude)" w:date="2026-09-29T08:21:37Z"/>
+                <w:rFonts w:asciiTheme="majorHAnsi" w:hAnsiTheme="majorHAnsi" w:cstheme="majorHAnsi"/>
+                <w:sz w:val="28"/>
+                <w:szCs w:val="28"/>
+              </w:rPr>
+            </w:pPr>
+            <w:ins w:id="1006" w:author="Cập nhật 28 - 29/9, bản 1.3.12 (Claude)" w:date="2026-09-29T08:21:37Z">
               <w:r>
                 <w:rPr>
                   <w:rFonts w:asciiTheme="majorHAnsi" w:hAnsiTheme="majorHAnsi" w:cstheme="majorHAnsi"/>
                   <w:sz w:val="28"/>
                   <w:szCs w:val="28"/>
                 </w:rPr>
-                <w:t xml:space="preserve">Cập nhật theo Quyết định số 2119/QĐ-CĐKT ngày 28/9/2026 ban hành Danh mục sản phẩm, công việc (thay thế danh mục dự thảo kèm Thông báo số 1052/TB-CĐKT): hệ số quy đổi tra theo từng sản phẩm của Danh mục chính thức; chuẩn phân loại 6 Trục ghi căn cứ Quyết định số 1923/QĐ-CĐKT (Phụ lục I, II) cho cột Điểm chấm, Hệ số quy đổi; sửa thao tác chặn ghi chặn nhầm lệnh chỉ đọc kho; kết nối thư mục đầu vào, đầu ra cho tài khoản thành viên trên Cowork</w:t>
+                <w:t xml:space="preserve">Cập nhật theo Quyết định số 2119/QĐ-CĐKT ngày 28/9/2026 ban hành Danh mục sản phẩm, công việc (thay thế danh mục dự thảo kèm Thông báo số 1052/TB-CĐKT): hệ số quy đổi tra theo từng sản phẩm của Danh mục chính thức; chuẩn phân loại 6 Trục ghi căn cứ Quyết định số 1923/QĐ-CĐKT (Phụ lục I, II) cho cột Điểm chấm, Hệ số quy đổi; sửa thao tác chặn ghi chặn nhầm lệnh chỉ đọc kho; kết nối thư mục đầu vào, đầu ra cho tài khoản thành viên trên Cowork; báo cáo tháng cấp Trường dựng từ bản đã ban hành, đóng vào plugin mọi công cụ dựng báo cáo (khắc phục chạy thử ngày 28/9/2026); plugin tự đủ, không đề nghị thêm thư mục dự án khi dùng trên Cowork; văn bản dựng bằng cách ráp nội dung vào mẫu 03-Templates(1) hoặc sửa văn bản tương tự, đo thể thức ánh xạ bộ quy tắc KTC-Ra-Soat-897</w:t>
               </w:r>
             </w:ins>
           </w:p>
@@ -1976,20 +1976,20 @@
               <w:widowControl w:val="0"/>
               <w:jc w:val="both"/>
               <w:rPr>
-                <w:ins w:id="1009" w:author="Cập nhật 28/9, bản 1.3.5 (Claude)" w:date="2026-09-28T14:38:48Z"/>
-                <w:rFonts w:asciiTheme="majorHAnsi" w:hAnsiTheme="majorHAnsi" w:cstheme="majorHAnsi"/>
-                <w:sz w:val="28"/>
-                <w:szCs w:val="28"/>
-              </w:rPr>
-            </w:pPr>
-            <w:ins w:id="1008" w:author="Cập nhật 28/9, bản 1.3.5 (Claude)" w:date="2026-09-28T14:38:48Z">
+                <w:ins w:id="1009" w:author="Cập nhật 28 - 29/9, bản 1.3.12 (Claude)" w:date="2026-09-29T08:21:37Z"/>
+                <w:rFonts w:asciiTheme="majorHAnsi" w:hAnsiTheme="majorHAnsi" w:cstheme="majorHAnsi"/>
+                <w:sz w:val="28"/>
+                <w:szCs w:val="28"/>
+              </w:rPr>
+            </w:pPr>
+            <w:ins w:id="1008" w:author="Cập nhật 28 - 29/9, bản 1.3.12 (Claude)" w:date="2026-09-29T08:21:37Z">
               <w:r>
                 <w:rPr>
                   <w:rFonts w:asciiTheme="majorHAnsi" w:hAnsiTheme="majorHAnsi" w:cstheme="majorHAnsi"/>
                   <w:sz w:val="28"/>
                   <w:szCs w:val="28"/>
                 </w:rPr>
-                <w:t xml:space="preserve">Bản 1.3.3 - 1.3.5 (hiện hành), mã SHA-256 228926d5...d929, mã nguồn commit b0c1824; hồ sơ bằng chứng kiểm thử</w:t>
+                <w:t xml:space="preserve">Bản 1.3.3 - 1.3.12 (hiện hành), mã SHA-256 ac180420...69df, mã nguồn commit 5d98f2b; hồ sơ bằng chứng kiểm thử</w:t>
               </w:r>
             </w:ins>
           </w:p>
@@ -2004,20 +2004,20 @@
               <w:widowControl w:val="0"/>
               <w:jc w:val="center"/>
               <w:rPr>
-                <w:ins w:id="1011" w:author="Cập nhật 28/9, bản 1.3.5 (Claude)" w:date="2026-09-28T14:38:48Z"/>
-                <w:rFonts w:asciiTheme="majorHAnsi" w:hAnsiTheme="majorHAnsi" w:cstheme="majorHAnsi"/>
-                <w:sz w:val="28"/>
-                <w:szCs w:val="28"/>
-              </w:rPr>
-            </w:pPr>
-            <w:ins w:id="1010" w:author="Cập nhật 28/9, bản 1.3.5 (Claude)" w:date="2026-09-28T14:38:48Z">
+                <w:ins w:id="1011" w:author="Cập nhật 28 - 29/9, bản 1.3.12 (Claude)" w:date="2026-09-29T08:21:37Z"/>
+                <w:rFonts w:asciiTheme="majorHAnsi" w:hAnsiTheme="majorHAnsi" w:cstheme="majorHAnsi"/>
+                <w:sz w:val="28"/>
+                <w:szCs w:val="28"/>
+              </w:rPr>
+            </w:pPr>
+            <w:ins w:id="1010" w:author="Cập nhật 28 - 29/9, bản 1.3.12 (Claude)" w:date="2026-09-29T08:21:37Z">
               <w:r>
                 <w:rPr>
                   <w:rFonts w:asciiTheme="majorHAnsi" w:hAnsiTheme="majorHAnsi" w:cstheme="majorHAnsi"/>
                   <w:sz w:val="28"/>
                   <w:szCs w:val="28"/>
                 </w:rPr>
-                <w:t xml:space="preserve">28/9/2026</w:t>
+                <w:t xml:space="preserve">28 - 29/9/2026</w:t>
               </w:r>
             </w:ins>
           </w:p>
@@ -2043,7 +2043,7 @@
         </w:rPr>
         <w:t xml:space="preserve">Toàn bộ quá trình được lưu vết: </w:t>
       </w:r>
-      <w:del w:id="1012" w:author="Cập nhật 28/9, bản 1.3.5 (Claude)" w:date="2026-09-28T14:38:48Z">
+      <w:del w:id="1012" w:author="Cập nhật 28 - 29/9, bản 1.3.12 (Claude)" w:date="2026-09-29T08:21:37Z">
         <w:r>
           <w:rPr>
             <w:rFonts w:asciiTheme="majorHAnsi" w:hAnsiTheme="majorHAnsi" w:cstheme="majorHAnsi"/>
@@ -2053,14 +2053,14 @@
           <w:delText xml:space="preserve">87 lần cập nhật trên kho mã nguồn (từ 18/9/2026), nhật ký thay đổi 28 phiên bản, 26</w:delText>
         </w:r>
       </w:del>
-      <w:ins w:id="1013" w:author="Cập nhật 28/9, bản 1.3.5 (Claude)" w:date="2026-09-28T14:38:48Z">
+      <w:ins w:id="1013" w:author="Cập nhật 28 - 29/9, bản 1.3.12 (Claude)" w:date="2026-09-29T08:21:37Z">
         <w:r>
           <w:rPr>
             <w:rFonts w:asciiTheme="majorHAnsi" w:hAnsiTheme="majorHAnsi" w:cstheme="majorHAnsi"/>
             <w:sz w:val="28"/>
             <w:szCs w:val="28"/>
           </w:rPr>
-          <w:t xml:space="preserve">101 lần cập nhật trên kho mã nguồn (từ 18/9/2026), nhật ký thay đổi 31 phiên bản, 28</w:t>
+          <w:t xml:space="preserve">114 lần cập nhật trên kho mã nguồn (từ 18/9/2026), nhật ký thay đổi 38 phiên bản, 30</w:t>
         </w:r>
       </w:ins>
       <w:r>
@@ -2323,7 +2323,7 @@
               </w:rPr>
               <w:t xml:space="preserve">Kiểm kê kho KTC-Database (8 kho), mẫu Phụ lục TB 736, TB 817, </w:t>
             </w:r>
-            <w:del w:id="1014" w:author="Cập nhật 28/9, bản 1.3.5 (Claude)" w:date="2026-09-28T14:38:48Z">
+            <w:del w:id="1014" w:author="Cập nhật 28 - 29/9, bản 1.3.12 (Claude)" w:date="2026-09-29T08:21:37Z">
               <w:r>
                 <w:rPr>
                   <w:rFonts w:asciiTheme="majorHAnsi" w:hAnsiTheme="majorHAnsi" w:cstheme="majorHAnsi"/>
@@ -2333,7 +2333,7 @@
                 <w:delText xml:space="preserve">Quyết định số 1923/QĐ-CĐKT, TB 1052, 6 mẫu Kế hoạch + KPI</w:delText>
               </w:r>
             </w:del>
-            <w:ins w:id="1015" w:author="Cập nhật 28/9, bản 1.3.5 (Claude)" w:date="2026-09-28T14:38:48Z">
+            <w:ins w:id="1015" w:author="Cập nhật 28 - 29/9, bản 1.3.12 (Claude)" w:date="2026-09-29T08:21:37Z">
               <w:r>
                 <w:rPr>
                   <w:rFonts w:asciiTheme="majorHAnsi" w:hAnsiTheme="majorHAnsi" w:cstheme="majorHAnsi"/>
@@ -2650,7 +2650,7 @@
                 <w:szCs w:val="28"/>
               </w:rPr>
             </w:pPr>
-            <w:del w:id="1016" w:author="Cập nhật 28/9, bản 1.3.5 (Claude)" w:date="2026-09-28T14:38:48Z">
+            <w:del w:id="1016" w:author="Cập nhật 28 - 29/9, bản 1.3.12 (Claude)" w:date="2026-09-29T08:21:37Z">
               <w:r>
                 <w:rPr>
                   <w:rFonts w:asciiTheme="majorHAnsi" w:hAnsiTheme="majorHAnsi" w:cstheme="majorHAnsi"/>
@@ -2660,7 +2660,7 @@
                 <w:delText xml:space="preserve">Dừng, không tự đặt quy tắc đối với: hai thang điểm quy đổi khối lượng công việc chưa có văn bản phân định; </w:delText>
               </w:r>
             </w:del>
-            <w:ins w:id="1017" w:author="Cập nhật 28/9, bản 1.3.5 (Claude)" w:date="2026-09-28T14:38:48Z">
+            <w:ins w:id="1017" w:author="Cập nhật 28 - 29/9, bản 1.3.12 (Claude)" w:date="2026-09-29T08:21:37Z">
               <w:r>
                 <w:rPr>
                   <w:rFonts w:asciiTheme="majorHAnsi" w:hAnsiTheme="majorHAnsi" w:cstheme="majorHAnsi"/>
@@ -3141,7 +3141,7 @@
           <w:szCs w:val="28"/>
         </w:rPr>
       </w:pPr>
-      <w:del w:id="1018" w:author="Cập nhật 28/9, bản 1.3.5 (Claude)" w:date="2026-09-28T14:38:48Z">
+      <w:del w:id="1018" w:author="Cập nhật 28 - 29/9, bản 1.3.12 (Claude)" w:date="2026-09-29T08:21:37Z">
         <w:r>
           <w:rPr>
             <w:rFonts w:asciiTheme="majorHAnsi" w:hAnsiTheme="majorHAnsi" w:cstheme="majorHAnsi"/>
@@ -3153,7 +3153,7 @@
           <w:delText xml:space="preserve">4. Kết quả kiểm thử (chạy lại ngày 27/9/2026, bản 1.3.2)</w:delText>
         </w:r>
       </w:del>
-      <w:ins w:id="1019" w:author="Cập nhật 28/9, bản 1.3.5 (Claude)" w:date="2026-09-28T14:38:48Z">
+      <w:ins w:id="1019" w:author="Cập nhật 28 - 29/9, bản 1.3.12 (Claude)" w:date="2026-09-29T08:21:37Z">
         <w:r>
           <w:rPr>
             <w:rFonts w:asciiTheme="majorHAnsi" w:hAnsiTheme="majorHAnsi" w:cstheme="majorHAnsi"/>
@@ -3162,7 +3162,7 @@
             <w:sz w:val="28"/>
             <w:szCs w:val="28"/>
           </w:rPr>
-          <w:t xml:space="preserve">4. Kết quả kiểm thử (chạy lại ngày 28/9/2026, bản 1.3.5)</w:t>
+          <w:t xml:space="preserve">4. Kết quả kiểm thử (chạy lại ngày 29/9/2026, bản 1.3.12)</w:t>
         </w:r>
       </w:ins>
     </w:p>
@@ -3456,7 +3456,7 @@
                 <w:szCs w:val="28"/>
               </w:rPr>
             </w:pPr>
-            <w:del w:id="1024" w:author="Cập nhật 28/9, bản 1.3.5 (Claude)" w:date="2026-09-28T14:38:48Z">
+            <w:del w:id="1024" w:author="Cập nhật 28 - 29/9, bản 1.3.12 (Claude)" w:date="2026-09-29T08:21:37Z">
               <w:r>
                 <w:rPr>
                   <w:rFonts w:asciiTheme="majorHAnsi" w:hAnsiTheme="majorHAnsi" w:cstheme="majorHAnsi"/>
@@ -3466,14 +3466,14 @@
                 <w:delText xml:space="preserve">21 bộ ca thử hồi quy (</w:delText>
               </w:r>
             </w:del>
-            <w:ins w:id="1025" w:author="Cập nhật 28/9, bản 1.3.5 (Claude)" w:date="2026-09-28T14:38:48Z">
+            <w:ins w:id="1025" w:author="Cập nhật 28 - 29/9, bản 1.3.12 (Claude)" w:date="2026-09-29T08:21:37Z">
               <w:r>
                 <w:rPr>
                   <w:rFonts w:asciiTheme="majorHAnsi" w:hAnsiTheme="majorHAnsi" w:cstheme="majorHAnsi"/>
                   <w:sz w:val="28"/>
                   <w:szCs w:val="28"/>
                 </w:rPr>
-                <w:t xml:space="preserve">22 bộ ca thử hồi quy (kết nối thư mục đơn vị, </w:t>
+                <w:t xml:space="preserve">24 bộ ca thử hồi quy (plugin tự đủ, thể thức ánh xạ bộ quy tắc KTC-Ra-Soat-897, dựng báo cáo tháng từ bản đã ban hành, kết nối thư mục đơn vị, </w:t>
               </w:r>
             </w:ins>
             <w:r>
@@ -3484,7 +3484,7 @@
               </w:rPr>
               <w:t xml:space="preserve">tính KPI, xếp loại, biểu mẫu, viện dẫn, thể thức, minh chứng, Track Changes, nhật ký, </w:t>
             </w:r>
-            <w:del w:id="1020" w:author="Cập nhật 28/9, bản 1.3.5 (Claude)" w:date="2026-09-28T14:38:48Z">
+            <w:del w:id="1020" w:author="Cập nhật 28 - 29/9, bản 1.3.12 (Claude)" w:date="2026-09-29T08:21:37Z">
               <w:r>
                 <w:rPr>
                   <w:rFonts w:asciiTheme="majorHAnsi" w:hAnsiTheme="majorHAnsi" w:cstheme="majorHAnsi"/>
@@ -3494,7 +3494,7 @@
                 <w:delText xml:space="preserve">thao tác chặn ghi và bản dựng 1.3.0, 1.3.1)</w:delText>
               </w:r>
             </w:del>
-            <w:ins w:id="1021" w:author="Cập nhật 28/9, bản 1.3.5 (Claude)" w:date="2026-09-28T14:38:48Z">
+            <w:ins w:id="1021" w:author="Cập nhật 28 - 29/9, bản 1.3.12 (Claude)" w:date="2026-09-29T08:21:37Z">
               <w:r>
                 <w:rPr>
                   <w:rFonts w:asciiTheme="majorHAnsi" w:hAnsiTheme="majorHAnsi" w:cstheme="majorHAnsi"/>
@@ -3546,7 +3546,7 @@
                 <w:szCs w:val="28"/>
               </w:rPr>
             </w:pPr>
-            <w:del w:id="1022" w:author="Cập nhật 28/9, bản 1.3.5 (Claude)" w:date="2026-09-28T14:38:48Z">
+            <w:del w:id="1022" w:author="Cập nhật 28 - 29/9, bản 1.3.12 (Claude)" w:date="2026-09-29T08:21:37Z">
               <w:r>
                 <w:rPr>
                   <w:rFonts w:asciiTheme="majorHAnsi" w:hAnsiTheme="majorHAnsi" w:cstheme="majorHAnsi"/>
@@ -3556,14 +3556,14 @@
                 <w:delText>20/20 đạt</w:delText>
               </w:r>
             </w:del>
-            <w:ins w:id="1023" w:author="Cập nhật 28/9, bản 1.3.5 (Claude)" w:date="2026-09-28T14:38:48Z">
+            <w:ins w:id="1023" w:author="Cập nhật 28 - 29/9, bản 1.3.12 (Claude)" w:date="2026-09-29T08:21:37Z">
               <w:r>
                 <w:rPr>
                   <w:rFonts w:asciiTheme="majorHAnsi" w:hAnsiTheme="majorHAnsi" w:cstheme="majorHAnsi"/>
                   <w:sz w:val="28"/>
                   <w:szCs w:val="28"/>
                 </w:rPr>
-                <w:t xml:space="preserve">22/22 đạt</w:t>
+                <w:t xml:space="preserve">24/24 đạt</w:t>
               </w:r>
             </w:ins>
           </w:p>
@@ -4058,7 +4058,7 @@
                 <w:szCs w:val="28"/>
               </w:rPr>
             </w:pPr>
-            <w:del w:id="1026" w:author="Cập nhật 28/9, bản 1.3.5 (Claude)" w:date="2026-09-28T14:38:48Z">
+            <w:del w:id="1026" w:author="Cập nhật 28 - 29/9, bản 1.3.12 (Claude)" w:date="2026-09-29T08:21:37Z">
               <w:r>
                 <w:rPr>
                   <w:rFonts w:asciiTheme="majorHAnsi" w:hAnsiTheme="majorHAnsi" w:cstheme="majorHAnsi"/>
@@ -4068,7 +4068,7 @@
                 <w:delText xml:space="preserve">Bản 1.3.2; ngày 27/9/2026</w:delText>
               </w:r>
             </w:del>
-            <w:ins w:id="1027" w:author="Cập nhật 28/9, bản 1.3.5 (Claude)" w:date="2026-09-28T14:38:48Z">
+            <w:ins w:id="1027" w:author="Cập nhật 28 - 29/9, bản 1.3.12 (Claude)" w:date="2026-09-29T08:21:37Z">
               <w:r>
                 <w:rPr>
                   <w:rFonts w:asciiTheme="majorHAnsi" w:hAnsiTheme="majorHAnsi" w:cstheme="majorHAnsi"/>
@@ -4095,7 +4095,7 @@
                 <w:szCs w:val="28"/>
               </w:rPr>
             </w:pPr>
-            <w:del w:id="1028" w:author="Cập nhật 28/9, bản 1.3.5 (Claude)" w:date="2026-09-28T14:38:48Z">
+            <w:del w:id="1028" w:author="Cập nhật 28 - 29/9, bản 1.3.12 (Claude)" w:date="2026-09-29T08:21:37Z">
               <w:r>
                 <w:rPr>
                   <w:rFonts w:asciiTheme="majorHAnsi" w:hAnsiTheme="majorHAnsi" w:cstheme="majorHAnsi"/>
@@ -4105,7 +4105,7 @@
                 <w:delText>15/15 ca, 30/30 lượt đạt</w:delText>
               </w:r>
             </w:del>
-            <w:ins w:id="1029" w:author="Cập nhật 28/9, bản 1.3.5 (Claude)" w:date="2026-09-28T14:38:48Z">
+            <w:ins w:id="1029" w:author="Cập nhật 28 - 29/9, bản 1.3.12 (Claude)" w:date="2026-09-29T08:21:37Z">
               <w:r>
                 <w:rPr>
                   <w:rFonts w:asciiTheme="majorHAnsi" w:hAnsiTheme="majorHAnsi" w:cstheme="majorHAnsi"/>
@@ -4162,7 +4162,7 @@
                 <w:szCs w:val="28"/>
               </w:rPr>
             </w:pPr>
-            <w:del w:id="1030" w:author="Cập nhật 28/9, bản 1.3.5 (Claude)" w:date="2026-09-28T14:38:48Z">
+            <w:del w:id="1030" w:author="Cập nhật 28 - 29/9, bản 1.3.12 (Claude)" w:date="2026-09-29T08:21:37Z">
               <w:r>
                 <w:rPr>
                   <w:rFonts w:asciiTheme="majorHAnsi" w:hAnsiTheme="majorHAnsi" w:cstheme="majorHAnsi"/>
@@ -4172,7 +4172,7 @@
                 <w:delText xml:space="preserve">Thao tác chặn ghi: chạy lại 1.653 câu lệnh thật trong nhật ký vận hành</w:delText>
               </w:r>
             </w:del>
-            <w:ins w:id="1031" w:author="Cập nhật 28/9, bản 1.3.5 (Claude)" w:date="2026-09-28T14:38:48Z">
+            <w:ins w:id="1031" w:author="Cập nhật 28 - 29/9, bản 1.3.12 (Claude)" w:date="2026-09-29T08:21:37Z">
               <w:r>
                 <w:rPr>
                   <w:rFonts w:asciiTheme="majorHAnsi" w:hAnsiTheme="majorHAnsi" w:cstheme="majorHAnsi"/>
@@ -4199,7 +4199,7 @@
                 <w:szCs w:val="28"/>
               </w:rPr>
             </w:pPr>
-            <w:del w:id="1032" w:author="Cập nhật 28/9, bản 1.3.5 (Claude)" w:date="2026-09-28T14:38:48Z">
+            <w:del w:id="1032" w:author="Cập nhật 28 - 29/9, bản 1.3.12 (Claude)" w:date="2026-09-29T08:21:37Z">
               <w:r>
                 <w:rPr>
                   <w:rFonts w:asciiTheme="majorHAnsi" w:hAnsiTheme="majorHAnsi" w:cstheme="majorHAnsi"/>
@@ -4209,14 +4209,14 @@
                 <w:delText xml:space="preserve">Bản 1.3.2; gồm các lệnh vượt chặn do thẩm định lần 3, lần 4 phát hiện (ca thử riêng)</w:delText>
               </w:r>
             </w:del>
-            <w:ins w:id="1033" w:author="Cập nhật 28/9, bản 1.3.5 (Claude)" w:date="2026-09-28T14:38:48Z">
+            <w:ins w:id="1033" w:author="Cập nhật 28 - 29/9, bản 1.3.12 (Claude)" w:date="2026-09-29T08:21:37Z">
               <w:r>
                 <w:rPr>
                   <w:rFonts w:asciiTheme="majorHAnsi" w:hAnsiTheme="majorHAnsi" w:cstheme="majorHAnsi"/>
                   <w:sz w:val="28"/>
                   <w:szCs w:val="28"/>
                 </w:rPr>
-                <w:t xml:space="preserve">Bản 1.3.5 so với 1.3.2; gồm các lệnh vượt chặn do thẩm định lần 3, lần 4 phát hiện, các lệnh bị chặn nhầm ngày 28/9/2026 (ca thử riêng)</w:t>
+                <w:t xml:space="preserve">Bản 1.3.12 so với 1.3.2; gồm các lệnh vượt chặn do thẩm định lần 3, lần 4 phát hiện, các lệnh bị chặn nhầm ngày 28/9/2026 (ca thử riêng)</w:t>
               </w:r>
             </w:ins>
           </w:p>
@@ -4236,7 +4236,7 @@
                 <w:szCs w:val="28"/>
               </w:rPr>
             </w:pPr>
-            <w:del w:id="1034" w:author="Cập nhật 28/9, bản 1.3.5 (Claude)" w:date="2026-09-28T14:38:48Z">
+            <w:del w:id="1034" w:author="Cập nhật 28 - 29/9, bản 1.3.12 (Claude)" w:date="2026-09-29T08:21:37Z">
               <w:r>
                 <w:rPr>
                   <w:rFonts w:asciiTheme="majorHAnsi" w:hAnsiTheme="majorHAnsi" w:cstheme="majorHAnsi"/>
@@ -4246,7 +4246,7 @@
                 <w:delText xml:space="preserve">0 chặn nhầm</w:delText>
               </w:r>
             </w:del>
-            <w:ins w:id="1035" w:author="Cập nhật 28/9, bản 1.3.5 (Claude)" w:date="2026-09-28T14:38:48Z">
+            <w:ins w:id="1035" w:author="Cập nhật 28 - 29/9, bản 1.3.12 (Claude)" w:date="2026-09-29T08:21:37Z">
               <w:r>
                 <w:rPr>
                   <w:rFonts w:asciiTheme="majorHAnsi" w:hAnsiTheme="majorHAnsi" w:cstheme="majorHAnsi"/>
@@ -4416,7 +4416,7 @@
               </w:rPr>
               <w:t xml:space="preserve">Vận hành thực tế: người phụ trách dùng Bộ công cụ trong công việc của Phòng TH-HC&amp;QT </w:t>
             </w:r>
-            <w:del w:id="1036" w:author="Cập nhật 28/9, bản 1.3.5 (Claude)" w:date="2026-09-28T14:38:48Z">
+            <w:del w:id="1036" w:author="Cập nhật 28 - 29/9, bản 1.3.12 (Claude)" w:date="2026-09-29T08:21:37Z">
               <w:r>
                 <w:rPr>
                   <w:rFonts w:asciiTheme="majorHAnsi" w:hAnsiTheme="majorHAnsi" w:cstheme="majorHAnsi"/>
@@ -4426,7 +4426,7 @@
                 <w:delText xml:space="preserve">trên Claude Code (18 - 27/9/2026)</w:delText>
               </w:r>
             </w:del>
-            <w:ins w:id="1037" w:author="Cập nhật 28/9, bản 1.3.5 (Claude)" w:date="2026-09-28T14:38:48Z">
+            <w:ins w:id="1037" w:author="Cập nhật 28 - 29/9, bản 1.3.12 (Claude)" w:date="2026-09-29T08:21:37Z">
               <w:r>
                 <w:rPr>
                   <w:rFonts w:asciiTheme="majorHAnsi" w:hAnsiTheme="majorHAnsi" w:cstheme="majorHAnsi"/>
@@ -4478,7 +4478,7 @@
                 <w:szCs w:val="28"/>
               </w:rPr>
             </w:pPr>
-            <w:del w:id="1038" w:author="Cập nhật 28/9, bản 1.3.5 (Claude)" w:date="2026-09-28T14:38:48Z">
+            <w:del w:id="1038" w:author="Cập nhật 28 - 29/9, bản 1.3.12 (Claude)" w:date="2026-09-29T08:21:37Z">
               <w:r>
                 <w:rPr>
                   <w:rFonts w:asciiTheme="majorHAnsi" w:hAnsiTheme="majorHAnsi" w:cstheme="majorHAnsi"/>
@@ -4488,7 +4488,7 @@
                 <w:delText xml:space="preserve">10 ngày, 37 phiên, 2.024 thao tác</w:delText>
               </w:r>
             </w:del>
-            <w:ins w:id="1039" w:author="Cập nhật 28/9, bản 1.3.5 (Claude)" w:date="2026-09-28T14:38:48Z">
+            <w:ins w:id="1039" w:author="Cập nhật 28 - 29/9, bản 1.3.12 (Claude)" w:date="2026-09-29T08:21:37Z">
               <w:r>
                 <w:rPr>
                   <w:rFonts w:asciiTheme="majorHAnsi" w:hAnsiTheme="majorHAnsi" w:cstheme="majorHAnsi"/>
@@ -4512,7 +4512,7 @@
       <w:tr>
         <w:trPr>
           <w:jc w:val="center"/>
-          <w:ins w:id="1040" w:author="Cập nhật 28/9, bản 1.3.5 (Claude)" w:date="2026-09-28T14:38:48Z"/>
+          <w:ins w:id="1040" w:author="Cập nhật 28 - 29/9, bản 1.3.12 (Claude)" w:date="2026-09-29T08:21:37Z"/>
         </w:trPr>
         <w:tc>
           <w:tcPr>
@@ -4524,13 +4524,13 @@
               <w:widowControl w:val="0"/>
               <w:jc w:val="center"/>
               <w:rPr>
-                <w:ins w:id="1042" w:author="Cập nhật 28/9, bản 1.3.5 (Claude)" w:date="2026-09-28T14:38:48Z"/>
-                <w:rFonts w:asciiTheme="majorHAnsi" w:hAnsiTheme="majorHAnsi" w:cstheme="majorHAnsi"/>
-                <w:sz w:val="28"/>
-                <w:szCs w:val="28"/>
-              </w:rPr>
-            </w:pPr>
-            <w:ins w:id="1041" w:author="Cập nhật 28/9, bản 1.3.5 (Claude)" w:date="2026-09-28T14:38:48Z">
+                <w:ins w:id="1042" w:author="Cập nhật 28 - 29/9, bản 1.3.12 (Claude)" w:date="2026-09-29T08:21:37Z"/>
+                <w:rFonts w:asciiTheme="majorHAnsi" w:hAnsiTheme="majorHAnsi" w:cstheme="majorHAnsi"/>
+                <w:sz w:val="28"/>
+                <w:szCs w:val="28"/>
+              </w:rPr>
+            </w:pPr>
+            <w:ins w:id="1041" w:author="Cập nhật 28 - 29/9, bản 1.3.12 (Claude)" w:date="2026-09-29T08:21:37Z">
               <w:r>
                 <w:rPr>
                   <w:rFonts w:asciiTheme="majorHAnsi" w:hAnsiTheme="majorHAnsi" w:cstheme="majorHAnsi"/>
@@ -4552,13 +4552,13 @@
               <w:widowControl w:val="0"/>
               <w:jc w:val="both"/>
               <w:rPr>
-                <w:ins w:id="1044" w:author="Cập nhật 28/9, bản 1.3.5 (Claude)" w:date="2026-09-28T14:38:48Z"/>
-                <w:rFonts w:asciiTheme="majorHAnsi" w:hAnsiTheme="majorHAnsi" w:cstheme="majorHAnsi"/>
-                <w:sz w:val="28"/>
-                <w:szCs w:val="28"/>
-              </w:rPr>
-            </w:pPr>
-            <w:ins w:id="1043" w:author="Cập nhật 28/9, bản 1.3.5 (Claude)" w:date="2026-09-28T14:38:48Z">
+                <w:ins w:id="1044" w:author="Cập nhật 28 - 29/9, bản 1.3.12 (Claude)" w:date="2026-09-29T08:21:37Z"/>
+                <w:rFonts w:asciiTheme="majorHAnsi" w:hAnsiTheme="majorHAnsi" w:cstheme="majorHAnsi"/>
+                <w:sz w:val="28"/>
+                <w:szCs w:val="28"/>
+              </w:rPr>
+            </w:pPr>
+            <w:ins w:id="1043" w:author="Cập nhật 28 - 29/9, bản 1.3.12 (Claude)" w:date="2026-09-29T08:21:37Z">
               <w:r>
                 <w:rPr>
                   <w:rFonts w:asciiTheme="majorHAnsi" w:hAnsiTheme="majorHAnsi" w:cstheme="majorHAnsi"/>
@@ -4580,13 +4580,13 @@
               <w:widowControl w:val="0"/>
               <w:jc w:val="both"/>
               <w:rPr>
-                <w:ins w:id="1046" w:author="Cập nhật 28/9, bản 1.3.5 (Claude)" w:date="2026-09-28T14:38:48Z"/>
-                <w:rFonts w:asciiTheme="majorHAnsi" w:hAnsiTheme="majorHAnsi" w:cstheme="majorHAnsi"/>
-                <w:sz w:val="28"/>
-                <w:szCs w:val="28"/>
-              </w:rPr>
-            </w:pPr>
-            <w:ins w:id="1045" w:author="Cập nhật 28/9, bản 1.3.5 (Claude)" w:date="2026-09-28T14:38:48Z">
+                <w:ins w:id="1046" w:author="Cập nhật 28 - 29/9, bản 1.3.12 (Claude)" w:date="2026-09-29T08:21:37Z"/>
+                <w:rFonts w:asciiTheme="majorHAnsi" w:hAnsiTheme="majorHAnsi" w:cstheme="majorHAnsi"/>
+                <w:sz w:val="28"/>
+                <w:szCs w:val="28"/>
+              </w:rPr>
+            </w:pPr>
+            <w:ins w:id="1045" w:author="Cập nhật 28 - 29/9, bản 1.3.12 (Claude)" w:date="2026-09-29T08:21:37Z">
               <w:r>
                 <w:rPr>
                   <w:rFonts w:asciiTheme="majorHAnsi" w:hAnsiTheme="majorHAnsi" w:cstheme="majorHAnsi"/>
@@ -4608,13 +4608,13 @@
               <w:widowControl w:val="0"/>
               <w:jc w:val="center"/>
               <w:rPr>
-                <w:ins w:id="1048" w:author="Cập nhật 28/9, bản 1.3.5 (Claude)" w:date="2026-09-28T14:38:48Z"/>
-                <w:rFonts w:asciiTheme="majorHAnsi" w:hAnsiTheme="majorHAnsi" w:cstheme="majorHAnsi"/>
-                <w:sz w:val="28"/>
-                <w:szCs w:val="28"/>
-              </w:rPr>
-            </w:pPr>
-            <w:ins w:id="1047" w:author="Cập nhật 28/9, bản 1.3.5 (Claude)" w:date="2026-09-28T14:38:48Z">
+                <w:ins w:id="1048" w:author="Cập nhật 28 - 29/9, bản 1.3.12 (Claude)" w:date="2026-09-29T08:21:37Z"/>
+                <w:rFonts w:asciiTheme="majorHAnsi" w:hAnsiTheme="majorHAnsi" w:cstheme="majorHAnsi"/>
+                <w:sz w:val="28"/>
+                <w:szCs w:val="28"/>
+              </w:rPr>
+            </w:pPr>
+            <w:ins w:id="1047" w:author="Cập nhật 28 - 29/9, bản 1.3.12 (Claude)" w:date="2026-09-29T08:21:37Z">
               <w:r>
                 <w:rPr>
                   <w:rFonts w:asciiTheme="majorHAnsi" w:hAnsiTheme="majorHAnsi" w:cstheme="majorHAnsi"/>
@@ -4622,6 +4622,254 @@
                   <w:szCs w:val="28"/>
                 </w:rPr>
                 <w:t xml:space="preserve">4/4 ca, 8/8 lượt đạt (bản 1.3.3); 4/4 lượt đạt (bản 1.3.4); 6/8 lượt đạt (bản 1.3.5; 2 lượt ca 01 bị chấm trượt do tiêu chí lấy mã đơn vị đoán làm đáp án, đã sửa tiêu chí, chạy lại ca 01: 2/2 lượt đạt)</w:t>
+              </w:r>
+            </w:ins>
+          </w:p>
+        </w:tc>
+      </w:tr>
+      <w:tr>
+        <w:trPr>
+          <w:jc w:val="center"/>
+          <w:ins w:id="1049" w:author="Cập nhật 28 - 29/9, bản 1.3.12 (Claude)" w:date="2026-09-29T08:21:37Z"/>
+        </w:trPr>
+        <w:tc>
+          <w:tcPr>
+            <w:tcW w:w="704" w:type="dxa"/>
+            <w:vAlign w:val="center"/>
+          </w:tcPr>
+          <w:p>
+            <w:pPr>
+              <w:widowControl w:val="0"/>
+              <w:jc w:val="center"/>
+              <w:rPr>
+                <w:ins w:id="1051" w:author="Cập nhật 28 - 29/9, bản 1.3.12 (Claude)" w:date="2026-09-29T08:21:37Z"/>
+                <w:ins w:id="1042" w:author="Cập nhật 28 - 29/9, bản 1.3.12 (Claude)" w:date="2026-09-29T08:21:37Z"/>
+                <w:rFonts w:asciiTheme="majorHAnsi" w:hAnsiTheme="majorHAnsi" w:cstheme="majorHAnsi"/>
+                <w:sz w:val="28"/>
+                <w:szCs w:val="28"/>
+              </w:rPr>
+            </w:pPr>
+            <w:ins w:id="1050" w:author="Cập nhật 28 - 29/9, bản 1.3.12 (Claude)" w:date="2026-09-29T08:21:37Z">
+              <w:r>
+                <w:rPr>
+                  <w:rFonts w:asciiTheme="majorHAnsi" w:hAnsiTheme="majorHAnsi" w:cstheme="majorHAnsi"/>
+                  <w:sz w:val="28"/>
+                  <w:szCs w:val="28"/>
+                </w:rPr>
+                <w:t xml:space="preserve">12</w:t>
+              </w:r>
+            </w:ins>
+          </w:p>
+        </w:tc>
+        <w:tc>
+          <w:tcPr>
+            <w:tcW w:w="3600" w:type="dxa"/>
+            <w:vAlign w:val="center"/>
+          </w:tcPr>
+          <w:p>
+            <w:pPr>
+              <w:widowControl w:val="0"/>
+              <w:jc w:val="both"/>
+              <w:rPr>
+                <w:ins w:id="1053" w:author="Cập nhật 28 - 29/9, bản 1.3.12 (Claude)" w:date="2026-09-29T08:21:37Z"/>
+                <w:ins w:id="1044" w:author="Cập nhật 28 - 29/9, bản 1.3.12 (Claude)" w:date="2026-09-29T08:21:37Z"/>
+                <w:rFonts w:asciiTheme="majorHAnsi" w:hAnsiTheme="majorHAnsi" w:cstheme="majorHAnsi"/>
+                <w:sz w:val="28"/>
+                <w:szCs w:val="28"/>
+              </w:rPr>
+            </w:pPr>
+            <w:ins w:id="1052" w:author="Cập nhật 28 - 29/9, bản 1.3.12 (Claude)" w:date="2026-09-29T08:21:37Z">
+              <w:r>
+                <w:rPr>
+                  <w:rFonts w:asciiTheme="majorHAnsi" w:hAnsiTheme="majorHAnsi" w:cstheme="majorHAnsi"/>
+                  <w:sz w:val="28"/>
+                  <w:szCs w:val="28"/>
+                </w:rPr>
+                <w:t xml:space="preserve">Dựng báo cáo tháng 9 (Word, phụ lục KPI, kế hoạch tháng 10, ghi chú đối soát) bằng plugin 1.3.6, chạy độc lập như tài khoản thành viên (thư mục ngoài dự án, câu lệnh mẫu mới)</w:t>
+              </w:r>
+            </w:ins>
+          </w:p>
+        </w:tc>
+        <w:tc>
+          <w:tcPr>
+            <w:tcW w:w="3600" w:type="dxa"/>
+            <w:vAlign w:val="center"/>
+          </w:tcPr>
+          <w:p>
+            <w:pPr>
+              <w:widowControl w:val="0"/>
+              <w:jc w:val="both"/>
+              <w:rPr>
+                <w:ins w:id="1055" w:author="Cập nhật 28 - 29/9, bản 1.3.12 (Claude)" w:date="2026-09-29T08:21:37Z"/>
+                <w:ins w:id="1046" w:author="Cập nhật 28 - 29/9, bản 1.3.12 (Claude)" w:date="2026-09-29T08:21:37Z"/>
+                <w:rFonts w:asciiTheme="majorHAnsi" w:hAnsiTheme="majorHAnsi" w:cstheme="majorHAnsi"/>
+                <w:sz w:val="28"/>
+                <w:szCs w:val="28"/>
+              </w:rPr>
+            </w:pPr>
+            <w:ins w:id="1054" w:author="Cập nhật 28 - 29/9, bản 1.3.12 (Claude)" w:date="2026-09-29T08:21:37Z">
+              <w:r>
+                <w:rPr>
+                  <w:rFonts w:asciiTheme="majorHAnsi" w:hAnsiTheme="majorHAnsi" w:cstheme="majorHAnsi"/>
+                  <w:sz w:val="28"/>
+                  <w:szCs w:val="28"/>
+                </w:rPr>
+                <w:t xml:space="preserve">Bản 1.3.6; ngày 28/9/2026; đối chiếu bản dựng ngày 21/9/2026</w:t>
+              </w:r>
+            </w:ins>
+          </w:p>
+        </w:tc>
+        <w:tc>
+          <w:tcPr>
+            <w:tcW w:w="1163" w:type="dxa"/>
+            <w:vAlign w:val="center"/>
+          </w:tcPr>
+          <w:p>
+            <w:pPr>
+              <w:widowControl w:val="0"/>
+              <w:jc w:val="center"/>
+              <w:rPr>
+                <w:ins w:id="1057" w:author="Cập nhật 28 - 29/9, bản 1.3.12 (Claude)" w:date="2026-09-29T08:21:37Z"/>
+                <w:ins w:id="1048" w:author="Cập nhật 28 - 29/9, bản 1.3.12 (Claude)" w:date="2026-09-29T08:21:37Z"/>
+                <w:rFonts w:asciiTheme="majorHAnsi" w:hAnsiTheme="majorHAnsi" w:cstheme="majorHAnsi"/>
+                <w:sz w:val="28"/>
+                <w:szCs w:val="28"/>
+              </w:rPr>
+            </w:pPr>
+            <w:ins w:id="1056" w:author="Cập nhật 28 - 29/9, bản 1.3.12 (Claude)" w:date="2026-09-29T08:21:37Z">
+              <w:r>
+                <w:rPr>
+                  <w:rFonts w:asciiTheme="majorHAnsi" w:hAnsiTheme="majorHAnsi" w:cstheme="majorHAnsi"/>
+                  <w:sz w:val="28"/>
+                  <w:szCs w:val="28"/>
+                </w:rPr>
+                <w:t xml:space="preserve">chạy độc lập như tài khoản thành viên: báo cáo Word 8.720 chữ (bản ngày 21/9: 5.916 chữ), phụ lục 261 công thức KPI, có kế hoạch tháng 10, 14 chỗ ghi cần bổ sung đều là chi tiết không có nguồn, 0 lỗi thể thức Mức 1 - 2; lỗi phát hiện thêm (số hiệu văn bản gốc sai dạng, tiêu đề phụ lục còn tháng 8) đã sửa ở bản 1.3.7</w:t>
+              </w:r>
+            </w:ins>
+          </w:p>
+        </w:tc>
+      </w:tr>
+      <w:tr>
+        <w:trPr>
+          <w:jc w:val="center"/>
+          <w:ins w:id="1058" w:author="Cập nhật 28 - 29/9, bản 1.3.12 (Claude)" w:date="2026-09-29T08:21:37Z"/>
+        </w:trPr>
+        <w:tc>
+          <w:tcPr>
+            <w:tcW w:w="704" w:type="dxa"/>
+            <w:vAlign w:val="center"/>
+          </w:tcPr>
+          <w:p>
+            <w:pPr>
+              <w:widowControl w:val="0"/>
+              <w:jc w:val="center"/>
+              <w:rPr>
+                <w:ins w:id="1060" w:author="Cập nhật 28 - 29/9, bản 1.3.12 (Claude)" w:date="2026-09-29T08:21:37Z"/>
+                <w:ins w:id="1051" w:author="Cập nhật 28 - 29/9, bản 1.3.12 (Claude)" w:date="2026-09-29T08:21:37Z"/>
+                <w:ins w:id="1042" w:author="Cập nhật 28 - 29/9, bản 1.3.12 (Claude)" w:date="2026-09-29T08:21:37Z"/>
+                <w:rFonts w:asciiTheme="majorHAnsi" w:hAnsiTheme="majorHAnsi" w:cstheme="majorHAnsi"/>
+                <w:sz w:val="28"/>
+                <w:szCs w:val="28"/>
+              </w:rPr>
+            </w:pPr>
+            <w:ins w:id="1059" w:author="Cập nhật 28 - 29/9, bản 1.3.12 (Claude)" w:date="2026-09-29T08:21:37Z">
+              <w:r>
+                <w:rPr>
+                  <w:rFonts w:asciiTheme="majorHAnsi" w:hAnsiTheme="majorHAnsi" w:cstheme="majorHAnsi"/>
+                  <w:sz w:val="28"/>
+                  <w:szCs w:val="28"/>
+                </w:rPr>
+                <w:t xml:space="preserve">13</w:t>
+              </w:r>
+            </w:ins>
+          </w:p>
+        </w:tc>
+        <w:tc>
+          <w:tcPr>
+            <w:tcW w:w="3600" w:type="dxa"/>
+            <w:vAlign w:val="center"/>
+          </w:tcPr>
+          <w:p>
+            <w:pPr>
+              <w:widowControl w:val="0"/>
+              <w:jc w:val="both"/>
+              <w:rPr>
+                <w:ins w:id="1062" w:author="Cập nhật 28 - 29/9, bản 1.3.12 (Claude)" w:date="2026-09-29T08:21:37Z"/>
+                <w:ins w:id="1053" w:author="Cập nhật 28 - 29/9, bản 1.3.12 (Claude)" w:date="2026-09-29T08:21:37Z"/>
+                <w:ins w:id="1044" w:author="Cập nhật 28 - 29/9, bản 1.3.12 (Claude)" w:date="2026-09-29T08:21:37Z"/>
+                <w:rFonts w:asciiTheme="majorHAnsi" w:hAnsiTheme="majorHAnsi" w:cstheme="majorHAnsi"/>
+                <w:sz w:val="28"/>
+                <w:szCs w:val="28"/>
+              </w:rPr>
+            </w:pPr>
+            <w:ins w:id="1061" w:author="Cập nhật 28 - 29/9, bản 1.3.12 (Claude)" w:date="2026-09-29T08:21:37Z">
+              <w:r>
+                <w:rPr>
+                  <w:rFonts w:asciiTheme="majorHAnsi" w:hAnsiTheme="majorHAnsi" w:cstheme="majorHAnsi"/>
+                  <w:sz w:val="28"/>
+                  <w:szCs w:val="28"/>
+                </w:rPr>
+                <w:t xml:space="preserve">Đo thể thức văn bản: công cụ đo ánh xạ Checklist 01, 05, 08 của bộ quy tắc KTC-Ra-Soat-897 (bảng tiêu đề, đường kẻ, cỡ và kiểu chữ từng thành phần theo Thông báo số 597/TB-CĐKT, số trang, người ký); ca thử ngược từng lỗi</w:t>
+              </w:r>
+            </w:ins>
+          </w:p>
+        </w:tc>
+        <w:tc>
+          <w:tcPr>
+            <w:tcW w:w="3600" w:type="dxa"/>
+            <w:vAlign w:val="center"/>
+          </w:tcPr>
+          <w:p>
+            <w:pPr>
+              <w:widowControl w:val="0"/>
+              <w:jc w:val="both"/>
+              <w:rPr>
+                <w:ins w:id="1064" w:author="Cập nhật 28 - 29/9, bản 1.3.12 (Claude)" w:date="2026-09-29T08:21:37Z"/>
+                <w:ins w:id="1055" w:author="Cập nhật 28 - 29/9, bản 1.3.12 (Claude)" w:date="2026-09-29T08:21:37Z"/>
+                <w:ins w:id="1046" w:author="Cập nhật 28 - 29/9, bản 1.3.12 (Claude)" w:date="2026-09-29T08:21:37Z"/>
+                <w:rFonts w:asciiTheme="majorHAnsi" w:hAnsiTheme="majorHAnsi" w:cstheme="majorHAnsi"/>
+                <w:sz w:val="28"/>
+                <w:szCs w:val="28"/>
+              </w:rPr>
+            </w:pPr>
+            <w:ins w:id="1063" w:author="Cập nhật 28 - 29/9, bản 1.3.12 (Claude)" w:date="2026-09-29T08:21:37Z">
+              <w:r>
+                <w:rPr>
+                  <w:rFonts w:asciiTheme="majorHAnsi" w:hAnsiTheme="majorHAnsi" w:cstheme="majorHAnsi"/>
+                  <w:sz w:val="28"/>
+                  <w:szCs w:val="28"/>
+                </w:rPr>
+                <w:t xml:space="preserve">Bản 1.3.10 - 1.3.12; ngày 28 - 29/9/2026; 434 văn bản đã ban hành trong kho, 16 mẫu 03-Templates(1)</w:t>
+              </w:r>
+            </w:ins>
+          </w:p>
+        </w:tc>
+        <w:tc>
+          <w:tcPr>
+            <w:tcW w:w="1163" w:type="dxa"/>
+            <w:vAlign w:val="center"/>
+          </w:tcPr>
+          <w:p>
+            <w:pPr>
+              <w:widowControl w:val="0"/>
+              <w:jc w:val="center"/>
+              <w:rPr>
+                <w:ins w:id="1066" w:author="Cập nhật 28 - 29/9, bản 1.3.12 (Claude)" w:date="2026-09-29T08:21:37Z"/>
+                <w:ins w:id="1057" w:author="Cập nhật 28 - 29/9, bản 1.3.12 (Claude)" w:date="2026-09-29T08:21:37Z"/>
+                <w:ins w:id="1048" w:author="Cập nhật 28 - 29/9, bản 1.3.12 (Claude)" w:date="2026-09-29T08:21:37Z"/>
+                <w:rFonts w:asciiTheme="majorHAnsi" w:hAnsiTheme="majorHAnsi" w:cstheme="majorHAnsi"/>
+                <w:sz w:val="28"/>
+                <w:szCs w:val="28"/>
+              </w:rPr>
+            </w:pPr>
+            <w:ins w:id="1065" w:author="Cập nhật 28 - 29/9, bản 1.3.12 (Claude)" w:date="2026-09-29T08:21:37Z">
+              <w:r>
+                <w:rPr>
+                  <w:rFonts w:asciiTheme="majorHAnsi" w:hAnsiTheme="majorHAnsi" w:cstheme="majorHAnsi"/>
+                  <w:sz w:val="28"/>
+                  <w:szCs w:val="28"/>
+                </w:rPr>
+                <w:t xml:space="preserve">Bắt đủ 7 loại lỗi của thông báo dựng tay ngày 28/9/2026 (trước đó công cụ báo đạt); phát hiện lỗi thật của 5 mẫu trống (01, 02A, 03A, 06D, 07), ghi để người có thẩm quyền sửa kho; thông báo ráp lại vào mẫu 03A: 0 lỗi, đã xem trang bằng Word</w:t>
               </w:r>
             </w:ins>
           </w:p>
@@ -4721,7 +4969,7 @@
           <w:shd w:val="clear" w:color="auto" w:fill="FFFFFF"/>
         </w:rPr>
       </w:pPr>
-      <w:del w:id="1049" w:author="Cập nhật 28/9, bản 1.3.5 (Claude)" w:date="2026-09-28T14:38:48Z">
+      <w:del w:id="1067" w:author="Cập nhật 28 - 29/9, bản 1.3.12 (Claude)" w:date="2026-09-29T08:21:37Z">
         <w:r>
           <w:rPr>
             <w:rFonts w:asciiTheme="majorHAnsi" w:hAnsiTheme="majorHAnsi" w:cstheme="majorHAnsi"/>
@@ -4732,7 +4980,7 @@
           <w:delText xml:space="preserve">- Hai thang điểm quy đổi khối lượng công việc chưa có văn bản phân định; một số nội dung đánh giá KPI chờ ý kiến Phòng TCCB&amp;CTHSSV;</w:delText>
         </w:r>
       </w:del>
-      <w:ins w:id="1050" w:author="Cập nhật 28/9, bản 1.3.5 (Claude)" w:date="2026-09-28T14:38:48Z">
+      <w:ins w:id="1068" w:author="Cập nhật 28 - 29/9, bản 1.3.12 (Claude)" w:date="2026-09-29T08:21:37Z">
         <w:r>
           <w:rPr>
             <w:rFonts w:asciiTheme="majorHAnsi" w:hAnsiTheme="majorHAnsi" w:cstheme="majorHAnsi"/>
@@ -5083,7 +5331,7 @@
                 <w:szCs w:val="28"/>
               </w:rPr>
             </w:pPr>
-            <w:del w:id="1051" w:author="Cập nhật 28/9, bản 1.3.5 (Claude)" w:date="2026-09-28T14:38:48Z">
+            <w:del w:id="1069" w:author="Cập nhật 28 - 29/9, bản 1.3.12 (Claude)" w:date="2026-09-29T08:21:37Z">
               <w:r>
                 <w:rPr>
                   <w:rFonts w:asciiTheme="majorHAnsi" w:hAnsiTheme="majorHAnsi" w:cstheme="majorHAnsi"/>
@@ -5095,7 +5343,7 @@
                 <w:delText>Trạng thái ngày 27/9/2026</w:delText>
               </w:r>
             </w:del>
-            <w:ins w:id="1052" w:author="Cập nhật 28/9, bản 1.3.5 (Claude)" w:date="2026-09-28T14:38:48Z">
+            <w:ins w:id="1070" w:author="Cập nhật 28 - 29/9, bản 1.3.12 (Claude)" w:date="2026-09-29T08:21:37Z">
               <w:r>
                 <w:rPr>
                   <w:rFonts w:asciiTheme="majorHAnsi" w:hAnsiTheme="majorHAnsi" w:cstheme="majorHAnsi"/>
@@ -5104,7 +5352,7 @@
                   <w:sz w:val="24"/>
                   <w:szCs w:val="24"/>
                 </w:rPr>
-                <w:t xml:space="preserve">Trạng thái ngày 28/9/2026</w:t>
+                <w:t xml:space="preserve">Trạng thái ngày 29/9/2026</w:t>
               </w:r>
             </w:ins>
           </w:p>
@@ -6063,7 +6311,7 @@
               </w:rPr>
               <w:t xml:space="preserve">nâng 1.2.1 lên 1.3.0, </w:t>
             </w:r>
-            <w:del w:id="1053" w:author="Cập nhật 28/9, bản 1.3.5 (Claude)" w:date="2026-09-28T14:38:48Z">
+            <w:del w:id="1071" w:author="Cập nhật 28 - 29/9, bản 1.3.12 (Claude)" w:date="2026-09-29T08:21:37Z">
               <w:r>
                 <w:rPr>
                   <w:rFonts w:asciiTheme="majorHAnsi" w:hAnsiTheme="majorHAnsi" w:cstheme="majorHAnsi"/>
@@ -6073,14 +6321,14 @@
                 <w:delText xml:space="preserve">ngày 27/9/2026 lên 1.3.1, 1.3.2,</w:delText>
               </w:r>
             </w:del>
-            <w:ins w:id="1054" w:author="Cập nhật 28/9, bản 1.3.5 (Claude)" w:date="2026-09-28T14:38:48Z">
+            <w:ins w:id="1072" w:author="Cập nhật 28 - 29/9, bản 1.3.12 (Claude)" w:date="2026-09-29T08:21:37Z">
               <w:r>
                 <w:rPr>
                   <w:rFonts w:asciiTheme="majorHAnsi" w:hAnsiTheme="majorHAnsi" w:cstheme="majorHAnsi"/>
                   <w:sz w:val="24"/>
                   <w:szCs w:val="24"/>
                 </w:rPr>
-                <w:t xml:space="preserve">ngày 27/9/2026 lên 1.3.1, 1.3.2, ngày 28/9/2026 lên 1.3.3 - 1.3.5,</w:t>
+                <w:t xml:space="preserve">ngày 27/9/2026 lên 1.3.1, 1.3.2, ngày 28 - 29/9/2026 lên 1.3.3 - 1.3.12,</w:t>
               </w:r>
             </w:ins>
             <w:r>
@@ -6818,7 +7066,7 @@
                 <w:szCs w:val="28"/>
               </w:rPr>
             </w:pPr>
-            <w:del w:id="1055" w:author="Cập nhật 28/9, bản 1.3.5 (Claude)" w:date="2026-09-28T14:38:48Z">
+            <w:del w:id="1073" w:author="Cập nhật 28 - 29/9, bản 1.3.12 (Claude)" w:date="2026-09-29T08:21:37Z">
               <w:r>
                 <w:rPr>
                   <w:rFonts w:asciiTheme="majorHAnsi" w:hAnsiTheme="majorHAnsi" w:cstheme="majorHAnsi"/>
@@ -6828,7 +7076,7 @@
                 <w:delText xml:space="preserve">Có số liệu vận hành của Phòng TH-HC&amp;QT (18 - 27/9/2026)</w:delText>
               </w:r>
             </w:del>
-            <w:ins w:id="1056" w:author="Cập nhật 28/9, bản 1.3.5 (Claude)" w:date="2026-09-28T14:38:48Z">
+            <w:ins w:id="1074" w:author="Cập nhật 28 - 29/9, bản 1.3.12 (Claude)" w:date="2026-09-29T08:21:37Z">
               <w:r>
                 <w:rPr>
                   <w:rFonts w:asciiTheme="majorHAnsi" w:hAnsiTheme="majorHAnsi" w:cstheme="majorHAnsi"/>
@@ -6982,7 +7230,7 @@
       <w:tr>
         <w:trPr>
           <w:jc w:val="center"/>
-          <w:ins w:id="1057" w:author="Cập nhật 28/9, bản 1.3.5 (Claude)" w:date="2026-09-28T14:38:48Z"/>
+          <w:ins w:id="1075" w:author="Cập nhật 28 - 29/9, bản 1.3.12 (Claude)" w:date="2026-09-29T08:21:37Z"/>
         </w:trPr>
         <w:tc>
           <w:tcPr>
@@ -6994,13 +7242,13 @@
               <w:widowControl w:val="0"/>
               <w:jc w:val="center"/>
               <w:rPr>
-                <w:ins w:id="1059" w:author="Cập nhật 28/9, bản 1.3.5 (Claude)" w:date="2026-09-28T14:38:48Z"/>
-                <w:rFonts w:asciiTheme="majorHAnsi" w:hAnsiTheme="majorHAnsi" w:cstheme="majorHAnsi"/>
-                <w:sz w:val="28"/>
-                <w:szCs w:val="28"/>
-              </w:rPr>
-            </w:pPr>
-            <w:ins w:id="1058" w:author="Cập nhật 28/9, bản 1.3.5 (Claude)" w:date="2026-09-28T14:38:48Z">
+                <w:ins w:id="1077" w:author="Cập nhật 28 - 29/9, bản 1.3.12 (Claude)" w:date="2026-09-29T08:21:37Z"/>
+                <w:rFonts w:asciiTheme="majorHAnsi" w:hAnsiTheme="majorHAnsi" w:cstheme="majorHAnsi"/>
+                <w:sz w:val="28"/>
+                <w:szCs w:val="28"/>
+              </w:rPr>
+            </w:pPr>
+            <w:ins w:id="1076" w:author="Cập nhật 28 - 29/9, bản 1.3.12 (Claude)" w:date="2026-09-29T08:21:37Z">
               <w:r>
                 <w:rPr>
                   <w:rFonts w:asciiTheme="majorHAnsi" w:hAnsiTheme="majorHAnsi" w:cstheme="majorHAnsi"/>
@@ -7022,13 +7270,13 @@
               <w:widowControl w:val="0"/>
               <w:jc w:val="both"/>
               <w:rPr>
-                <w:ins w:id="1061" w:author="Cập nhật 28/9, bản 1.3.5 (Claude)" w:date="2026-09-28T14:38:48Z"/>
-                <w:rFonts w:asciiTheme="majorHAnsi" w:hAnsiTheme="majorHAnsi" w:cstheme="majorHAnsi"/>
-                <w:sz w:val="28"/>
-                <w:szCs w:val="28"/>
-              </w:rPr>
-            </w:pPr>
-            <w:ins w:id="1060" w:author="Cập nhật 28/9, bản 1.3.5 (Claude)" w:date="2026-09-28T14:38:48Z">
+                <w:ins w:id="1079" w:author="Cập nhật 28 - 29/9, bản 1.3.12 (Claude)" w:date="2026-09-29T08:21:37Z"/>
+                <w:rFonts w:asciiTheme="majorHAnsi" w:hAnsiTheme="majorHAnsi" w:cstheme="majorHAnsi"/>
+                <w:sz w:val="28"/>
+                <w:szCs w:val="28"/>
+              </w:rPr>
+            </w:pPr>
+            <w:ins w:id="1078" w:author="Cập nhật 28 - 29/9, bản 1.3.12 (Claude)" w:date="2026-09-29T08:21:37Z">
               <w:r>
                 <w:rPr>
                   <w:rFonts w:asciiTheme="majorHAnsi" w:hAnsiTheme="majorHAnsi" w:cstheme="majorHAnsi"/>
@@ -7050,13 +7298,13 @@
               <w:widowControl w:val="0"/>
               <w:jc w:val="both"/>
               <w:rPr>
-                <w:ins w:id="1063" w:author="Cập nhật 28/9, bản 1.3.5 (Claude)" w:date="2026-09-28T14:38:48Z"/>
-                <w:rFonts w:asciiTheme="majorHAnsi" w:hAnsiTheme="majorHAnsi" w:cstheme="majorHAnsi"/>
-                <w:sz w:val="28"/>
-                <w:szCs w:val="28"/>
-              </w:rPr>
-            </w:pPr>
-            <w:ins w:id="1062" w:author="Cập nhật 28/9, bản 1.3.5 (Claude)" w:date="2026-09-28T14:38:48Z">
+                <w:ins w:id="1081" w:author="Cập nhật 28 - 29/9, bản 1.3.12 (Claude)" w:date="2026-09-29T08:21:37Z"/>
+                <w:rFonts w:asciiTheme="majorHAnsi" w:hAnsiTheme="majorHAnsi" w:cstheme="majorHAnsi"/>
+                <w:sz w:val="28"/>
+                <w:szCs w:val="28"/>
+              </w:rPr>
+            </w:pPr>
+            <w:ins w:id="1080" w:author="Cập nhật 28 - 29/9, bản 1.3.12 (Claude)" w:date="2026-09-29T08:21:37Z">
               <w:r>
                 <w:rPr>
                   <w:rFonts w:asciiTheme="majorHAnsi" w:hAnsiTheme="majorHAnsi" w:cstheme="majorHAnsi"/>
@@ -7078,13 +7326,13 @@
               <w:widowControl w:val="0"/>
               <w:jc w:val="both"/>
               <w:rPr>
-                <w:ins w:id="1065" w:author="Cập nhật 28/9, bản 1.3.5 (Claude)" w:date="2026-09-28T14:38:48Z"/>
-                <w:rFonts w:asciiTheme="majorHAnsi" w:hAnsiTheme="majorHAnsi" w:cstheme="majorHAnsi"/>
-                <w:sz w:val="28"/>
-                <w:szCs w:val="28"/>
-              </w:rPr>
-            </w:pPr>
-            <w:ins w:id="1064" w:author="Cập nhật 28/9, bản 1.3.5 (Claude)" w:date="2026-09-28T14:38:48Z">
+                <w:ins w:id="1083" w:author="Cập nhật 28 - 29/9, bản 1.3.12 (Claude)" w:date="2026-09-29T08:21:37Z"/>
+                <w:rFonts w:asciiTheme="majorHAnsi" w:hAnsiTheme="majorHAnsi" w:cstheme="majorHAnsi"/>
+                <w:sz w:val="28"/>
+                <w:szCs w:val="28"/>
+              </w:rPr>
+            </w:pPr>
+            <w:ins w:id="1082" w:author="Cập nhật 28 - 29/9, bản 1.3.12 (Claude)" w:date="2026-09-29T08:21:37Z">
               <w:r>
                 <w:rPr>
                   <w:rFonts w:asciiTheme="majorHAnsi" w:hAnsiTheme="majorHAnsi" w:cstheme="majorHAnsi"/>
@@ -7100,7 +7348,7 @@
       <w:tr>
         <w:trPr>
           <w:jc w:val="center"/>
-          <w:ins w:id="1066" w:author="Cập nhật 28/9, bản 1.3.5 (Claude)" w:date="2026-09-28T14:38:48Z"/>
+          <w:ins w:id="1084" w:author="Cập nhật 28 - 29/9, bản 1.3.12 (Claude)" w:date="2026-09-29T08:21:37Z"/>
         </w:trPr>
         <w:tc>
           <w:tcPr>
@@ -7112,14 +7360,14 @@
               <w:widowControl w:val="0"/>
               <w:jc w:val="center"/>
               <w:rPr>
-                <w:ins w:id="1068" w:author="Cập nhật 28/9, bản 1.3.5 (Claude)" w:date="2026-09-28T14:38:48Z"/>
-                <w:ins w:id="1059" w:author="Cập nhật 28/9, bản 1.3.5 (Claude)" w:date="2026-09-28T14:38:48Z"/>
-                <w:rFonts w:asciiTheme="majorHAnsi" w:hAnsiTheme="majorHAnsi" w:cstheme="majorHAnsi"/>
-                <w:sz w:val="28"/>
-                <w:szCs w:val="28"/>
-              </w:rPr>
-            </w:pPr>
-            <w:ins w:id="1067" w:author="Cập nhật 28/9, bản 1.3.5 (Claude)" w:date="2026-09-28T14:38:48Z">
+                <w:ins w:id="1086" w:author="Cập nhật 28 - 29/9, bản 1.3.12 (Claude)" w:date="2026-09-29T08:21:37Z"/>
+                <w:ins w:id="1077" w:author="Cập nhật 28 - 29/9, bản 1.3.12 (Claude)" w:date="2026-09-29T08:21:37Z"/>
+                <w:rFonts w:asciiTheme="majorHAnsi" w:hAnsiTheme="majorHAnsi" w:cstheme="majorHAnsi"/>
+                <w:sz w:val="28"/>
+                <w:szCs w:val="28"/>
+              </w:rPr>
+            </w:pPr>
+            <w:ins w:id="1085" w:author="Cập nhật 28 - 29/9, bản 1.3.12 (Claude)" w:date="2026-09-29T08:21:37Z">
               <w:r>
                 <w:rPr>
                   <w:rFonts w:asciiTheme="majorHAnsi" w:hAnsiTheme="majorHAnsi" w:cstheme="majorHAnsi"/>
@@ -7141,14 +7389,14 @@
               <w:widowControl w:val="0"/>
               <w:jc w:val="both"/>
               <w:rPr>
-                <w:ins w:id="1070" w:author="Cập nhật 28/9, bản 1.3.5 (Claude)" w:date="2026-09-28T14:38:48Z"/>
-                <w:ins w:id="1061" w:author="Cập nhật 28/9, bản 1.3.5 (Claude)" w:date="2026-09-28T14:38:48Z"/>
-                <w:rFonts w:asciiTheme="majorHAnsi" w:hAnsiTheme="majorHAnsi" w:cstheme="majorHAnsi"/>
-                <w:sz w:val="28"/>
-                <w:szCs w:val="28"/>
-              </w:rPr>
-            </w:pPr>
-            <w:ins w:id="1069" w:author="Cập nhật 28/9, bản 1.3.5 (Claude)" w:date="2026-09-28T14:38:48Z">
+                <w:ins w:id="1088" w:author="Cập nhật 28 - 29/9, bản 1.3.12 (Claude)" w:date="2026-09-29T08:21:37Z"/>
+                <w:ins w:id="1079" w:author="Cập nhật 28 - 29/9, bản 1.3.12 (Claude)" w:date="2026-09-29T08:21:37Z"/>
+                <w:rFonts w:asciiTheme="majorHAnsi" w:hAnsiTheme="majorHAnsi" w:cstheme="majorHAnsi"/>
+                <w:sz w:val="28"/>
+                <w:szCs w:val="28"/>
+              </w:rPr>
+            </w:pPr>
+            <w:ins w:id="1087" w:author="Cập nhật 28 - 29/9, bản 1.3.12 (Claude)" w:date="2026-09-29T08:21:37Z">
               <w:r>
                 <w:rPr>
                   <w:rFonts w:asciiTheme="majorHAnsi" w:hAnsiTheme="majorHAnsi" w:cstheme="majorHAnsi"/>
@@ -7170,14 +7418,14 @@
               <w:widowControl w:val="0"/>
               <w:jc w:val="both"/>
               <w:rPr>
-                <w:ins w:id="1072" w:author="Cập nhật 28/9, bản 1.3.5 (Claude)" w:date="2026-09-28T14:38:48Z"/>
-                <w:ins w:id="1063" w:author="Cập nhật 28/9, bản 1.3.5 (Claude)" w:date="2026-09-28T14:38:48Z"/>
-                <w:rFonts w:asciiTheme="majorHAnsi" w:hAnsiTheme="majorHAnsi" w:cstheme="majorHAnsi"/>
-                <w:sz w:val="28"/>
-                <w:szCs w:val="28"/>
-              </w:rPr>
-            </w:pPr>
-            <w:ins w:id="1071" w:author="Cập nhật 28/9, bản 1.3.5 (Claude)" w:date="2026-09-28T14:38:48Z">
+                <w:ins w:id="1090" w:author="Cập nhật 28 - 29/9, bản 1.3.12 (Claude)" w:date="2026-09-29T08:21:37Z"/>
+                <w:ins w:id="1081" w:author="Cập nhật 28 - 29/9, bản 1.3.12 (Claude)" w:date="2026-09-29T08:21:37Z"/>
+                <w:rFonts w:asciiTheme="majorHAnsi" w:hAnsiTheme="majorHAnsi" w:cstheme="majorHAnsi"/>
+                <w:sz w:val="28"/>
+                <w:szCs w:val="28"/>
+              </w:rPr>
+            </w:pPr>
+            <w:ins w:id="1089" w:author="Cập nhật 28 - 29/9, bản 1.3.12 (Claude)" w:date="2026-09-29T08:21:37Z">
               <w:r>
                 <w:rPr>
                   <w:rFonts w:asciiTheme="majorHAnsi" w:hAnsiTheme="majorHAnsi" w:cstheme="majorHAnsi"/>
@@ -7199,14 +7447,14 @@
               <w:widowControl w:val="0"/>
               <w:jc w:val="both"/>
               <w:rPr>
-                <w:ins w:id="1074" w:author="Cập nhật 28/9, bản 1.3.5 (Claude)" w:date="2026-09-28T14:38:48Z"/>
-                <w:ins w:id="1065" w:author="Cập nhật 28/9, bản 1.3.5 (Claude)" w:date="2026-09-28T14:38:48Z"/>
-                <w:rFonts w:asciiTheme="majorHAnsi" w:hAnsiTheme="majorHAnsi" w:cstheme="majorHAnsi"/>
-                <w:sz w:val="28"/>
-                <w:szCs w:val="28"/>
-              </w:rPr>
-            </w:pPr>
-            <w:ins w:id="1073" w:author="Cập nhật 28/9, bản 1.3.5 (Claude)" w:date="2026-09-28T14:38:48Z">
+                <w:ins w:id="1092" w:author="Cập nhật 28 - 29/9, bản 1.3.12 (Claude)" w:date="2026-09-29T08:21:37Z"/>
+                <w:ins w:id="1083" w:author="Cập nhật 28 - 29/9, bản 1.3.12 (Claude)" w:date="2026-09-29T08:21:37Z"/>
+                <w:rFonts w:asciiTheme="majorHAnsi" w:hAnsiTheme="majorHAnsi" w:cstheme="majorHAnsi"/>
+                <w:sz w:val="28"/>
+                <w:szCs w:val="28"/>
+              </w:rPr>
+            </w:pPr>
+            <w:ins w:id="1091" w:author="Cập nhật 28 - 29/9, bản 1.3.12 (Claude)" w:date="2026-09-29T08:21:37Z">
               <w:r>
                 <w:rPr>
                   <w:rFonts w:asciiTheme="majorHAnsi" w:hAnsiTheme="majorHAnsi" w:cstheme="majorHAnsi"/>
@@ -7214,6 +7462,396 @@
                   <w:szCs w:val="24"/>
                 </w:rPr>
                 <w:t xml:space="preserve">ktc_guard.py; test_plugin_131</w:t>
+              </w:r>
+            </w:ins>
+          </w:p>
+        </w:tc>
+      </w:tr>
+      <w:tr>
+        <w:trPr>
+          <w:jc w:val="center"/>
+          <w:ins w:id="1093" w:author="Cập nhật 28 - 29/9, bản 1.3.12 (Claude)" w:date="2026-09-29T08:21:37Z"/>
+        </w:trPr>
+        <w:tc>
+          <w:tcPr>
+            <w:tcW w:w="567" w:type="dxa"/>
+            <w:vAlign w:val="center"/>
+          </w:tcPr>
+          <w:p>
+            <w:pPr>
+              <w:widowControl w:val="0"/>
+              <w:jc w:val="center"/>
+              <w:rPr>
+                <w:ins w:id="1095" w:author="Cập nhật 28 - 29/9, bản 1.3.12 (Claude)" w:date="2026-09-29T08:21:37Z"/>
+                <w:ins w:id="1086" w:author="Cập nhật 28 - 29/9, bản 1.3.12 (Claude)" w:date="2026-09-29T08:21:37Z"/>
+                <w:ins w:id="1077" w:author="Cập nhật 28 - 29/9, bản 1.3.12 (Claude)" w:date="2026-09-29T08:21:37Z"/>
+                <w:rFonts w:asciiTheme="majorHAnsi" w:hAnsiTheme="majorHAnsi" w:cstheme="majorHAnsi"/>
+                <w:sz w:val="28"/>
+                <w:szCs w:val="28"/>
+              </w:rPr>
+            </w:pPr>
+            <w:ins w:id="1094" w:author="Cập nhật 28 - 29/9, bản 1.3.12 (Claude)" w:date="2026-09-29T08:21:37Z">
+              <w:r>
+                <w:rPr>
+                  <w:rFonts w:asciiTheme="majorHAnsi" w:hAnsiTheme="majorHAnsi" w:cstheme="majorHAnsi"/>
+                  <w:sz w:val="24"/>
+                  <w:szCs w:val="24"/>
+                </w:rPr>
+                <w:t xml:space="preserve">20</w:t>
+              </w:r>
+            </w:ins>
+          </w:p>
+        </w:tc>
+        <w:tc>
+          <w:tcPr>
+            <w:tcW w:w="3000" w:type="dxa"/>
+            <w:vAlign w:val="center"/>
+          </w:tcPr>
+          <w:p>
+            <w:pPr>
+              <w:widowControl w:val="0"/>
+              <w:jc w:val="both"/>
+              <w:rPr>
+                <w:ins w:id="1097" w:author="Cập nhật 28 - 29/9, bản 1.3.12 (Claude)" w:date="2026-09-29T08:21:37Z"/>
+                <w:ins w:id="1088" w:author="Cập nhật 28 - 29/9, bản 1.3.12 (Claude)" w:date="2026-09-29T08:21:37Z"/>
+                <w:ins w:id="1079" w:author="Cập nhật 28 - 29/9, bản 1.3.12 (Claude)" w:date="2026-09-29T08:21:37Z"/>
+                <w:rFonts w:asciiTheme="majorHAnsi" w:hAnsiTheme="majorHAnsi" w:cstheme="majorHAnsi"/>
+                <w:sz w:val="28"/>
+                <w:szCs w:val="28"/>
+              </w:rPr>
+            </w:pPr>
+            <w:ins w:id="1096" w:author="Cập nhật 28 - 29/9, bản 1.3.12 (Claude)" w:date="2026-09-29T08:21:37Z">
+              <w:r>
+                <w:rPr>
+                  <w:rFonts w:asciiTheme="majorHAnsi" w:hAnsiTheme="majorHAnsi" w:cstheme="majorHAnsi"/>
+                  <w:sz w:val="24"/>
+                  <w:szCs w:val="24"/>
+                </w:rPr>
+                <w:t xml:space="preserve">Chạy thử ngày 28/9/2026 trên Cowork, Claude Code: báo cáo tháng 9 kém bản ngày 21/9 (dựng từ mẫu trắng, còn nhiều chỗ đánh dấu cần bổ sung, thiếu kế hoạch tháng 10)</w:t>
+              </w:r>
+            </w:ins>
+          </w:p>
+        </w:tc>
+        <w:tc>
+          <w:tcPr>
+            <w:tcW w:w="3000" w:type="dxa"/>
+            <w:vAlign w:val="center"/>
+          </w:tcPr>
+          <w:p>
+            <w:pPr>
+              <w:widowControl w:val="0"/>
+              <w:jc w:val="both"/>
+              <w:rPr>
+                <w:ins w:id="1099" w:author="Cập nhật 28 - 29/9, bản 1.3.12 (Claude)" w:date="2026-09-29T08:21:37Z"/>
+                <w:ins w:id="1090" w:author="Cập nhật 28 - 29/9, bản 1.3.12 (Claude)" w:date="2026-09-29T08:21:37Z"/>
+                <w:ins w:id="1081" w:author="Cập nhật 28 - 29/9, bản 1.3.12 (Claude)" w:date="2026-09-29T08:21:37Z"/>
+                <w:rFonts w:asciiTheme="majorHAnsi" w:hAnsiTheme="majorHAnsi" w:cstheme="majorHAnsi"/>
+                <w:sz w:val="28"/>
+                <w:szCs w:val="28"/>
+              </w:rPr>
+            </w:pPr>
+            <w:ins w:id="1098" w:author="Cập nhật 28 - 29/9, bản 1.3.12 (Claude)" w:date="2026-09-29T08:21:37Z">
+              <w:r>
+                <w:rPr>
+                  <w:rFonts w:asciiTheme="majorHAnsi" w:hAnsiTheme="majorHAnsi" w:cstheme="majorHAnsi"/>
+                  <w:sz w:val="24"/>
+                  <w:szCs w:val="24"/>
+                </w:rPr>
+                <w:t xml:space="preserve">Đã khắc phục trong bản 1.3.6: dựng từ bản đã ban hành bằng công cụ trong plugin; tổng hợp từ nguồn khác có ghi nguồn khi đầu mối chưa nộp; chạy độc lập như tài khoản thành viên: báo cáo Word 8.720 chữ (bản ngày 21/9: 5.916 chữ), phụ lục 261 công thức KPI, có kế hoạch tháng 10, 14 chỗ ghi cần bổ sung đều là chi tiết không có nguồn, 0 lỗi thể thức Mức 1 - 2; lỗi phát hiện thêm (số hiệu văn bản gốc sai dạng, tiêu đề phụ lục còn tháng 8) đã sửa ở bản 1.3.7</w:t>
+              </w:r>
+            </w:ins>
+          </w:p>
+        </w:tc>
+        <w:tc>
+          <w:tcPr>
+            <w:tcW w:w="2500" w:type="dxa"/>
+            <w:vAlign w:val="center"/>
+          </w:tcPr>
+          <w:p>
+            <w:pPr>
+              <w:widowControl w:val="0"/>
+              <w:jc w:val="both"/>
+              <w:rPr>
+                <w:ins w:id="1101" w:author="Cập nhật 28 - 29/9, bản 1.3.12 (Claude)" w:date="2026-09-29T08:21:37Z"/>
+                <w:ins w:id="1092" w:author="Cập nhật 28 - 29/9, bản 1.3.12 (Claude)" w:date="2026-09-29T08:21:37Z"/>
+                <w:ins w:id="1083" w:author="Cập nhật 28 - 29/9, bản 1.3.12 (Claude)" w:date="2026-09-29T08:21:37Z"/>
+                <w:rFonts w:asciiTheme="majorHAnsi" w:hAnsiTheme="majorHAnsi" w:cstheme="majorHAnsi"/>
+                <w:sz w:val="28"/>
+                <w:szCs w:val="28"/>
+              </w:rPr>
+            </w:pPr>
+            <w:ins w:id="1100" w:author="Cập nhật 28 - 29/9, bản 1.3.12 (Claude)" w:date="2026-09-29T08:21:37Z">
+              <w:r>
+                <w:rPr>
+                  <w:rFonts w:asciiTheme="majorHAnsi" w:hAnsiTheme="majorHAnsi" w:cstheme="majorHAnsi"/>
+                  <w:sz w:val="24"/>
+                  <w:szCs w:val="24"/>
+                </w:rPr>
+                <w:t xml:space="preserve">bc_thang.py; test_bc_thang; DL-20260928-004</w:t>
+              </w:r>
+            </w:ins>
+          </w:p>
+        </w:tc>
+      </w:tr>
+      <w:tr>
+        <w:trPr>
+          <w:jc w:val="center"/>
+          <w:ins w:id="1102" w:author="Cập nhật 28 - 29/9, bản 1.3.12 (Claude)" w:date="2026-09-29T08:21:37Z"/>
+        </w:trPr>
+        <w:tc>
+          <w:tcPr>
+            <w:tcW w:w="567" w:type="dxa"/>
+            <w:vAlign w:val="center"/>
+          </w:tcPr>
+          <w:p>
+            <w:pPr>
+              <w:widowControl w:val="0"/>
+              <w:jc w:val="center"/>
+              <w:rPr>
+                <w:ins w:id="1104" w:author="Cập nhật 28 - 29/9, bản 1.3.12 (Claude)" w:date="2026-09-29T08:21:37Z"/>
+                <w:ins w:id="1095" w:author="Cập nhật 28 - 29/9, bản 1.3.12 (Claude)" w:date="2026-09-29T08:21:37Z"/>
+                <w:ins w:id="1086" w:author="Cập nhật 28 - 29/9, bản 1.3.12 (Claude)" w:date="2026-09-29T08:21:37Z"/>
+                <w:ins w:id="1077" w:author="Cập nhật 28 - 29/9, bản 1.3.12 (Claude)" w:date="2026-09-29T08:21:37Z"/>
+                <w:rFonts w:asciiTheme="majorHAnsi" w:hAnsiTheme="majorHAnsi" w:cstheme="majorHAnsi"/>
+                <w:sz w:val="28"/>
+                <w:szCs w:val="28"/>
+              </w:rPr>
+            </w:pPr>
+            <w:ins w:id="1103" w:author="Cập nhật 28 - 29/9, bản 1.3.12 (Claude)" w:date="2026-09-29T08:21:37Z">
+              <w:r>
+                <w:rPr>
+                  <w:rFonts w:asciiTheme="majorHAnsi" w:hAnsiTheme="majorHAnsi" w:cstheme="majorHAnsi"/>
+                  <w:sz w:val="24"/>
+                  <w:szCs w:val="24"/>
+                </w:rPr>
+                <w:t xml:space="preserve">21</w:t>
+              </w:r>
+            </w:ins>
+          </w:p>
+        </w:tc>
+        <w:tc>
+          <w:tcPr>
+            <w:tcW w:w="3000" w:type="dxa"/>
+            <w:vAlign w:val="center"/>
+          </w:tcPr>
+          <w:p>
+            <w:pPr>
+              <w:widowControl w:val="0"/>
+              <w:jc w:val="both"/>
+              <w:rPr>
+                <w:ins w:id="1106" w:author="Cập nhật 28 - 29/9, bản 1.3.12 (Claude)" w:date="2026-09-29T08:21:37Z"/>
+                <w:ins w:id="1097" w:author="Cập nhật 28 - 29/9, bản 1.3.12 (Claude)" w:date="2026-09-29T08:21:37Z"/>
+                <w:ins w:id="1088" w:author="Cập nhật 28 - 29/9, bản 1.3.12 (Claude)" w:date="2026-09-29T08:21:37Z"/>
+                <w:ins w:id="1079" w:author="Cập nhật 28 - 29/9, bản 1.3.12 (Claude)" w:date="2026-09-29T08:21:37Z"/>
+                <w:rFonts w:asciiTheme="majorHAnsi" w:hAnsiTheme="majorHAnsi" w:cstheme="majorHAnsi"/>
+                <w:sz w:val="28"/>
+                <w:szCs w:val="28"/>
+              </w:rPr>
+            </w:pPr>
+            <w:ins w:id="1105" w:author="Cập nhật 28 - 29/9, bản 1.3.12 (Claude)" w:date="2026-09-29T08:21:37Z">
+              <w:r>
+                <w:rPr>
+                  <w:rFonts w:asciiTheme="majorHAnsi" w:hAnsiTheme="majorHAnsi" w:cstheme="majorHAnsi"/>
+                  <w:sz w:val="24"/>
+                  <w:szCs w:val="24"/>
+                </w:rPr>
+                <w:t xml:space="preserve">Trên Cowork, Claude đề nghị thêm cả thư mục dự án vào phiên để đọc bản gốc chuẩn chung (tệp trong plugin bị đổi tên, thiếu gói tự học kế hoạch, thiếu mẫu)</w:t>
+              </w:r>
+            </w:ins>
+          </w:p>
+        </w:tc>
+        <w:tc>
+          <w:tcPr>
+            <w:tcW w:w="3000" w:type="dxa"/>
+            <w:vAlign w:val="center"/>
+          </w:tcPr>
+          <w:p>
+            <w:pPr>
+              <w:widowControl w:val="0"/>
+              <w:jc w:val="both"/>
+              <w:rPr>
+                <w:ins w:id="1108" w:author="Cập nhật 28 - 29/9, bản 1.3.12 (Claude)" w:date="2026-09-29T08:21:37Z"/>
+                <w:ins w:id="1099" w:author="Cập nhật 28 - 29/9, bản 1.3.12 (Claude)" w:date="2026-09-29T08:21:37Z"/>
+                <w:ins w:id="1090" w:author="Cập nhật 28 - 29/9, bản 1.3.12 (Claude)" w:date="2026-09-29T08:21:37Z"/>
+                <w:ins w:id="1081" w:author="Cập nhật 28 - 29/9, bản 1.3.12 (Claude)" w:date="2026-09-29T08:21:37Z"/>
+                <w:rFonts w:asciiTheme="majorHAnsi" w:hAnsiTheme="majorHAnsi" w:cstheme="majorHAnsi"/>
+                <w:sz w:val="28"/>
+                <w:szCs w:val="28"/>
+              </w:rPr>
+            </w:pPr>
+            <w:ins w:id="1107" w:author="Cập nhật 28 - 29/9, bản 1.3.12 (Claude)" w:date="2026-09-29T08:21:37Z">
+              <w:r>
+                <w:rPr>
+                  <w:rFonts w:asciiTheme="majorHAnsi" w:hAnsiTheme="majorHAnsi" w:cstheme="majorHAnsi"/>
+                  <w:sz w:val="24"/>
+                  <w:szCs w:val="24"/>
+                </w:rPr>
+                <w:t xml:space="preserve">Đã khắc phục trong bản 1.3.8, 1.3.9: mọi kỹ năng, tác tử được dặn không đề nghị thêm thư mục dự án; bảng đối chiếu tên tệp BAN-DO-TEP.md sinh khi dựng; đưa gói tự học kế hoạch, mẫu định tuyến, mẫu trắng vào plugin; ca thử tự đủ (chạy trên bản dựng cũ báo đúng 6 lỗi)</w:t>
+              </w:r>
+            </w:ins>
+          </w:p>
+        </w:tc>
+        <w:tc>
+          <w:tcPr>
+            <w:tcW w:w="2500" w:type="dxa"/>
+            <w:vAlign w:val="center"/>
+          </w:tcPr>
+          <w:p>
+            <w:pPr>
+              <w:widowControl w:val="0"/>
+              <w:jc w:val="both"/>
+              <w:rPr>
+                <w:ins w:id="1110" w:author="Cập nhật 28 - 29/9, bản 1.3.12 (Claude)" w:date="2026-09-29T08:21:37Z"/>
+                <w:ins w:id="1101" w:author="Cập nhật 28 - 29/9, bản 1.3.12 (Claude)" w:date="2026-09-29T08:21:37Z"/>
+                <w:ins w:id="1092" w:author="Cập nhật 28 - 29/9, bản 1.3.12 (Claude)" w:date="2026-09-29T08:21:37Z"/>
+                <w:ins w:id="1083" w:author="Cập nhật 28 - 29/9, bản 1.3.12 (Claude)" w:date="2026-09-29T08:21:37Z"/>
+                <w:rFonts w:asciiTheme="majorHAnsi" w:hAnsiTheme="majorHAnsi" w:cstheme="majorHAnsi"/>
+                <w:sz w:val="28"/>
+                <w:szCs w:val="28"/>
+              </w:rPr>
+            </w:pPr>
+            <w:ins w:id="1109" w:author="Cập nhật 28 - 29/9, bản 1.3.12 (Claude)" w:date="2026-09-29T08:21:37Z">
+              <w:r>
+                <w:rPr>
+                  <w:rFonts w:asciiTheme="majorHAnsi" w:hAnsiTheme="majorHAnsi" w:cstheme="majorHAnsi"/>
+                  <w:sz w:val="24"/>
+                  <w:szCs w:val="24"/>
+                </w:rPr>
+                <w:t xml:space="preserve">test_tu_du_plugin; BAN-DO-TEP.md</w:t>
+              </w:r>
+            </w:ins>
+          </w:p>
+        </w:tc>
+      </w:tr>
+      <w:tr>
+        <w:trPr>
+          <w:jc w:val="center"/>
+          <w:ins w:id="1111" w:author="Cập nhật 28 - 29/9, bản 1.3.12 (Claude)" w:date="2026-09-29T08:21:37Z"/>
+        </w:trPr>
+        <w:tc>
+          <w:tcPr>
+            <w:tcW w:w="567" w:type="dxa"/>
+            <w:vAlign w:val="center"/>
+          </w:tcPr>
+          <w:p>
+            <w:pPr>
+              <w:widowControl w:val="0"/>
+              <w:jc w:val="center"/>
+              <w:rPr>
+                <w:ins w:id="1113" w:author="Cập nhật 28 - 29/9, bản 1.3.12 (Claude)" w:date="2026-09-29T08:21:37Z"/>
+                <w:ins w:id="1104" w:author="Cập nhật 28 - 29/9, bản 1.3.12 (Claude)" w:date="2026-09-29T08:21:37Z"/>
+                <w:ins w:id="1095" w:author="Cập nhật 28 - 29/9, bản 1.3.12 (Claude)" w:date="2026-09-29T08:21:37Z"/>
+                <w:ins w:id="1086" w:author="Cập nhật 28 - 29/9, bản 1.3.12 (Claude)" w:date="2026-09-29T08:21:37Z"/>
+                <w:ins w:id="1077" w:author="Cập nhật 28 - 29/9, bản 1.3.12 (Claude)" w:date="2026-09-29T08:21:37Z"/>
+                <w:rFonts w:asciiTheme="majorHAnsi" w:hAnsiTheme="majorHAnsi" w:cstheme="majorHAnsi"/>
+                <w:sz w:val="28"/>
+                <w:szCs w:val="28"/>
+              </w:rPr>
+            </w:pPr>
+            <w:ins w:id="1112" w:author="Cập nhật 28 - 29/9, bản 1.3.12 (Claude)" w:date="2026-09-29T08:21:37Z">
+              <w:r>
+                <w:rPr>
+                  <w:rFonts w:asciiTheme="majorHAnsi" w:hAnsiTheme="majorHAnsi" w:cstheme="majorHAnsi"/>
+                  <w:sz w:val="24"/>
+                  <w:szCs w:val="24"/>
+                </w:rPr>
+                <w:t xml:space="preserve">22</w:t>
+              </w:r>
+            </w:ins>
+          </w:p>
+        </w:tc>
+        <w:tc>
+          <w:tcPr>
+            <w:tcW w:w="3000" w:type="dxa"/>
+            <w:vAlign w:val="center"/>
+          </w:tcPr>
+          <w:p>
+            <w:pPr>
+              <w:widowControl w:val="0"/>
+              <w:jc w:val="both"/>
+              <w:rPr>
+                <w:ins w:id="1115" w:author="Cập nhật 28 - 29/9, bản 1.3.12 (Claude)" w:date="2026-09-29T08:21:37Z"/>
+                <w:ins w:id="1106" w:author="Cập nhật 28 - 29/9, bản 1.3.12 (Claude)" w:date="2026-09-29T08:21:37Z"/>
+                <w:ins w:id="1097" w:author="Cập nhật 28 - 29/9, bản 1.3.12 (Claude)" w:date="2026-09-29T08:21:37Z"/>
+                <w:ins w:id="1088" w:author="Cập nhật 28 - 29/9, bản 1.3.12 (Claude)" w:date="2026-09-29T08:21:37Z"/>
+                <w:ins w:id="1079" w:author="Cập nhật 28 - 29/9, bản 1.3.12 (Claude)" w:date="2026-09-29T08:21:37Z"/>
+                <w:rFonts w:asciiTheme="majorHAnsi" w:hAnsiTheme="majorHAnsi" w:cstheme="majorHAnsi"/>
+                <w:sz w:val="28"/>
+                <w:szCs w:val="28"/>
+              </w:rPr>
+            </w:pPr>
+            <w:ins w:id="1114" w:author="Cập nhật 28 - 29/9, bản 1.3.12 (Claude)" w:date="2026-09-29T08:21:37Z">
+              <w:r>
+                <w:rPr>
+                  <w:rFonts w:asciiTheme="majorHAnsi" w:hAnsiTheme="majorHAnsi" w:cstheme="majorHAnsi"/>
+                  <w:sz w:val="24"/>
+                  <w:szCs w:val="24"/>
+                </w:rPr>
+                <w:t xml:space="preserve">Thông báo soạn trên Cowork ngày 28/9/2026 sai thể thức phần đầu (bảng tiêu đề dựng tay: quốc hiệu xuống dòng, thiếu đường kẻ), công cụ đo vẫn báo đạt</w:t>
+              </w:r>
+            </w:ins>
+          </w:p>
+        </w:tc>
+        <w:tc>
+          <w:tcPr>
+            <w:tcW w:w="3000" w:type="dxa"/>
+            <w:vAlign w:val="center"/>
+          </w:tcPr>
+          <w:p>
+            <w:pPr>
+              <w:widowControl w:val="0"/>
+              <w:jc w:val="both"/>
+              <w:rPr>
+                <w:ins w:id="1117" w:author="Cập nhật 28 - 29/9, bản 1.3.12 (Claude)" w:date="2026-09-29T08:21:37Z"/>
+                <w:ins w:id="1108" w:author="Cập nhật 28 - 29/9, bản 1.3.12 (Claude)" w:date="2026-09-29T08:21:37Z"/>
+                <w:ins w:id="1099" w:author="Cập nhật 28 - 29/9, bản 1.3.12 (Claude)" w:date="2026-09-29T08:21:37Z"/>
+                <w:ins w:id="1090" w:author="Cập nhật 28 - 29/9, bản 1.3.12 (Claude)" w:date="2026-09-29T08:21:37Z"/>
+                <w:ins w:id="1081" w:author="Cập nhật 28 - 29/9, bản 1.3.12 (Claude)" w:date="2026-09-29T08:21:37Z"/>
+                <w:rFonts w:asciiTheme="majorHAnsi" w:hAnsiTheme="majorHAnsi" w:cstheme="majorHAnsi"/>
+                <w:sz w:val="28"/>
+                <w:szCs w:val="28"/>
+              </w:rPr>
+            </w:pPr>
+            <w:ins w:id="1116" w:author="Cập nhật 28 - 29/9, bản 1.3.12 (Claude)" w:date="2026-09-29T08:21:37Z">
+              <w:r>
+                <w:rPr>
+                  <w:rFonts w:asciiTheme="majorHAnsi" w:hAnsiTheme="majorHAnsi" w:cstheme="majorHAnsi"/>
+                  <w:sz w:val="24"/>
+                  <w:szCs w:val="24"/>
+                </w:rPr>
+                <w:t xml:space="preserve">Đã khắc phục trong bản 1.3.10 - 1.3.12 theo chỉ đạo của người phụ trách: dựng văn bản bằng cách sửa văn bản tương tự đã ban hành hoặc ráp nội dung vào mẫu 03-Templates(1), không tự dựng phần đầu; công cụ đo bổ sung phép đo ánh xạ bộ quy tắc KTC-Ra-Soat-897; bước xem trang thật trước khi giao</w:t>
+              </w:r>
+            </w:ins>
+          </w:p>
+        </w:tc>
+        <w:tc>
+          <w:tcPr>
+            <w:tcW w:w="2500" w:type="dxa"/>
+            <w:vAlign w:val="center"/>
+          </w:tcPr>
+          <w:p>
+            <w:pPr>
+              <w:widowControl w:val="0"/>
+              <w:jc w:val="both"/>
+              <w:rPr>
+                <w:ins w:id="1119" w:author="Cập nhật 28 - 29/9, bản 1.3.12 (Claude)" w:date="2026-09-29T08:21:37Z"/>
+                <w:ins w:id="1110" w:author="Cập nhật 28 - 29/9, bản 1.3.12 (Claude)" w:date="2026-09-29T08:21:37Z"/>
+                <w:ins w:id="1101" w:author="Cập nhật 28 - 29/9, bản 1.3.12 (Claude)" w:date="2026-09-29T08:21:37Z"/>
+                <w:ins w:id="1092" w:author="Cập nhật 28 - 29/9, bản 1.3.12 (Claude)" w:date="2026-09-29T08:21:37Z"/>
+                <w:ins w:id="1083" w:author="Cập nhật 28 - 29/9, bản 1.3.12 (Claude)" w:date="2026-09-29T08:21:37Z"/>
+                <w:rFonts w:asciiTheme="majorHAnsi" w:hAnsiTheme="majorHAnsi" w:cstheme="majorHAnsi"/>
+                <w:sz w:val="28"/>
+                <w:szCs w:val="28"/>
+              </w:rPr>
+            </w:pPr>
+            <w:ins w:id="1118" w:author="Cập nhật 28 - 29/9, bản 1.3.12 (Claude)" w:date="2026-09-29T08:21:37Z">
+              <w:r>
+                <w:rPr>
+                  <w:rFonts w:asciiTheme="majorHAnsi" w:hAnsiTheme="majorHAnsi" w:cstheme="majorHAnsi"/>
+                  <w:sz w:val="24"/>
+                  <w:szCs w:val="24"/>
+                </w:rPr>
+                <w:t xml:space="preserve">kiem_the_thuc.py; test_kiem_the_thuc; chuẩn 18 mục 3a, 6</w:t>
               </w:r>
             </w:ins>
           </w:p>
@@ -7336,7 +7974,7 @@
         </w:rPr>
         <w:t xml:space="preserve">- Tài liệu đầu vào: Thông báo số 736/TB-CĐKT, Thông báo số 817/TB-CĐKT, </w:t>
       </w:r>
-      <w:del w:id="1075" w:author="Cập nhật 28/9, bản 1.3.5 (Claude)" w:date="2026-09-28T14:38:48Z">
+      <w:del w:id="1120" w:author="Cập nhật 28 - 29/9, bản 1.3.12 (Claude)" w:date="2026-09-29T08:21:37Z">
         <w:r>
           <w:rPr>
             <w:rFonts w:asciiTheme="majorHAnsi" w:hAnsiTheme="majorHAnsi" w:cstheme="majorHAnsi"/>
@@ -7347,7 +7985,7 @@
           <w:delText xml:space="preserve">Quyết định số 1923/QĐ-CĐKT, Thông báo số 1052/TB-CĐKT, mẫu Phụ lục</w:delText>
         </w:r>
       </w:del>
-      <w:ins w:id="1076" w:author="Cập nhật 28/9, bản 1.3.5 (Claude)" w:date="2026-09-28T14:38:48Z">
+      <w:ins w:id="1121" w:author="Cập nhật 28 - 29/9, bản 1.3.12 (Claude)" w:date="2026-09-29T08:21:37Z">
         <w:r>
           <w:rPr>
             <w:rFonts w:asciiTheme="majorHAnsi" w:hAnsiTheme="majorHAnsi" w:cstheme="majorHAnsi"/>
@@ -7490,14 +8128,14 @@
         <w:ind w:firstLine="720"/>
         <w:jc w:val="both"/>
         <w:rPr>
-          <w:ins w:id="1078" w:author="Cập nhật 28/9, bản 1.3.5 (Claude)" w:date="2026-09-28T14:38:48Z"/>
+          <w:ins w:id="1123" w:author="Cập nhật 28 - 29/9, bản 1.3.12 (Claude)" w:date="2026-09-29T08:21:37Z"/>
           <w:rFonts w:asciiTheme="majorHAnsi" w:hAnsiTheme="majorHAnsi" w:cstheme="majorHAnsi"/>
           <w:sz w:val="28"/>
           <w:szCs w:val="28"/>
           <w:shd w:val="clear" w:color="auto" w:fill="FFFFFF"/>
         </w:rPr>
       </w:pPr>
-      <w:ins w:id="1077" w:author="Cập nhật 28/9, bản 1.3.5 (Claude)" w:date="2026-09-28T14:38:48Z">
+      <w:ins w:id="1122" w:author="Cập nhật 28 - 29/9, bản 1.3.12 (Claude)" w:date="2026-09-29T08:21:37Z">
         <w:r>
           <w:rPr>
             <w:rFonts w:asciiTheme="majorHAnsi" w:hAnsiTheme="majorHAnsi" w:cstheme="majorHAnsi"/>
@@ -7505,7 +8143,7 @@
             <w:szCs w:val="28"/>
             <w:shd w:val="clear" w:color="auto" w:fill="FFFFFF"/>
           </w:rPr>
-          <w:t xml:space="preserve">- Cập nhật ngày 28/9/2026 theo Quyết định số 2119/QĐ-CĐKT ngày 28/9/2026: tệp plugin bản 1.3.5 (kết nối thư mục đầu vào, đầu ra cho tài khoản thành viên), mã SHA-256, hồ sơ bằng chứng kiểm thử, kết quả nghiệm thu lại các ca liên quan, phiếu nghiệm thu trên Claude, Cowork bản 1.3.5; Báo cáo quá trình xây dựng bản 6, Tài liệu hướng dẫn bản 7, Báo cáo tiếp thu, giải trình lần 4 bản 2 (Track Changes và bản sạch).</w:t>
+          <w:t xml:space="preserve">- Cập nhật ngày 28 - 29/9/2026 theo Quyết định số 2119/QĐ-CĐKT ngày 28/9/2026: tệp plugin bản 1.3.12 (kết nối thư mục đầu vào, đầu ra cho tài khoản thành viên; báo cáo tháng dựng từ bản đã ban hành; plugin tự đủ; dựng văn bản từ mẫu, đo thể thức ánh xạ bộ quy tắc KTC-Ra-Soat-897), mã SHA-256, hồ sơ bằng chứng kiểm thử, kết quả nghiệm thu lại các ca liên quan, phiếu nghiệm thu trên Claude, Cowork bản 1.3.12; kết quả chạy độc lập báo cáo tháng 9; Báo cáo quá trình xây dựng bản 6, Tài liệu hướng dẫn bản 7, Báo cáo tiếp thu, giải trình lần 4 bản 2 (Track Changes và bản sạch).</w:t>
         </w:r>
       </w:ins>
     </w:p>
@@ -7545,7 +8183,7 @@
         </w:rPr>
         <w:t xml:space="preserve">(i) thẩm định độc lập bổ sung </w:t>
       </w:r>
-      <w:del w:id="1079" w:author="Cập nhật 28/9, bản 1.3.5 (Claude)" w:date="2026-09-28T14:38:48Z">
+      <w:del w:id="1124" w:author="Cập nhật 28 - 29/9, bản 1.3.12 (Claude)" w:date="2026-09-29T08:21:37Z">
         <w:r>
           <w:rPr>
             <w:rFonts w:asciiTheme="majorHAnsi" w:hAnsiTheme="majorHAnsi" w:cstheme="majorHAnsi"/>
@@ -7558,7 +8196,7 @@
           <w:delText xml:space="preserve">(vòng 5) trên tệp plugin bản 1.3.2 để xác nhận</w:delText>
         </w:r>
       </w:del>
-      <w:ins w:id="1080" w:author="Cập nhật 28/9, bản 1.3.5 (Claude)" w:date="2026-09-28T14:38:48Z">
+      <w:ins w:id="1125" w:author="Cập nhật 28 - 29/9, bản 1.3.12 (Claude)" w:date="2026-09-29T08:21:37Z">
         <w:r>
           <w:rPr>
             <w:rFonts w:asciiTheme="majorHAnsi" w:hAnsiTheme="majorHAnsi" w:cstheme="majorHAnsi"/>
@@ -7568,7 +8206,7 @@
             <w:szCs w:val="28"/>
             <w:shd w:val="clear" w:color="auto" w:fill="FFFFFF"/>
           </w:rPr>
-          <w:t xml:space="preserve">(vòng 5) trên tệp plugin bản 1.3.5 để xác nhận</w:t>
+          <w:t xml:space="preserve">(vòng 5) trên tệp plugin bản 1.3.12 để xác nhận</w:t>
         </w:r>
       </w:ins>
       <w:r>
@@ -7593,7 +8231,7 @@
         </w:rPr>
         <w:t xml:space="preserve">; (ii) kiểm thử nghiệm thu trên Claude (trò chuyện) và Claude Cowork; (iii) kiểm kê, thu hồi phiên bản cũ ở cấp tổ chức; phân quyền chỉ đọc kho KTC-Database có biên bản; (iv) rà soát bằng Skill “ktc-ra-soat-897” phần sửa đổi lần 3 của dự thảo Thông báo, Tài liệu hướng dẫn (2 vòng đối với Thông báo bản 5, Tài liệu hướng dẫn bản 4 đã thực hiện; Thông báo số 917/TB-CĐKT, 924/TB-CĐKT, 948/TB-CĐKT </w:t>
       </w:r>
-      <w:del w:id="1081" w:author="Cập nhật 28/9, bản 1.3.5 (Claude)" w:date="2026-09-28T14:38:48Z">
+      <w:del w:id="1126" w:author="Cập nhật 28 - 29/9, bản 1.3.12 (Claude)" w:date="2026-09-29T08:21:37Z">
         <w:r>
           <w:rPr>
             <w:rFonts w:asciiTheme="majorHAnsi" w:hAnsiTheme="majorHAnsi" w:cstheme="majorHAnsi"/>
@@ -7606,7 +8244,7 @@
           <w:delText xml:space="preserve">đã đối chiếu bản gốc ngày 27/9/2026)</w:delText>
         </w:r>
       </w:del>
-      <w:ins w:id="1082" w:author="Cập nhật 28/9, bản 1.3.5 (Claude)" w:date="2026-09-28T14:38:48Z">
+      <w:ins w:id="1127" w:author="Cập nhật 28 - 29/9, bản 1.3.12 (Claude)" w:date="2026-09-29T08:21:37Z">
         <w:r>
           <w:rPr>
             <w:rFonts w:asciiTheme="majorHAnsi" w:hAnsiTheme="majorHAnsi" w:cstheme="majorHAnsi"/>
@@ -7616,7 +8254,7 @@
             <w:szCs w:val="28"/>
             <w:shd w:val="clear" w:color="auto" w:fill="FFFFFF"/>
           </w:rPr>
-          <w:t xml:space="preserve">đã đối chiếu bản gốc ngày 27/9/2026; phần cập nhật ngày 28/9/2026 chưa rà soát bằng Skill “ktc-ra-soat-897”)</w:t>
+          <w:t xml:space="preserve">đã đối chiếu bản gốc ngày 27/9/2026; phần cập nhật ngày 28 - 29/9/2026 chưa rà soát bằng Skill “ktc-ra-soat-897”)</w:t>
         </w:r>
       </w:ins>
       <w:r>

</xml_diff>

<commit_message>
docs: hồ sơ thẩm định vòng 5 hoàn chỉnh (87 tệp) — nghiệm thu 1.3.12, rà soát 897 vòng 4
- Nghiệm thu 15 ca trên 1.3.12 (dot9-1312): 14/15 ca, 28/30 lượt. Ca 15 trượt
  do bộ chấm regex bắt câu trả lời trích lại yêu cầu người dùng (giám khảo LLM
  đạt 3/3 cả 2 lượt); bộ chấm sửa chỉ bắt "Căn cứ Checklist" đầu dòng; chạy lại
  ca 15 (dot9b): 2/2.
- Rà soát 897 vòng 4 phần cập nhật 28 - 29/9 của BC quá trình v6, HD v7, BC
  tiếp thu v2: 0 Mức 1; sửa 1 Mức 2, 6 Mức 3 (viện dẫn lần sau, TB 597 kèm
  ngày, câu trái nghĩa, lặp ý, khẩu ngữ, trạng thái rà soát); 2 góp ý Mức 4.
- BC quá trình thêm dòng 14 (nghiệm thu 1.3.12); BC tiếp thu ghi kết quả.
- Hồ sơ dựng giống hệt ở 2026-09-27 và 2026-09-29; kiem_ho_so --khoa sạch.

Co-Authored-By: Claude Opus 5.5 <noreply@anthropic.com>
</commit_message>
<xml_diff>
--- a/30-Ket-Qua/2026-09-27/Ho-So-Tham-Dinh-Vong-5/4-Van-ban/BC_Qua-trinh-xay-dung-bo-cong-cu-KTC-Quan-tri_20260928_v6_TrackChanges.docx
+++ b/30-Ket-Qua/2026-09-27/Ho-So-Tham-Dinh-Vong-5/4-Van-ban/BC_Qua-trinh-xay-dung-bo-cong-cu-KTC-Quan-tri_20260928_v6_TrackChanges.docx
@@ -1849,7 +1849,7 @@
                 <w:szCs w:val="28"/>
               </w:rPr>
             </w:pPr>
-            <w:del w:id="1001" w:author="Cập nhật 28 - 29/9, bản 1.3.12 (Claude)" w:date="2026-09-29T08:21:37Z">
+            <w:del w:id="1001" w:author="Cập nhật 28 - 29/9, bản 1.3.12 (Claude)" w:date="2026-09-29T09:02:01Z">
               <w:r>
                 <w:rPr>
                   <w:rFonts w:asciiTheme="majorHAnsi" w:hAnsiTheme="majorHAnsi" w:cstheme="majorHAnsi"/>
@@ -1859,7 +1859,7 @@
                 <w:delText xml:space="preserve">Bản 1.3.2 (hiện hành), mã SHA-256</w:delText>
               </w:r>
             </w:del>
-            <w:ins w:id="1002" w:author="Cập nhật 28 - 29/9, bản 1.3.12 (Claude)" w:date="2026-09-29T08:21:37Z">
+            <w:ins w:id="1002" w:author="Cập nhật 28 - 29/9, bản 1.3.12 (Claude)" w:date="2026-09-29T09:02:01Z">
               <w:r>
                 <w:rPr>
                   <w:rFonts w:asciiTheme="majorHAnsi" w:hAnsiTheme="majorHAnsi" w:cstheme="majorHAnsi"/>
@@ -1908,7 +1908,7 @@
       <w:tr>
         <w:trPr>
           <w:jc w:val="center"/>
-          <w:ins w:id="1003" w:author="Cập nhật 28 - 29/9, bản 1.3.12 (Claude)" w:date="2026-09-29T08:21:37Z"/>
+          <w:ins w:id="1003" w:author="Cập nhật 28 - 29/9, bản 1.3.12 (Claude)" w:date="2026-09-29T09:02:01Z"/>
         </w:trPr>
         <w:tc>
           <w:tcPr>
@@ -1920,13 +1920,13 @@
               <w:widowControl w:val="0"/>
               <w:jc w:val="center"/>
               <w:rPr>
-                <w:ins w:id="1005" w:author="Cập nhật 28 - 29/9, bản 1.3.12 (Claude)" w:date="2026-09-29T08:21:37Z"/>
-                <w:rFonts w:asciiTheme="majorHAnsi" w:hAnsiTheme="majorHAnsi" w:cstheme="majorHAnsi"/>
-                <w:sz w:val="28"/>
-                <w:szCs w:val="28"/>
-              </w:rPr>
-            </w:pPr>
-            <w:ins w:id="1004" w:author="Cập nhật 28 - 29/9, bản 1.3.12 (Claude)" w:date="2026-09-29T08:21:37Z">
+                <w:ins w:id="1005" w:author="Cập nhật 28 - 29/9, bản 1.3.12 (Claude)" w:date="2026-09-29T09:02:01Z"/>
+                <w:rFonts w:asciiTheme="majorHAnsi" w:hAnsiTheme="majorHAnsi" w:cstheme="majorHAnsi"/>
+                <w:sz w:val="28"/>
+                <w:szCs w:val="28"/>
+              </w:rPr>
+            </w:pPr>
+            <w:ins w:id="1004" w:author="Cập nhật 28 - 29/9, bản 1.3.12 (Claude)" w:date="2026-09-29T09:02:01Z">
               <w:r>
                 <w:rPr>
                   <w:rFonts w:asciiTheme="majorHAnsi" w:hAnsiTheme="majorHAnsi" w:cstheme="majorHAnsi"/>
@@ -1948,20 +1948,20 @@
               <w:widowControl w:val="0"/>
               <w:jc w:val="both"/>
               <w:rPr>
-                <w:ins w:id="1007" w:author="Cập nhật 28 - 29/9, bản 1.3.12 (Claude)" w:date="2026-09-29T08:21:37Z"/>
-                <w:rFonts w:asciiTheme="majorHAnsi" w:hAnsiTheme="majorHAnsi" w:cstheme="majorHAnsi"/>
-                <w:sz w:val="28"/>
-                <w:szCs w:val="28"/>
-              </w:rPr>
-            </w:pPr>
-            <w:ins w:id="1006" w:author="Cập nhật 28 - 29/9, bản 1.3.12 (Claude)" w:date="2026-09-29T08:21:37Z">
+                <w:ins w:id="1007" w:author="Cập nhật 28 - 29/9, bản 1.3.12 (Claude)" w:date="2026-09-29T09:02:01Z"/>
+                <w:rFonts w:asciiTheme="majorHAnsi" w:hAnsiTheme="majorHAnsi" w:cstheme="majorHAnsi"/>
+                <w:sz w:val="28"/>
+                <w:szCs w:val="28"/>
+              </w:rPr>
+            </w:pPr>
+            <w:ins w:id="1006" w:author="Cập nhật 28 - 29/9, bản 1.3.12 (Claude)" w:date="2026-09-29T09:02:01Z">
               <w:r>
                 <w:rPr>
                   <w:rFonts w:asciiTheme="majorHAnsi" w:hAnsiTheme="majorHAnsi" w:cstheme="majorHAnsi"/>
                   <w:sz w:val="28"/>
                   <w:szCs w:val="28"/>
                 </w:rPr>
-                <w:t xml:space="preserve">Cập nhật theo Quyết định số 2119/QĐ-CĐKT ngày 28/9/2026 ban hành Danh mục sản phẩm, công việc (thay thế danh mục dự thảo kèm Thông báo số 1052/TB-CĐKT): hệ số quy đổi tra theo từng sản phẩm của Danh mục chính thức; chuẩn phân loại 6 Trục ghi căn cứ Quyết định số 1923/QĐ-CĐKT (Phụ lục I, II) cho cột Điểm chấm, Hệ số quy đổi; sửa thao tác chặn ghi chặn nhầm lệnh chỉ đọc kho; kết nối thư mục đầu vào, đầu ra cho tài khoản thành viên trên Cowork; báo cáo tháng cấp Trường dựng từ bản đã ban hành, đóng vào plugin mọi công cụ dựng báo cáo (khắc phục chạy thử ngày 28/9/2026); plugin tự đủ, không đề nghị thêm thư mục dự án khi dùng trên Cowork; văn bản dựng bằng cách ráp nội dung vào mẫu 03-Templates(1) hoặc sửa văn bản tương tự, đo thể thức ánh xạ bộ quy tắc KTC-Ra-Soat-897</w:t>
+                <w:t xml:space="preserve">Cập nhật theo Quyết định số 2119/QĐ-CĐKT ban hành Danh mục sản phẩm, công việc (thay thế danh mục dự thảo kèm Thông báo số 1052/TB-CĐKT): hệ số quy đổi tra theo từng sản phẩm của Danh mục chính thức; chuẩn phân loại 6 Trục ghi căn cứ Quyết định số 1923/QĐ-CĐKT (Phụ lục I, II) cho cột Điểm chấm, Hệ số quy đổi; sửa thao tác chặn ghi chặn nhầm lệnh chỉ đọc kho; kết nối thư mục đầu vào, đầu ra cho tài khoản thành viên trên Cowork; báo cáo tháng cấp Trường dựng từ bản đã ban hành, đóng vào plugin mọi công cụ dựng báo cáo (khắc phục chạy thử ngày 28/9/2026); plugin tự đủ, không đề nghị thêm thư mục dự án khi dùng trên Cowork; văn bản dựng bằng cách ráp nội dung vào mẫu 03-Templates(1) hoặc sửa văn bản tương tự, đo thể thức ánh xạ bộ quy tắc KTC-Ra-Soat-897</w:t>
               </w:r>
             </w:ins>
           </w:p>
@@ -1976,13 +1976,13 @@
               <w:widowControl w:val="0"/>
               <w:jc w:val="both"/>
               <w:rPr>
-                <w:ins w:id="1009" w:author="Cập nhật 28 - 29/9, bản 1.3.12 (Claude)" w:date="2026-09-29T08:21:37Z"/>
-                <w:rFonts w:asciiTheme="majorHAnsi" w:hAnsiTheme="majorHAnsi" w:cstheme="majorHAnsi"/>
-                <w:sz w:val="28"/>
-                <w:szCs w:val="28"/>
-              </w:rPr>
-            </w:pPr>
-            <w:ins w:id="1008" w:author="Cập nhật 28 - 29/9, bản 1.3.12 (Claude)" w:date="2026-09-29T08:21:37Z">
+                <w:ins w:id="1009" w:author="Cập nhật 28 - 29/9, bản 1.3.12 (Claude)" w:date="2026-09-29T09:02:01Z"/>
+                <w:rFonts w:asciiTheme="majorHAnsi" w:hAnsiTheme="majorHAnsi" w:cstheme="majorHAnsi"/>
+                <w:sz w:val="28"/>
+                <w:szCs w:val="28"/>
+              </w:rPr>
+            </w:pPr>
+            <w:ins w:id="1008" w:author="Cập nhật 28 - 29/9, bản 1.3.12 (Claude)" w:date="2026-09-29T09:02:01Z">
               <w:r>
                 <w:rPr>
                   <w:rFonts w:asciiTheme="majorHAnsi" w:hAnsiTheme="majorHAnsi" w:cstheme="majorHAnsi"/>
@@ -2004,13 +2004,13 @@
               <w:widowControl w:val="0"/>
               <w:jc w:val="center"/>
               <w:rPr>
-                <w:ins w:id="1011" w:author="Cập nhật 28 - 29/9, bản 1.3.12 (Claude)" w:date="2026-09-29T08:21:37Z"/>
-                <w:rFonts w:asciiTheme="majorHAnsi" w:hAnsiTheme="majorHAnsi" w:cstheme="majorHAnsi"/>
-                <w:sz w:val="28"/>
-                <w:szCs w:val="28"/>
-              </w:rPr>
-            </w:pPr>
-            <w:ins w:id="1010" w:author="Cập nhật 28 - 29/9, bản 1.3.12 (Claude)" w:date="2026-09-29T08:21:37Z">
+                <w:ins w:id="1011" w:author="Cập nhật 28 - 29/9, bản 1.3.12 (Claude)" w:date="2026-09-29T09:02:01Z"/>
+                <w:rFonts w:asciiTheme="majorHAnsi" w:hAnsiTheme="majorHAnsi" w:cstheme="majorHAnsi"/>
+                <w:sz w:val="28"/>
+                <w:szCs w:val="28"/>
+              </w:rPr>
+            </w:pPr>
+            <w:ins w:id="1010" w:author="Cập nhật 28 - 29/9, bản 1.3.12 (Claude)" w:date="2026-09-29T09:02:01Z">
               <w:r>
                 <w:rPr>
                   <w:rFonts w:asciiTheme="majorHAnsi" w:hAnsiTheme="majorHAnsi" w:cstheme="majorHAnsi"/>
@@ -2043,7 +2043,7 @@
         </w:rPr>
         <w:t xml:space="preserve">Toàn bộ quá trình được lưu vết: </w:t>
       </w:r>
-      <w:del w:id="1012" w:author="Cập nhật 28 - 29/9, bản 1.3.12 (Claude)" w:date="2026-09-29T08:21:37Z">
+      <w:del w:id="1012" w:author="Cập nhật 28 - 29/9, bản 1.3.12 (Claude)" w:date="2026-09-29T09:02:01Z">
         <w:r>
           <w:rPr>
             <w:rFonts w:asciiTheme="majorHAnsi" w:hAnsiTheme="majorHAnsi" w:cstheme="majorHAnsi"/>
@@ -2053,14 +2053,14 @@
           <w:delText xml:space="preserve">87 lần cập nhật trên kho mã nguồn (từ 18/9/2026), nhật ký thay đổi 28 phiên bản, 26</w:delText>
         </w:r>
       </w:del>
-      <w:ins w:id="1013" w:author="Cập nhật 28 - 29/9, bản 1.3.12 (Claude)" w:date="2026-09-29T08:21:37Z">
+      <w:ins w:id="1013" w:author="Cập nhật 28 - 29/9, bản 1.3.12 (Claude)" w:date="2026-09-29T09:02:01Z">
         <w:r>
           <w:rPr>
             <w:rFonts w:asciiTheme="majorHAnsi" w:hAnsiTheme="majorHAnsi" w:cstheme="majorHAnsi"/>
             <w:sz w:val="28"/>
             <w:szCs w:val="28"/>
           </w:rPr>
-          <w:t xml:space="preserve">114 lần cập nhật trên kho mã nguồn (từ 18/9/2026), nhật ký thay đổi 38 phiên bản, 30</w:t>
+          <w:t xml:space="preserve">116 lần cập nhật trên kho mã nguồn (từ 18/9/2026), nhật ký thay đổi 38 phiên bản, 30</w:t>
         </w:r>
       </w:ins>
       <w:r>
@@ -2323,7 +2323,7 @@
               </w:rPr>
               <w:t xml:space="preserve">Kiểm kê kho KTC-Database (8 kho), mẫu Phụ lục TB 736, TB 817, </w:t>
             </w:r>
-            <w:del w:id="1014" w:author="Cập nhật 28 - 29/9, bản 1.3.12 (Claude)" w:date="2026-09-29T08:21:37Z">
+            <w:del w:id="1014" w:author="Cập nhật 28 - 29/9, bản 1.3.12 (Claude)" w:date="2026-09-29T09:02:01Z">
               <w:r>
                 <w:rPr>
                   <w:rFonts w:asciiTheme="majorHAnsi" w:hAnsiTheme="majorHAnsi" w:cstheme="majorHAnsi"/>
@@ -2333,7 +2333,7 @@
                 <w:delText xml:space="preserve">Quyết định số 1923/QĐ-CĐKT, TB 1052, 6 mẫu Kế hoạch + KPI</w:delText>
               </w:r>
             </w:del>
-            <w:ins w:id="1015" w:author="Cập nhật 28 - 29/9, bản 1.3.12 (Claude)" w:date="2026-09-29T08:21:37Z">
+            <w:ins w:id="1015" w:author="Cập nhật 28 - 29/9, bản 1.3.12 (Claude)" w:date="2026-09-29T09:02:01Z">
               <w:r>
                 <w:rPr>
                   <w:rFonts w:asciiTheme="majorHAnsi" w:hAnsiTheme="majorHAnsi" w:cstheme="majorHAnsi"/>
@@ -2650,7 +2650,7 @@
                 <w:szCs w:val="28"/>
               </w:rPr>
             </w:pPr>
-            <w:del w:id="1016" w:author="Cập nhật 28 - 29/9, bản 1.3.12 (Claude)" w:date="2026-09-29T08:21:37Z">
+            <w:del w:id="1016" w:author="Cập nhật 28 - 29/9, bản 1.3.12 (Claude)" w:date="2026-09-29T09:02:01Z">
               <w:r>
                 <w:rPr>
                   <w:rFonts w:asciiTheme="majorHAnsi" w:hAnsiTheme="majorHAnsi" w:cstheme="majorHAnsi"/>
@@ -2660,14 +2660,14 @@
                 <w:delText xml:space="preserve">Dừng, không tự đặt quy tắc đối với: hai thang điểm quy đổi khối lượng công việc chưa có văn bản phân định; </w:delText>
               </w:r>
             </w:del>
-            <w:ins w:id="1017" w:author="Cập nhật 28 - 29/9, bản 1.3.12 (Claude)" w:date="2026-09-29T08:21:37Z">
+            <w:ins w:id="1017" w:author="Cập nhật 28 - 29/9, bản 1.3.12 (Claude)" w:date="2026-09-29T09:02:01Z">
               <w:r>
                 <w:rPr>
                   <w:rFonts w:asciiTheme="majorHAnsi" w:hAnsiTheme="majorHAnsi" w:cstheme="majorHAnsi"/>
                   <w:sz w:val="28"/>
                   <w:szCs w:val="28"/>
                 </w:rPr>
-                <w:t xml:space="preserve">Dừng, không tự đặt quy tắc đối với: hai thang điểm quy đổi khối lượng công việc chưa có văn bản phân định (đã có văn bản: Quyết định số 2119/QĐ-CĐKT ngày 28/9/2026, Bộ công cụ áp dụng từ bản 1.3.3; cột Điểm chấm, Hệ số quy đổi của kế hoạch, báo cáo giữ 4 mức theo Quyết định số 1923/QĐ-CĐKT Phụ lục I, II; quy ước nhân hệ số sản phẩm với hệ số mức độ công việc chưa có văn bản, vẫn cảnh báo); </w:t>
+                <w:t xml:space="preserve">Dừng, không tự đặt quy tắc đối với: hai thang điểm quy đổi khối lượng công việc chưa có văn bản phân định (nay đã có: Quyết định số 2119/QĐ-CĐKT, Bộ công cụ áp dụng từ bản 1.3.3; cột Điểm chấm, Hệ số quy đổi của kế hoạch, báo cáo giữ 4 mức theo Quyết định số 1923/QĐ-CĐKT Phụ lục I, II; quy ước nhân hệ số sản phẩm với hệ số mức độ công việc chưa có văn bản, vẫn cảnh báo); </w:t>
               </w:r>
             </w:ins>
             <w:r>
@@ -3141,7 +3141,7 @@
           <w:szCs w:val="28"/>
         </w:rPr>
       </w:pPr>
-      <w:del w:id="1018" w:author="Cập nhật 28 - 29/9, bản 1.3.12 (Claude)" w:date="2026-09-29T08:21:37Z">
+      <w:del w:id="1018" w:author="Cập nhật 28 - 29/9, bản 1.3.12 (Claude)" w:date="2026-09-29T09:02:01Z">
         <w:r>
           <w:rPr>
             <w:rFonts w:asciiTheme="majorHAnsi" w:hAnsiTheme="majorHAnsi" w:cstheme="majorHAnsi"/>
@@ -3153,7 +3153,7 @@
           <w:delText xml:space="preserve">4. Kết quả kiểm thử (chạy lại ngày 27/9/2026, bản 1.3.2)</w:delText>
         </w:r>
       </w:del>
-      <w:ins w:id="1019" w:author="Cập nhật 28 - 29/9, bản 1.3.12 (Claude)" w:date="2026-09-29T08:21:37Z">
+      <w:ins w:id="1019" w:author="Cập nhật 28 - 29/9, bản 1.3.12 (Claude)" w:date="2026-09-29T09:02:01Z">
         <w:r>
           <w:rPr>
             <w:rFonts w:asciiTheme="majorHAnsi" w:hAnsiTheme="majorHAnsi" w:cstheme="majorHAnsi"/>
@@ -3456,7 +3456,7 @@
                 <w:szCs w:val="28"/>
               </w:rPr>
             </w:pPr>
-            <w:del w:id="1024" w:author="Cập nhật 28 - 29/9, bản 1.3.12 (Claude)" w:date="2026-09-29T08:21:37Z">
+            <w:del w:id="1026" w:author="Cập nhật 28 - 29/9, bản 1.3.12 (Claude)" w:date="2026-09-29T09:02:01Z">
               <w:r>
                 <w:rPr>
                   <w:rFonts w:asciiTheme="majorHAnsi" w:hAnsiTheme="majorHAnsi" w:cstheme="majorHAnsi"/>
@@ -3466,7 +3466,7 @@
                 <w:delText xml:space="preserve">21 bộ ca thử hồi quy (</w:delText>
               </w:r>
             </w:del>
-            <w:ins w:id="1025" w:author="Cập nhật 28 - 29/9, bản 1.3.12 (Claude)" w:date="2026-09-29T08:21:37Z">
+            <w:ins w:id="1027" w:author="Cập nhật 28 - 29/9, bản 1.3.12 (Claude)" w:date="2026-09-29T09:02:01Z">
               <w:r>
                 <w:rPr>
                   <w:rFonts w:asciiTheme="majorHAnsi" w:hAnsiTheme="majorHAnsi" w:cstheme="majorHAnsi"/>
@@ -3482,9 +3482,37 @@
                 <w:sz w:val="28"/>
                 <w:szCs w:val="28"/>
               </w:rPr>
-              <w:t xml:space="preserve">tính KPI, xếp loại, biểu mẫu, viện dẫn, thể thức, minh chứng, Track Changes, nhật ký, </w:t>
-            </w:r>
-            <w:del w:id="1020" w:author="Cập nhật 28 - 29/9, bản 1.3.12 (Claude)" w:date="2026-09-29T08:21:37Z">
+              <w:t xml:space="preserve">tính KPI, xếp loại, biểu mẫu, </w:t>
+            </w:r>
+            <w:del w:id="1024" w:author="Cập nhật 28 - 29/9, bản 1.3.12 (Claude)" w:date="2026-09-29T09:02:01Z">
+              <w:r>
+                <w:rPr>
+                  <w:rFonts w:asciiTheme="majorHAnsi" w:hAnsiTheme="majorHAnsi" w:cstheme="majorHAnsi"/>
+                  <w:sz w:val="28"/>
+                  <w:szCs w:val="28"/>
+                </w:rPr>
+                <w:delText xml:space="preserve">viện dẫn, thể thức, minh chứng</w:delText>
+              </w:r>
+            </w:del>
+            <w:ins w:id="1025" w:author="Cập nhật 28 - 29/9, bản 1.3.12 (Claude)" w:date="2026-09-29T09:02:01Z">
+              <w:r>
+                <w:rPr>
+                  <w:rFonts w:asciiTheme="majorHAnsi" w:hAnsiTheme="majorHAnsi" w:cstheme="majorHAnsi"/>
+                  <w:sz w:val="28"/>
+                  <w:szCs w:val="28"/>
+                </w:rPr>
+                <w:t xml:space="preserve">viện dẫn, minh chứng</w:t>
+              </w:r>
+            </w:ins>
+            <w:r>
+              <w:rPr>
+                <w:rFonts w:asciiTheme="majorHAnsi" w:hAnsiTheme="majorHAnsi" w:cstheme="majorHAnsi"/>
+                <w:sz w:val="28"/>
+                <w:szCs w:val="28"/>
+              </w:rPr>
+              <w:t xml:space="preserve">, Track Changes, nhật ký, </w:t>
+            </w:r>
+            <w:del w:id="1020" w:author="Cập nhật 28 - 29/9, bản 1.3.12 (Claude)" w:date="2026-09-29T09:02:01Z">
               <w:r>
                 <w:rPr>
                   <w:rFonts w:asciiTheme="majorHAnsi" w:hAnsiTheme="majorHAnsi" w:cstheme="majorHAnsi"/>
@@ -3494,7 +3522,7 @@
                 <w:delText xml:space="preserve">thao tác chặn ghi và bản dựng 1.3.0, 1.3.1)</w:delText>
               </w:r>
             </w:del>
-            <w:ins w:id="1021" w:author="Cập nhật 28 - 29/9, bản 1.3.12 (Claude)" w:date="2026-09-29T08:21:37Z">
+            <w:ins w:id="1021" w:author="Cập nhật 28 - 29/9, bản 1.3.12 (Claude)" w:date="2026-09-29T09:02:01Z">
               <w:r>
                 <w:rPr>
                   <w:rFonts w:asciiTheme="majorHAnsi" w:hAnsiTheme="majorHAnsi" w:cstheme="majorHAnsi"/>
@@ -3546,7 +3574,7 @@
                 <w:szCs w:val="28"/>
               </w:rPr>
             </w:pPr>
-            <w:del w:id="1022" w:author="Cập nhật 28 - 29/9, bản 1.3.12 (Claude)" w:date="2026-09-29T08:21:37Z">
+            <w:del w:id="1022" w:author="Cập nhật 28 - 29/9, bản 1.3.12 (Claude)" w:date="2026-09-29T09:02:01Z">
               <w:r>
                 <w:rPr>
                   <w:rFonts w:asciiTheme="majorHAnsi" w:hAnsiTheme="majorHAnsi" w:cstheme="majorHAnsi"/>
@@ -3556,7 +3584,7 @@
                 <w:delText>20/20 đạt</w:delText>
               </w:r>
             </w:del>
-            <w:ins w:id="1023" w:author="Cập nhật 28 - 29/9, bản 1.3.12 (Claude)" w:date="2026-09-29T08:21:37Z">
+            <w:ins w:id="1023" w:author="Cập nhật 28 - 29/9, bản 1.3.12 (Claude)" w:date="2026-09-29T09:02:01Z">
               <w:r>
                 <w:rPr>
                   <w:rFonts w:asciiTheme="majorHAnsi" w:hAnsiTheme="majorHAnsi" w:cstheme="majorHAnsi"/>
@@ -4058,7 +4086,7 @@
                 <w:szCs w:val="28"/>
               </w:rPr>
             </w:pPr>
-            <w:del w:id="1026" w:author="Cập nhật 28 - 29/9, bản 1.3.12 (Claude)" w:date="2026-09-29T08:21:37Z">
+            <w:del w:id="1028" w:author="Cập nhật 28 - 29/9, bản 1.3.12 (Claude)" w:date="2026-09-29T09:02:01Z">
               <w:r>
                 <w:rPr>
                   <w:rFonts w:asciiTheme="majorHAnsi" w:hAnsiTheme="majorHAnsi" w:cstheme="majorHAnsi"/>
@@ -4068,7 +4096,7 @@
                 <w:delText xml:space="preserve">Bản 1.3.2; ngày 27/9/2026</w:delText>
               </w:r>
             </w:del>
-            <w:ins w:id="1027" w:author="Cập nhật 28 - 29/9, bản 1.3.12 (Claude)" w:date="2026-09-29T08:21:37Z">
+            <w:ins w:id="1029" w:author="Cập nhật 28 - 29/9, bản 1.3.12 (Claude)" w:date="2026-09-29T09:02:01Z">
               <w:r>
                 <w:rPr>
                   <w:rFonts w:asciiTheme="majorHAnsi" w:hAnsiTheme="majorHAnsi" w:cstheme="majorHAnsi"/>
@@ -4095,7 +4123,7 @@
                 <w:szCs w:val="28"/>
               </w:rPr>
             </w:pPr>
-            <w:del w:id="1028" w:author="Cập nhật 28 - 29/9, bản 1.3.12 (Claude)" w:date="2026-09-29T08:21:37Z">
+            <w:del w:id="1030" w:author="Cập nhật 28 - 29/9, bản 1.3.12 (Claude)" w:date="2026-09-29T09:02:01Z">
               <w:r>
                 <w:rPr>
                   <w:rFonts w:asciiTheme="majorHAnsi" w:hAnsiTheme="majorHAnsi" w:cstheme="majorHAnsi"/>
@@ -4105,7 +4133,7 @@
                 <w:delText>15/15 ca, 30/30 lượt đạt</w:delText>
               </w:r>
             </w:del>
-            <w:ins w:id="1029" w:author="Cập nhật 28 - 29/9, bản 1.3.12 (Claude)" w:date="2026-09-29T08:21:37Z">
+            <w:ins w:id="1031" w:author="Cập nhật 28 - 29/9, bản 1.3.12 (Claude)" w:date="2026-09-29T09:02:01Z">
               <w:r>
                 <w:rPr>
                   <w:rFonts w:asciiTheme="majorHAnsi" w:hAnsiTheme="majorHAnsi" w:cstheme="majorHAnsi"/>
@@ -4162,7 +4190,7 @@
                 <w:szCs w:val="28"/>
               </w:rPr>
             </w:pPr>
-            <w:del w:id="1030" w:author="Cập nhật 28 - 29/9, bản 1.3.12 (Claude)" w:date="2026-09-29T08:21:37Z">
+            <w:del w:id="1032" w:author="Cập nhật 28 - 29/9, bản 1.3.12 (Claude)" w:date="2026-09-29T09:02:01Z">
               <w:r>
                 <w:rPr>
                   <w:rFonts w:asciiTheme="majorHAnsi" w:hAnsiTheme="majorHAnsi" w:cstheme="majorHAnsi"/>
@@ -4172,7 +4200,7 @@
                 <w:delText xml:space="preserve">Thao tác chặn ghi: chạy lại 1.653 câu lệnh thật trong nhật ký vận hành</w:delText>
               </w:r>
             </w:del>
-            <w:ins w:id="1031" w:author="Cập nhật 28 - 29/9, bản 1.3.12 (Claude)" w:date="2026-09-29T08:21:37Z">
+            <w:ins w:id="1033" w:author="Cập nhật 28 - 29/9, bản 1.3.12 (Claude)" w:date="2026-09-29T09:02:01Z">
               <w:r>
                 <w:rPr>
                   <w:rFonts w:asciiTheme="majorHAnsi" w:hAnsiTheme="majorHAnsi" w:cstheme="majorHAnsi"/>
@@ -4199,7 +4227,7 @@
                 <w:szCs w:val="28"/>
               </w:rPr>
             </w:pPr>
-            <w:del w:id="1032" w:author="Cập nhật 28 - 29/9, bản 1.3.12 (Claude)" w:date="2026-09-29T08:21:37Z">
+            <w:del w:id="1034" w:author="Cập nhật 28 - 29/9, bản 1.3.12 (Claude)" w:date="2026-09-29T09:02:01Z">
               <w:r>
                 <w:rPr>
                   <w:rFonts w:asciiTheme="majorHAnsi" w:hAnsiTheme="majorHAnsi" w:cstheme="majorHAnsi"/>
@@ -4209,7 +4237,7 @@
                 <w:delText xml:space="preserve">Bản 1.3.2; gồm các lệnh vượt chặn do thẩm định lần 3, lần 4 phát hiện (ca thử riêng)</w:delText>
               </w:r>
             </w:del>
-            <w:ins w:id="1033" w:author="Cập nhật 28 - 29/9, bản 1.3.12 (Claude)" w:date="2026-09-29T08:21:37Z">
+            <w:ins w:id="1035" w:author="Cập nhật 28 - 29/9, bản 1.3.12 (Claude)" w:date="2026-09-29T09:02:01Z">
               <w:r>
                 <w:rPr>
                   <w:rFonts w:asciiTheme="majorHAnsi" w:hAnsiTheme="majorHAnsi" w:cstheme="majorHAnsi"/>
@@ -4236,7 +4264,7 @@
                 <w:szCs w:val="28"/>
               </w:rPr>
             </w:pPr>
-            <w:del w:id="1034" w:author="Cập nhật 28 - 29/9, bản 1.3.12 (Claude)" w:date="2026-09-29T08:21:37Z">
+            <w:del w:id="1036" w:author="Cập nhật 28 - 29/9, bản 1.3.12 (Claude)" w:date="2026-09-29T09:02:01Z">
               <w:r>
                 <w:rPr>
                   <w:rFonts w:asciiTheme="majorHAnsi" w:hAnsiTheme="majorHAnsi" w:cstheme="majorHAnsi"/>
@@ -4246,7 +4274,7 @@
                 <w:delText xml:space="preserve">0 chặn nhầm</w:delText>
               </w:r>
             </w:del>
-            <w:ins w:id="1035" w:author="Cập nhật 28 - 29/9, bản 1.3.12 (Claude)" w:date="2026-09-29T08:21:37Z">
+            <w:ins w:id="1037" w:author="Cập nhật 28 - 29/9, bản 1.3.12 (Claude)" w:date="2026-09-29T09:02:01Z">
               <w:r>
                 <w:rPr>
                   <w:rFonts w:asciiTheme="majorHAnsi" w:hAnsiTheme="majorHAnsi" w:cstheme="majorHAnsi"/>
@@ -4416,7 +4444,7 @@
               </w:rPr>
               <w:t xml:space="preserve">Vận hành thực tế: người phụ trách dùng Bộ công cụ trong công việc của Phòng TH-HC&amp;QT </w:t>
             </w:r>
-            <w:del w:id="1036" w:author="Cập nhật 28 - 29/9, bản 1.3.12 (Claude)" w:date="2026-09-29T08:21:37Z">
+            <w:del w:id="1038" w:author="Cập nhật 28 - 29/9, bản 1.3.12 (Claude)" w:date="2026-09-29T09:02:01Z">
               <w:r>
                 <w:rPr>
                   <w:rFonts w:asciiTheme="majorHAnsi" w:hAnsiTheme="majorHAnsi" w:cstheme="majorHAnsi"/>
@@ -4426,7 +4454,7 @@
                 <w:delText xml:space="preserve">trên Claude Code (18 - 27/9/2026)</w:delText>
               </w:r>
             </w:del>
-            <w:ins w:id="1037" w:author="Cập nhật 28 - 29/9, bản 1.3.12 (Claude)" w:date="2026-09-29T08:21:37Z">
+            <w:ins w:id="1039" w:author="Cập nhật 28 - 29/9, bản 1.3.12 (Claude)" w:date="2026-09-29T09:02:01Z">
               <w:r>
                 <w:rPr>
                   <w:rFonts w:asciiTheme="majorHAnsi" w:hAnsiTheme="majorHAnsi" w:cstheme="majorHAnsi"/>
@@ -4478,7 +4506,7 @@
                 <w:szCs w:val="28"/>
               </w:rPr>
             </w:pPr>
-            <w:del w:id="1038" w:author="Cập nhật 28 - 29/9, bản 1.3.12 (Claude)" w:date="2026-09-29T08:21:37Z">
+            <w:del w:id="1040" w:author="Cập nhật 28 - 29/9, bản 1.3.12 (Claude)" w:date="2026-09-29T09:02:01Z">
               <w:r>
                 <w:rPr>
                   <w:rFonts w:asciiTheme="majorHAnsi" w:hAnsiTheme="majorHAnsi" w:cstheme="majorHAnsi"/>
@@ -4488,7 +4516,7 @@
                 <w:delText xml:space="preserve">10 ngày, 37 phiên, 2.024 thao tác</w:delText>
               </w:r>
             </w:del>
-            <w:ins w:id="1039" w:author="Cập nhật 28 - 29/9, bản 1.3.12 (Claude)" w:date="2026-09-29T08:21:37Z">
+            <w:ins w:id="1041" w:author="Cập nhật 28 - 29/9, bản 1.3.12 (Claude)" w:date="2026-09-29T09:02:01Z">
               <w:r>
                 <w:rPr>
                   <w:rFonts w:asciiTheme="majorHAnsi" w:hAnsiTheme="majorHAnsi" w:cstheme="majorHAnsi"/>
@@ -4512,7 +4540,7 @@
       <w:tr>
         <w:trPr>
           <w:jc w:val="center"/>
-          <w:ins w:id="1040" w:author="Cập nhật 28 - 29/9, bản 1.3.12 (Claude)" w:date="2026-09-29T08:21:37Z"/>
+          <w:ins w:id="1042" w:author="Cập nhật 28 - 29/9, bản 1.3.12 (Claude)" w:date="2026-09-29T09:02:01Z"/>
         </w:trPr>
         <w:tc>
           <w:tcPr>
@@ -4524,13 +4552,13 @@
               <w:widowControl w:val="0"/>
               <w:jc w:val="center"/>
               <w:rPr>
-                <w:ins w:id="1042" w:author="Cập nhật 28 - 29/9, bản 1.3.12 (Claude)" w:date="2026-09-29T08:21:37Z"/>
-                <w:rFonts w:asciiTheme="majorHAnsi" w:hAnsiTheme="majorHAnsi" w:cstheme="majorHAnsi"/>
-                <w:sz w:val="28"/>
-                <w:szCs w:val="28"/>
-              </w:rPr>
-            </w:pPr>
-            <w:ins w:id="1041" w:author="Cập nhật 28 - 29/9, bản 1.3.12 (Claude)" w:date="2026-09-29T08:21:37Z">
+                <w:ins w:id="1044" w:author="Cập nhật 28 - 29/9, bản 1.3.12 (Claude)" w:date="2026-09-29T09:02:01Z"/>
+                <w:rFonts w:asciiTheme="majorHAnsi" w:hAnsiTheme="majorHAnsi" w:cstheme="majorHAnsi"/>
+                <w:sz w:val="28"/>
+                <w:szCs w:val="28"/>
+              </w:rPr>
+            </w:pPr>
+            <w:ins w:id="1043" w:author="Cập nhật 28 - 29/9, bản 1.3.12 (Claude)" w:date="2026-09-29T09:02:01Z">
               <w:r>
                 <w:rPr>
                   <w:rFonts w:asciiTheme="majorHAnsi" w:hAnsiTheme="majorHAnsi" w:cstheme="majorHAnsi"/>
@@ -4552,13 +4580,13 @@
               <w:widowControl w:val="0"/>
               <w:jc w:val="both"/>
               <w:rPr>
-                <w:ins w:id="1044" w:author="Cập nhật 28 - 29/9, bản 1.3.12 (Claude)" w:date="2026-09-29T08:21:37Z"/>
-                <w:rFonts w:asciiTheme="majorHAnsi" w:hAnsiTheme="majorHAnsi" w:cstheme="majorHAnsi"/>
-                <w:sz w:val="28"/>
-                <w:szCs w:val="28"/>
-              </w:rPr>
-            </w:pPr>
-            <w:ins w:id="1043" w:author="Cập nhật 28 - 29/9, bản 1.3.12 (Claude)" w:date="2026-09-29T08:21:37Z">
+                <w:ins w:id="1046" w:author="Cập nhật 28 - 29/9, bản 1.3.12 (Claude)" w:date="2026-09-29T09:02:01Z"/>
+                <w:rFonts w:asciiTheme="majorHAnsi" w:hAnsiTheme="majorHAnsi" w:cstheme="majorHAnsi"/>
+                <w:sz w:val="28"/>
+                <w:szCs w:val="28"/>
+              </w:rPr>
+            </w:pPr>
+            <w:ins w:id="1045" w:author="Cập nhật 28 - 29/9, bản 1.3.12 (Claude)" w:date="2026-09-29T09:02:01Z">
               <w:r>
                 <w:rPr>
                   <w:rFonts w:asciiTheme="majorHAnsi" w:hAnsiTheme="majorHAnsi" w:cstheme="majorHAnsi"/>
@@ -4580,13 +4608,13 @@
               <w:widowControl w:val="0"/>
               <w:jc w:val="both"/>
               <w:rPr>
-                <w:ins w:id="1046" w:author="Cập nhật 28 - 29/9, bản 1.3.12 (Claude)" w:date="2026-09-29T08:21:37Z"/>
-                <w:rFonts w:asciiTheme="majorHAnsi" w:hAnsiTheme="majorHAnsi" w:cstheme="majorHAnsi"/>
-                <w:sz w:val="28"/>
-                <w:szCs w:val="28"/>
-              </w:rPr>
-            </w:pPr>
-            <w:ins w:id="1045" w:author="Cập nhật 28 - 29/9, bản 1.3.12 (Claude)" w:date="2026-09-29T08:21:37Z">
+                <w:ins w:id="1048" w:author="Cập nhật 28 - 29/9, bản 1.3.12 (Claude)" w:date="2026-09-29T09:02:01Z"/>
+                <w:rFonts w:asciiTheme="majorHAnsi" w:hAnsiTheme="majorHAnsi" w:cstheme="majorHAnsi"/>
+                <w:sz w:val="28"/>
+                <w:szCs w:val="28"/>
+              </w:rPr>
+            </w:pPr>
+            <w:ins w:id="1047" w:author="Cập nhật 28 - 29/9, bản 1.3.12 (Claude)" w:date="2026-09-29T09:02:01Z">
               <w:r>
                 <w:rPr>
                   <w:rFonts w:asciiTheme="majorHAnsi" w:hAnsiTheme="majorHAnsi" w:cstheme="majorHAnsi"/>
@@ -4608,13 +4636,13 @@
               <w:widowControl w:val="0"/>
               <w:jc w:val="center"/>
               <w:rPr>
-                <w:ins w:id="1048" w:author="Cập nhật 28 - 29/9, bản 1.3.12 (Claude)" w:date="2026-09-29T08:21:37Z"/>
-                <w:rFonts w:asciiTheme="majorHAnsi" w:hAnsiTheme="majorHAnsi" w:cstheme="majorHAnsi"/>
-                <w:sz w:val="28"/>
-                <w:szCs w:val="28"/>
-              </w:rPr>
-            </w:pPr>
-            <w:ins w:id="1047" w:author="Cập nhật 28 - 29/9, bản 1.3.12 (Claude)" w:date="2026-09-29T08:21:37Z">
+                <w:ins w:id="1050" w:author="Cập nhật 28 - 29/9, bản 1.3.12 (Claude)" w:date="2026-09-29T09:02:01Z"/>
+                <w:rFonts w:asciiTheme="majorHAnsi" w:hAnsiTheme="majorHAnsi" w:cstheme="majorHAnsi"/>
+                <w:sz w:val="28"/>
+                <w:szCs w:val="28"/>
+              </w:rPr>
+            </w:pPr>
+            <w:ins w:id="1049" w:author="Cập nhật 28 - 29/9, bản 1.3.12 (Claude)" w:date="2026-09-29T09:02:01Z">
               <w:r>
                 <w:rPr>
                   <w:rFonts w:asciiTheme="majorHAnsi" w:hAnsiTheme="majorHAnsi" w:cstheme="majorHAnsi"/>
@@ -4630,7 +4658,7 @@
       <w:tr>
         <w:trPr>
           <w:jc w:val="center"/>
-          <w:ins w:id="1049" w:author="Cập nhật 28 - 29/9, bản 1.3.12 (Claude)" w:date="2026-09-29T08:21:37Z"/>
+          <w:ins w:id="1051" w:author="Cập nhật 28 - 29/9, bản 1.3.12 (Claude)" w:date="2026-09-29T09:02:01Z"/>
         </w:trPr>
         <w:tc>
           <w:tcPr>
@@ -4642,14 +4670,14 @@
               <w:widowControl w:val="0"/>
               <w:jc w:val="center"/>
               <w:rPr>
-                <w:ins w:id="1051" w:author="Cập nhật 28 - 29/9, bản 1.3.12 (Claude)" w:date="2026-09-29T08:21:37Z"/>
-                <w:ins w:id="1042" w:author="Cập nhật 28 - 29/9, bản 1.3.12 (Claude)" w:date="2026-09-29T08:21:37Z"/>
-                <w:rFonts w:asciiTheme="majorHAnsi" w:hAnsiTheme="majorHAnsi" w:cstheme="majorHAnsi"/>
-                <w:sz w:val="28"/>
-                <w:szCs w:val="28"/>
-              </w:rPr>
-            </w:pPr>
-            <w:ins w:id="1050" w:author="Cập nhật 28 - 29/9, bản 1.3.12 (Claude)" w:date="2026-09-29T08:21:37Z">
+                <w:ins w:id="1053" w:author="Cập nhật 28 - 29/9, bản 1.3.12 (Claude)" w:date="2026-09-29T09:02:01Z"/>
+                <w:ins w:id="1044" w:author="Cập nhật 28 - 29/9, bản 1.3.12 (Claude)" w:date="2026-09-29T09:02:01Z"/>
+                <w:rFonts w:asciiTheme="majorHAnsi" w:hAnsiTheme="majorHAnsi" w:cstheme="majorHAnsi"/>
+                <w:sz w:val="28"/>
+                <w:szCs w:val="28"/>
+              </w:rPr>
+            </w:pPr>
+            <w:ins w:id="1052" w:author="Cập nhật 28 - 29/9, bản 1.3.12 (Claude)" w:date="2026-09-29T09:02:01Z">
               <w:r>
                 <w:rPr>
                   <w:rFonts w:asciiTheme="majorHAnsi" w:hAnsiTheme="majorHAnsi" w:cstheme="majorHAnsi"/>
@@ -4671,14 +4699,14 @@
               <w:widowControl w:val="0"/>
               <w:jc w:val="both"/>
               <w:rPr>
-                <w:ins w:id="1053" w:author="Cập nhật 28 - 29/9, bản 1.3.12 (Claude)" w:date="2026-09-29T08:21:37Z"/>
-                <w:ins w:id="1044" w:author="Cập nhật 28 - 29/9, bản 1.3.12 (Claude)" w:date="2026-09-29T08:21:37Z"/>
-                <w:rFonts w:asciiTheme="majorHAnsi" w:hAnsiTheme="majorHAnsi" w:cstheme="majorHAnsi"/>
-                <w:sz w:val="28"/>
-                <w:szCs w:val="28"/>
-              </w:rPr>
-            </w:pPr>
-            <w:ins w:id="1052" w:author="Cập nhật 28 - 29/9, bản 1.3.12 (Claude)" w:date="2026-09-29T08:21:37Z">
+                <w:ins w:id="1055" w:author="Cập nhật 28 - 29/9, bản 1.3.12 (Claude)" w:date="2026-09-29T09:02:01Z"/>
+                <w:ins w:id="1046" w:author="Cập nhật 28 - 29/9, bản 1.3.12 (Claude)" w:date="2026-09-29T09:02:01Z"/>
+                <w:rFonts w:asciiTheme="majorHAnsi" w:hAnsiTheme="majorHAnsi" w:cstheme="majorHAnsi"/>
+                <w:sz w:val="28"/>
+                <w:szCs w:val="28"/>
+              </w:rPr>
+            </w:pPr>
+            <w:ins w:id="1054" w:author="Cập nhật 28 - 29/9, bản 1.3.12 (Claude)" w:date="2026-09-29T09:02:01Z">
               <w:r>
                 <w:rPr>
                   <w:rFonts w:asciiTheme="majorHAnsi" w:hAnsiTheme="majorHAnsi" w:cstheme="majorHAnsi"/>
@@ -4700,14 +4728,14 @@
               <w:widowControl w:val="0"/>
               <w:jc w:val="both"/>
               <w:rPr>
-                <w:ins w:id="1055" w:author="Cập nhật 28 - 29/9, bản 1.3.12 (Claude)" w:date="2026-09-29T08:21:37Z"/>
-                <w:ins w:id="1046" w:author="Cập nhật 28 - 29/9, bản 1.3.12 (Claude)" w:date="2026-09-29T08:21:37Z"/>
-                <w:rFonts w:asciiTheme="majorHAnsi" w:hAnsiTheme="majorHAnsi" w:cstheme="majorHAnsi"/>
-                <w:sz w:val="28"/>
-                <w:szCs w:val="28"/>
-              </w:rPr>
-            </w:pPr>
-            <w:ins w:id="1054" w:author="Cập nhật 28 - 29/9, bản 1.3.12 (Claude)" w:date="2026-09-29T08:21:37Z">
+                <w:ins w:id="1057" w:author="Cập nhật 28 - 29/9, bản 1.3.12 (Claude)" w:date="2026-09-29T09:02:01Z"/>
+                <w:ins w:id="1048" w:author="Cập nhật 28 - 29/9, bản 1.3.12 (Claude)" w:date="2026-09-29T09:02:01Z"/>
+                <w:rFonts w:asciiTheme="majorHAnsi" w:hAnsiTheme="majorHAnsi" w:cstheme="majorHAnsi"/>
+                <w:sz w:val="28"/>
+                <w:szCs w:val="28"/>
+              </w:rPr>
+            </w:pPr>
+            <w:ins w:id="1056" w:author="Cập nhật 28 - 29/9, bản 1.3.12 (Claude)" w:date="2026-09-29T09:02:01Z">
               <w:r>
                 <w:rPr>
                   <w:rFonts w:asciiTheme="majorHAnsi" w:hAnsiTheme="majorHAnsi" w:cstheme="majorHAnsi"/>
@@ -4729,14 +4757,14 @@
               <w:widowControl w:val="0"/>
               <w:jc w:val="center"/>
               <w:rPr>
-                <w:ins w:id="1057" w:author="Cập nhật 28 - 29/9, bản 1.3.12 (Claude)" w:date="2026-09-29T08:21:37Z"/>
-                <w:ins w:id="1048" w:author="Cập nhật 28 - 29/9, bản 1.3.12 (Claude)" w:date="2026-09-29T08:21:37Z"/>
-                <w:rFonts w:asciiTheme="majorHAnsi" w:hAnsiTheme="majorHAnsi" w:cstheme="majorHAnsi"/>
-                <w:sz w:val="28"/>
-                <w:szCs w:val="28"/>
-              </w:rPr>
-            </w:pPr>
-            <w:ins w:id="1056" w:author="Cập nhật 28 - 29/9, bản 1.3.12 (Claude)" w:date="2026-09-29T08:21:37Z">
+                <w:ins w:id="1059" w:author="Cập nhật 28 - 29/9, bản 1.3.12 (Claude)" w:date="2026-09-29T09:02:01Z"/>
+                <w:ins w:id="1050" w:author="Cập nhật 28 - 29/9, bản 1.3.12 (Claude)" w:date="2026-09-29T09:02:01Z"/>
+                <w:rFonts w:asciiTheme="majorHAnsi" w:hAnsiTheme="majorHAnsi" w:cstheme="majorHAnsi"/>
+                <w:sz w:val="28"/>
+                <w:szCs w:val="28"/>
+              </w:rPr>
+            </w:pPr>
+            <w:ins w:id="1058" w:author="Cập nhật 28 - 29/9, bản 1.3.12 (Claude)" w:date="2026-09-29T09:02:01Z">
               <w:r>
                 <w:rPr>
                   <w:rFonts w:asciiTheme="majorHAnsi" w:hAnsiTheme="majorHAnsi" w:cstheme="majorHAnsi"/>
@@ -4752,7 +4780,7 @@
       <w:tr>
         <w:trPr>
           <w:jc w:val="center"/>
-          <w:ins w:id="1058" w:author="Cập nhật 28 - 29/9, bản 1.3.12 (Claude)" w:date="2026-09-29T08:21:37Z"/>
+          <w:ins w:id="1060" w:author="Cập nhật 28 - 29/9, bản 1.3.12 (Claude)" w:date="2026-09-29T09:02:01Z"/>
         </w:trPr>
         <w:tc>
           <w:tcPr>
@@ -4764,15 +4792,15 @@
               <w:widowControl w:val="0"/>
               <w:jc w:val="center"/>
               <w:rPr>
-                <w:ins w:id="1060" w:author="Cập nhật 28 - 29/9, bản 1.3.12 (Claude)" w:date="2026-09-29T08:21:37Z"/>
-                <w:ins w:id="1051" w:author="Cập nhật 28 - 29/9, bản 1.3.12 (Claude)" w:date="2026-09-29T08:21:37Z"/>
-                <w:ins w:id="1042" w:author="Cập nhật 28 - 29/9, bản 1.3.12 (Claude)" w:date="2026-09-29T08:21:37Z"/>
-                <w:rFonts w:asciiTheme="majorHAnsi" w:hAnsiTheme="majorHAnsi" w:cstheme="majorHAnsi"/>
-                <w:sz w:val="28"/>
-                <w:szCs w:val="28"/>
-              </w:rPr>
-            </w:pPr>
-            <w:ins w:id="1059" w:author="Cập nhật 28 - 29/9, bản 1.3.12 (Claude)" w:date="2026-09-29T08:21:37Z">
+                <w:ins w:id="1062" w:author="Cập nhật 28 - 29/9, bản 1.3.12 (Claude)" w:date="2026-09-29T09:02:01Z"/>
+                <w:ins w:id="1053" w:author="Cập nhật 28 - 29/9, bản 1.3.12 (Claude)" w:date="2026-09-29T09:02:01Z"/>
+                <w:ins w:id="1044" w:author="Cập nhật 28 - 29/9, bản 1.3.12 (Claude)" w:date="2026-09-29T09:02:01Z"/>
+                <w:rFonts w:asciiTheme="majorHAnsi" w:hAnsiTheme="majorHAnsi" w:cstheme="majorHAnsi"/>
+                <w:sz w:val="28"/>
+                <w:szCs w:val="28"/>
+              </w:rPr>
+            </w:pPr>
+            <w:ins w:id="1061" w:author="Cập nhật 28 - 29/9, bản 1.3.12 (Claude)" w:date="2026-09-29T09:02:01Z">
               <w:r>
                 <w:rPr>
                   <w:rFonts w:asciiTheme="majorHAnsi" w:hAnsiTheme="majorHAnsi" w:cstheme="majorHAnsi"/>
@@ -4794,22 +4822,22 @@
               <w:widowControl w:val="0"/>
               <w:jc w:val="both"/>
               <w:rPr>
-                <w:ins w:id="1062" w:author="Cập nhật 28 - 29/9, bản 1.3.12 (Claude)" w:date="2026-09-29T08:21:37Z"/>
-                <w:ins w:id="1053" w:author="Cập nhật 28 - 29/9, bản 1.3.12 (Claude)" w:date="2026-09-29T08:21:37Z"/>
-                <w:ins w:id="1044" w:author="Cập nhật 28 - 29/9, bản 1.3.12 (Claude)" w:date="2026-09-29T08:21:37Z"/>
-                <w:rFonts w:asciiTheme="majorHAnsi" w:hAnsiTheme="majorHAnsi" w:cstheme="majorHAnsi"/>
-                <w:sz w:val="28"/>
-                <w:szCs w:val="28"/>
-              </w:rPr>
-            </w:pPr>
-            <w:ins w:id="1061" w:author="Cập nhật 28 - 29/9, bản 1.3.12 (Claude)" w:date="2026-09-29T08:21:37Z">
+                <w:ins w:id="1064" w:author="Cập nhật 28 - 29/9, bản 1.3.12 (Claude)" w:date="2026-09-29T09:02:01Z"/>
+                <w:ins w:id="1055" w:author="Cập nhật 28 - 29/9, bản 1.3.12 (Claude)" w:date="2026-09-29T09:02:01Z"/>
+                <w:ins w:id="1046" w:author="Cập nhật 28 - 29/9, bản 1.3.12 (Claude)" w:date="2026-09-29T09:02:01Z"/>
+                <w:rFonts w:asciiTheme="majorHAnsi" w:hAnsiTheme="majorHAnsi" w:cstheme="majorHAnsi"/>
+                <w:sz w:val="28"/>
+                <w:szCs w:val="28"/>
+              </w:rPr>
+            </w:pPr>
+            <w:ins w:id="1063" w:author="Cập nhật 28 - 29/9, bản 1.3.12 (Claude)" w:date="2026-09-29T09:02:01Z">
               <w:r>
                 <w:rPr>
                   <w:rFonts w:asciiTheme="majorHAnsi" w:hAnsiTheme="majorHAnsi" w:cstheme="majorHAnsi"/>
                   <w:sz w:val="28"/>
                   <w:szCs w:val="28"/>
                 </w:rPr>
-                <w:t xml:space="preserve">Đo thể thức văn bản: công cụ đo ánh xạ Checklist 01, 05, 08 của bộ quy tắc KTC-Ra-Soat-897 (bảng tiêu đề, đường kẻ, cỡ và kiểu chữ từng thành phần theo Thông báo số 597/TB-CĐKT, số trang, người ký); ca thử ngược từng lỗi</w:t>
+                <w:t xml:space="preserve">Đo thể thức văn bản: công cụ đo ánh xạ Checklist 01, 05, 08 của bộ quy tắc KTC-Ra-Soat-897 (bảng tiêu đề, đường kẻ, cỡ và kiểu chữ từng thành phần theo Thông báo số 597/TB-CĐKT ngày 19/5/2026, số trang, người ký); ca thử ngược từng lỗi</w:t>
               </w:r>
             </w:ins>
           </w:p>
@@ -4824,15 +4852,15 @@
               <w:widowControl w:val="0"/>
               <w:jc w:val="both"/>
               <w:rPr>
-                <w:ins w:id="1064" w:author="Cập nhật 28 - 29/9, bản 1.3.12 (Claude)" w:date="2026-09-29T08:21:37Z"/>
-                <w:ins w:id="1055" w:author="Cập nhật 28 - 29/9, bản 1.3.12 (Claude)" w:date="2026-09-29T08:21:37Z"/>
-                <w:ins w:id="1046" w:author="Cập nhật 28 - 29/9, bản 1.3.12 (Claude)" w:date="2026-09-29T08:21:37Z"/>
-                <w:rFonts w:asciiTheme="majorHAnsi" w:hAnsiTheme="majorHAnsi" w:cstheme="majorHAnsi"/>
-                <w:sz w:val="28"/>
-                <w:szCs w:val="28"/>
-              </w:rPr>
-            </w:pPr>
-            <w:ins w:id="1063" w:author="Cập nhật 28 - 29/9, bản 1.3.12 (Claude)" w:date="2026-09-29T08:21:37Z">
+                <w:ins w:id="1066" w:author="Cập nhật 28 - 29/9, bản 1.3.12 (Claude)" w:date="2026-09-29T09:02:01Z"/>
+                <w:ins w:id="1057" w:author="Cập nhật 28 - 29/9, bản 1.3.12 (Claude)" w:date="2026-09-29T09:02:01Z"/>
+                <w:ins w:id="1048" w:author="Cập nhật 28 - 29/9, bản 1.3.12 (Claude)" w:date="2026-09-29T09:02:01Z"/>
+                <w:rFonts w:asciiTheme="majorHAnsi" w:hAnsiTheme="majorHAnsi" w:cstheme="majorHAnsi"/>
+                <w:sz w:val="28"/>
+                <w:szCs w:val="28"/>
+              </w:rPr>
+            </w:pPr>
+            <w:ins w:id="1065" w:author="Cập nhật 28 - 29/9, bản 1.3.12 (Claude)" w:date="2026-09-29T09:02:01Z">
               <w:r>
                 <w:rPr>
                   <w:rFonts w:asciiTheme="majorHAnsi" w:hAnsiTheme="majorHAnsi" w:cstheme="majorHAnsi"/>
@@ -4854,22 +4882,152 @@
               <w:widowControl w:val="0"/>
               <w:jc w:val="center"/>
               <w:rPr>
-                <w:ins w:id="1066" w:author="Cập nhật 28 - 29/9, bản 1.3.12 (Claude)" w:date="2026-09-29T08:21:37Z"/>
-                <w:ins w:id="1057" w:author="Cập nhật 28 - 29/9, bản 1.3.12 (Claude)" w:date="2026-09-29T08:21:37Z"/>
-                <w:ins w:id="1048" w:author="Cập nhật 28 - 29/9, bản 1.3.12 (Claude)" w:date="2026-09-29T08:21:37Z"/>
-                <w:rFonts w:asciiTheme="majorHAnsi" w:hAnsiTheme="majorHAnsi" w:cstheme="majorHAnsi"/>
-                <w:sz w:val="28"/>
-                <w:szCs w:val="28"/>
-              </w:rPr>
-            </w:pPr>
-            <w:ins w:id="1065" w:author="Cập nhật 28 - 29/9, bản 1.3.12 (Claude)" w:date="2026-09-29T08:21:37Z">
+                <w:ins w:id="1068" w:author="Cập nhật 28 - 29/9, bản 1.3.12 (Claude)" w:date="2026-09-29T09:02:01Z"/>
+                <w:ins w:id="1059" w:author="Cập nhật 28 - 29/9, bản 1.3.12 (Claude)" w:date="2026-09-29T09:02:01Z"/>
+                <w:ins w:id="1050" w:author="Cập nhật 28 - 29/9, bản 1.3.12 (Claude)" w:date="2026-09-29T09:02:01Z"/>
+                <w:rFonts w:asciiTheme="majorHAnsi" w:hAnsiTheme="majorHAnsi" w:cstheme="majorHAnsi"/>
+                <w:sz w:val="28"/>
+                <w:szCs w:val="28"/>
+              </w:rPr>
+            </w:pPr>
+            <w:ins w:id="1067" w:author="Cập nhật 28 - 29/9, bản 1.3.12 (Claude)" w:date="2026-09-29T09:02:01Z">
               <w:r>
                 <w:rPr>
                   <w:rFonts w:asciiTheme="majorHAnsi" w:hAnsiTheme="majorHAnsi" w:cstheme="majorHAnsi"/>
                   <w:sz w:val="28"/>
                   <w:szCs w:val="28"/>
                 </w:rPr>
-                <w:t xml:space="preserve">Bắt đủ 7 loại lỗi của thông báo dựng tay ngày 28/9/2026 (trước đó công cụ báo đạt); phát hiện lỗi thật của 5 mẫu trống (01, 02A, 03A, 06D, 07), ghi để người có thẩm quyền sửa kho; thông báo ráp lại vào mẫu 03A: 0 lỗi, đã xem trang bằng Word</w:t>
+                <w:t xml:space="preserve">Bắt đủ 7 loại lỗi của thông báo dựng tay ngày 28/9/2026 (trước đó công cụ báo đạt); phát hiện lỗi thể thức của 5 mẫu trống (01, 02A, 03A, 06D, 07), ghi để người có thẩm quyền sửa kho; thông báo ráp lại vào mẫu 03A: 0 lỗi, đã kiểm tra hiển thị từng trang</w:t>
+              </w:r>
+            </w:ins>
+          </w:p>
+        </w:tc>
+      </w:tr>
+      <w:tr>
+        <w:trPr>
+          <w:jc w:val="center"/>
+          <w:ins w:id="1069" w:author="Cập nhật 28 - 29/9, bản 1.3.12 (Claude)" w:date="2026-09-29T09:02:01Z"/>
+        </w:trPr>
+        <w:tc>
+          <w:tcPr>
+            <w:tcW w:w="704" w:type="dxa"/>
+            <w:vAlign w:val="center"/>
+          </w:tcPr>
+          <w:p>
+            <w:pPr>
+              <w:widowControl w:val="0"/>
+              <w:jc w:val="center"/>
+              <w:rPr>
+                <w:ins w:id="1071" w:author="Cập nhật 28 - 29/9, bản 1.3.12 (Claude)" w:date="2026-09-29T09:02:01Z"/>
+                <w:ins w:id="1062" w:author="Cập nhật 28 - 29/9, bản 1.3.12 (Claude)" w:date="2026-09-29T09:02:01Z"/>
+                <w:ins w:id="1053" w:author="Cập nhật 28 - 29/9, bản 1.3.12 (Claude)" w:date="2026-09-29T09:02:01Z"/>
+                <w:ins w:id="1044" w:author="Cập nhật 28 - 29/9, bản 1.3.12 (Claude)" w:date="2026-09-29T09:02:01Z"/>
+                <w:rFonts w:asciiTheme="majorHAnsi" w:hAnsiTheme="majorHAnsi" w:cstheme="majorHAnsi"/>
+                <w:sz w:val="28"/>
+                <w:szCs w:val="28"/>
+              </w:rPr>
+            </w:pPr>
+            <w:ins w:id="1070" w:author="Cập nhật 28 - 29/9, bản 1.3.12 (Claude)" w:date="2026-09-29T09:02:01Z">
+              <w:r>
+                <w:rPr>
+                  <w:rFonts w:asciiTheme="majorHAnsi" w:hAnsiTheme="majorHAnsi" w:cstheme="majorHAnsi"/>
+                  <w:sz w:val="28"/>
+                  <w:szCs w:val="28"/>
+                </w:rPr>
+                <w:t xml:space="preserve">14</w:t>
+              </w:r>
+            </w:ins>
+          </w:p>
+        </w:tc>
+        <w:tc>
+          <w:tcPr>
+            <w:tcW w:w="3600" w:type="dxa"/>
+            <w:vAlign w:val="center"/>
+          </w:tcPr>
+          <w:p>
+            <w:pPr>
+              <w:widowControl w:val="0"/>
+              <w:jc w:val="both"/>
+              <w:rPr>
+                <w:ins w:id="1073" w:author="Cập nhật 28 - 29/9, bản 1.3.12 (Claude)" w:date="2026-09-29T09:02:01Z"/>
+                <w:ins w:id="1064" w:author="Cập nhật 28 - 29/9, bản 1.3.12 (Claude)" w:date="2026-09-29T09:02:01Z"/>
+                <w:ins w:id="1055" w:author="Cập nhật 28 - 29/9, bản 1.3.12 (Claude)" w:date="2026-09-29T09:02:01Z"/>
+                <w:ins w:id="1046" w:author="Cập nhật 28 - 29/9, bản 1.3.12 (Claude)" w:date="2026-09-29T09:02:01Z"/>
+                <w:rFonts w:asciiTheme="majorHAnsi" w:hAnsiTheme="majorHAnsi" w:cstheme="majorHAnsi"/>
+                <w:sz w:val="28"/>
+                <w:szCs w:val="28"/>
+              </w:rPr>
+            </w:pPr>
+            <w:ins w:id="1072" w:author="Cập nhật 28 - 29/9, bản 1.3.12 (Claude)" w:date="2026-09-29T09:02:01Z">
+              <w:r>
+                <w:rPr>
+                  <w:rFonts w:asciiTheme="majorHAnsi" w:hAnsiTheme="majorHAnsi" w:cstheme="majorHAnsi"/>
+                  <w:sz w:val="28"/>
+                  <w:szCs w:val="28"/>
+                </w:rPr>
+                <w:t xml:space="preserve">Nghiệm thu lại toàn bộ 15 ca trên bản hiện hành (claude plugin eval, 2 lượt mỗi ca)</w:t>
+              </w:r>
+            </w:ins>
+          </w:p>
+        </w:tc>
+        <w:tc>
+          <w:tcPr>
+            <w:tcW w:w="3600" w:type="dxa"/>
+            <w:vAlign w:val="center"/>
+          </w:tcPr>
+          <w:p>
+            <w:pPr>
+              <w:widowControl w:val="0"/>
+              <w:jc w:val="both"/>
+              <w:rPr>
+                <w:ins w:id="1075" w:author="Cập nhật 28 - 29/9, bản 1.3.12 (Claude)" w:date="2026-09-29T09:02:01Z"/>
+                <w:ins w:id="1066" w:author="Cập nhật 28 - 29/9, bản 1.3.12 (Claude)" w:date="2026-09-29T09:02:01Z"/>
+                <w:ins w:id="1057" w:author="Cập nhật 28 - 29/9, bản 1.3.12 (Claude)" w:date="2026-09-29T09:02:01Z"/>
+                <w:ins w:id="1048" w:author="Cập nhật 28 - 29/9, bản 1.3.12 (Claude)" w:date="2026-09-29T09:02:01Z"/>
+                <w:rFonts w:asciiTheme="majorHAnsi" w:hAnsiTheme="majorHAnsi" w:cstheme="majorHAnsi"/>
+                <w:sz w:val="28"/>
+                <w:szCs w:val="28"/>
+              </w:rPr>
+            </w:pPr>
+            <w:ins w:id="1074" w:author="Cập nhật 28 - 29/9, bản 1.3.12 (Claude)" w:date="2026-09-29T09:02:01Z">
+              <w:r>
+                <w:rPr>
+                  <w:rFonts w:asciiTheme="majorHAnsi" w:hAnsiTheme="majorHAnsi" w:cstheme="majorHAnsi"/>
+                  <w:sz w:val="28"/>
+                  <w:szCs w:val="28"/>
+                </w:rPr>
+                <w:t xml:space="preserve">Bản 1.3.12; ngày 29/9/2026</w:t>
+              </w:r>
+            </w:ins>
+          </w:p>
+        </w:tc>
+        <w:tc>
+          <w:tcPr>
+            <w:tcW w:w="1163" w:type="dxa"/>
+            <w:vAlign w:val="center"/>
+          </w:tcPr>
+          <w:p>
+            <w:pPr>
+              <w:widowControl w:val="0"/>
+              <w:jc w:val="center"/>
+              <w:rPr>
+                <w:ins w:id="1077" w:author="Cập nhật 28 - 29/9, bản 1.3.12 (Claude)" w:date="2026-09-29T09:02:01Z"/>
+                <w:ins w:id="1068" w:author="Cập nhật 28 - 29/9, bản 1.3.12 (Claude)" w:date="2026-09-29T09:02:01Z"/>
+                <w:ins w:id="1059" w:author="Cập nhật 28 - 29/9, bản 1.3.12 (Claude)" w:date="2026-09-29T09:02:01Z"/>
+                <w:ins w:id="1050" w:author="Cập nhật 28 - 29/9, bản 1.3.12 (Claude)" w:date="2026-09-29T09:02:01Z"/>
+                <w:rFonts w:asciiTheme="majorHAnsi" w:hAnsiTheme="majorHAnsi" w:cstheme="majorHAnsi"/>
+                <w:sz w:val="28"/>
+                <w:szCs w:val="28"/>
+              </w:rPr>
+            </w:pPr>
+            <w:ins w:id="1076" w:author="Cập nhật 28 - 29/9, bản 1.3.12 (Claude)" w:date="2026-09-29T09:02:01Z">
+              <w:r>
+                <w:rPr>
+                  <w:rFonts w:asciiTheme="majorHAnsi" w:hAnsiTheme="majorHAnsi" w:cstheme="majorHAnsi"/>
+                  <w:sz w:val="28"/>
+                  <w:szCs w:val="28"/>
+                </w:rPr>
+                <w:t xml:space="preserve">14/15 ca, 28/30 lượt đạt; ca 15 (2 lượt) bị bộ chấm tất định chấm trượt vì câu trả lời trích lại yêu cầu của người dùng trong lời giải thích (giám khảo LLM chấm đạt cả 2 lượt, 3/3 phiếu); đã sửa bộ chấm, chạy lại ca 15: 2/2 lượt đạt</w:t>
               </w:r>
             </w:ins>
           </w:p>
@@ -4969,7 +5127,7 @@
           <w:shd w:val="clear" w:color="auto" w:fill="FFFFFF"/>
         </w:rPr>
       </w:pPr>
-      <w:del w:id="1067" w:author="Cập nhật 28 - 29/9, bản 1.3.12 (Claude)" w:date="2026-09-29T08:21:37Z">
+      <w:del w:id="1078" w:author="Cập nhật 28 - 29/9, bản 1.3.12 (Claude)" w:date="2026-09-29T09:02:01Z">
         <w:r>
           <w:rPr>
             <w:rFonts w:asciiTheme="majorHAnsi" w:hAnsiTheme="majorHAnsi" w:cstheme="majorHAnsi"/>
@@ -4980,7 +5138,7 @@
           <w:delText xml:space="preserve">- Hai thang điểm quy đổi khối lượng công việc chưa có văn bản phân định; một số nội dung đánh giá KPI chờ ý kiến Phòng TCCB&amp;CTHSSV;</w:delText>
         </w:r>
       </w:del>
-      <w:ins w:id="1068" w:author="Cập nhật 28 - 29/9, bản 1.3.12 (Claude)" w:date="2026-09-29T08:21:37Z">
+      <w:ins w:id="1079" w:author="Cập nhật 28 - 29/9, bản 1.3.12 (Claude)" w:date="2026-09-29T09:02:01Z">
         <w:r>
           <w:rPr>
             <w:rFonts w:asciiTheme="majorHAnsi" w:hAnsiTheme="majorHAnsi" w:cstheme="majorHAnsi"/>
@@ -5331,7 +5489,7 @@
                 <w:szCs w:val="28"/>
               </w:rPr>
             </w:pPr>
-            <w:del w:id="1069" w:author="Cập nhật 28 - 29/9, bản 1.3.12 (Claude)" w:date="2026-09-29T08:21:37Z">
+            <w:del w:id="1080" w:author="Cập nhật 28 - 29/9, bản 1.3.12 (Claude)" w:date="2026-09-29T09:02:01Z">
               <w:r>
                 <w:rPr>
                   <w:rFonts w:asciiTheme="majorHAnsi" w:hAnsiTheme="majorHAnsi" w:cstheme="majorHAnsi"/>
@@ -5343,7 +5501,7 @@
                 <w:delText>Trạng thái ngày 27/9/2026</w:delText>
               </w:r>
             </w:del>
-            <w:ins w:id="1070" w:author="Cập nhật 28 - 29/9, bản 1.3.12 (Claude)" w:date="2026-09-29T08:21:37Z">
+            <w:ins w:id="1081" w:author="Cập nhật 28 - 29/9, bản 1.3.12 (Claude)" w:date="2026-09-29T09:02:01Z">
               <w:r>
                 <w:rPr>
                   <w:rFonts w:asciiTheme="majorHAnsi" w:hAnsiTheme="majorHAnsi" w:cstheme="majorHAnsi"/>
@@ -6311,7 +6469,7 @@
               </w:rPr>
               <w:t xml:space="preserve">nâng 1.2.1 lên 1.3.0, </w:t>
             </w:r>
-            <w:del w:id="1071" w:author="Cập nhật 28 - 29/9, bản 1.3.12 (Claude)" w:date="2026-09-29T08:21:37Z">
+            <w:del w:id="1082" w:author="Cập nhật 28 - 29/9, bản 1.3.12 (Claude)" w:date="2026-09-29T09:02:01Z">
               <w:r>
                 <w:rPr>
                   <w:rFonts w:asciiTheme="majorHAnsi" w:hAnsiTheme="majorHAnsi" w:cstheme="majorHAnsi"/>
@@ -6321,7 +6479,7 @@
                 <w:delText xml:space="preserve">ngày 27/9/2026 lên 1.3.1, 1.3.2,</w:delText>
               </w:r>
             </w:del>
-            <w:ins w:id="1072" w:author="Cập nhật 28 - 29/9, bản 1.3.12 (Claude)" w:date="2026-09-29T08:21:37Z">
+            <w:ins w:id="1083" w:author="Cập nhật 28 - 29/9, bản 1.3.12 (Claude)" w:date="2026-09-29T09:02:01Z">
               <w:r>
                 <w:rPr>
                   <w:rFonts w:asciiTheme="majorHAnsi" w:hAnsiTheme="majorHAnsi" w:cstheme="majorHAnsi"/>
@@ -7066,7 +7224,7 @@
                 <w:szCs w:val="28"/>
               </w:rPr>
             </w:pPr>
-            <w:del w:id="1073" w:author="Cập nhật 28 - 29/9, bản 1.3.12 (Claude)" w:date="2026-09-29T08:21:37Z">
+            <w:del w:id="1084" w:author="Cập nhật 28 - 29/9, bản 1.3.12 (Claude)" w:date="2026-09-29T09:02:01Z">
               <w:r>
                 <w:rPr>
                   <w:rFonts w:asciiTheme="majorHAnsi" w:hAnsiTheme="majorHAnsi" w:cstheme="majorHAnsi"/>
@@ -7076,7 +7234,7 @@
                 <w:delText xml:space="preserve">Có số liệu vận hành của Phòng TH-HC&amp;QT (18 - 27/9/2026)</w:delText>
               </w:r>
             </w:del>
-            <w:ins w:id="1074" w:author="Cập nhật 28 - 29/9, bản 1.3.12 (Claude)" w:date="2026-09-29T08:21:37Z">
+            <w:ins w:id="1085" w:author="Cập nhật 28 - 29/9, bản 1.3.12 (Claude)" w:date="2026-09-29T09:02:01Z">
               <w:r>
                 <w:rPr>
                   <w:rFonts w:asciiTheme="majorHAnsi" w:hAnsiTheme="majorHAnsi" w:cstheme="majorHAnsi"/>
@@ -7230,7 +7388,7 @@
       <w:tr>
         <w:trPr>
           <w:jc w:val="center"/>
-          <w:ins w:id="1075" w:author="Cập nhật 28 - 29/9, bản 1.3.12 (Claude)" w:date="2026-09-29T08:21:37Z"/>
+          <w:ins w:id="1086" w:author="Cập nhật 28 - 29/9, bản 1.3.12 (Claude)" w:date="2026-09-29T09:02:01Z"/>
         </w:trPr>
         <w:tc>
           <w:tcPr>
@@ -7242,13 +7400,13 @@
               <w:widowControl w:val="0"/>
               <w:jc w:val="center"/>
               <w:rPr>
-                <w:ins w:id="1077" w:author="Cập nhật 28 - 29/9, bản 1.3.12 (Claude)" w:date="2026-09-29T08:21:37Z"/>
-                <w:rFonts w:asciiTheme="majorHAnsi" w:hAnsiTheme="majorHAnsi" w:cstheme="majorHAnsi"/>
-                <w:sz w:val="28"/>
-                <w:szCs w:val="28"/>
-              </w:rPr>
-            </w:pPr>
-            <w:ins w:id="1076" w:author="Cập nhật 28 - 29/9, bản 1.3.12 (Claude)" w:date="2026-09-29T08:21:37Z">
+                <w:ins w:id="1088" w:author="Cập nhật 28 - 29/9, bản 1.3.12 (Claude)" w:date="2026-09-29T09:02:01Z"/>
+                <w:rFonts w:asciiTheme="majorHAnsi" w:hAnsiTheme="majorHAnsi" w:cstheme="majorHAnsi"/>
+                <w:sz w:val="28"/>
+                <w:szCs w:val="28"/>
+              </w:rPr>
+            </w:pPr>
+            <w:ins w:id="1087" w:author="Cập nhật 28 - 29/9, bản 1.3.12 (Claude)" w:date="2026-09-29T09:02:01Z">
               <w:r>
                 <w:rPr>
                   <w:rFonts w:asciiTheme="majorHAnsi" w:hAnsiTheme="majorHAnsi" w:cstheme="majorHAnsi"/>
@@ -7270,13 +7428,13 @@
               <w:widowControl w:val="0"/>
               <w:jc w:val="both"/>
               <w:rPr>
-                <w:ins w:id="1079" w:author="Cập nhật 28 - 29/9, bản 1.3.12 (Claude)" w:date="2026-09-29T08:21:37Z"/>
-                <w:rFonts w:asciiTheme="majorHAnsi" w:hAnsiTheme="majorHAnsi" w:cstheme="majorHAnsi"/>
-                <w:sz w:val="28"/>
-                <w:szCs w:val="28"/>
-              </w:rPr>
-            </w:pPr>
-            <w:ins w:id="1078" w:author="Cập nhật 28 - 29/9, bản 1.3.12 (Claude)" w:date="2026-09-29T08:21:37Z">
+                <w:ins w:id="1090" w:author="Cập nhật 28 - 29/9, bản 1.3.12 (Claude)" w:date="2026-09-29T09:02:01Z"/>
+                <w:rFonts w:asciiTheme="majorHAnsi" w:hAnsiTheme="majorHAnsi" w:cstheme="majorHAnsi"/>
+                <w:sz w:val="28"/>
+                <w:szCs w:val="28"/>
+              </w:rPr>
+            </w:pPr>
+            <w:ins w:id="1089" w:author="Cập nhật 28 - 29/9, bản 1.3.12 (Claude)" w:date="2026-09-29T09:02:01Z">
               <w:r>
                 <w:rPr>
                   <w:rFonts w:asciiTheme="majorHAnsi" w:hAnsiTheme="majorHAnsi" w:cstheme="majorHAnsi"/>
@@ -7298,20 +7456,20 @@
               <w:widowControl w:val="0"/>
               <w:jc w:val="both"/>
               <w:rPr>
-                <w:ins w:id="1081" w:author="Cập nhật 28 - 29/9, bản 1.3.12 (Claude)" w:date="2026-09-29T08:21:37Z"/>
-                <w:rFonts w:asciiTheme="majorHAnsi" w:hAnsiTheme="majorHAnsi" w:cstheme="majorHAnsi"/>
-                <w:sz w:val="28"/>
-                <w:szCs w:val="28"/>
-              </w:rPr>
-            </w:pPr>
-            <w:ins w:id="1080" w:author="Cập nhật 28 - 29/9, bản 1.3.12 (Claude)" w:date="2026-09-29T08:21:37Z">
+                <w:ins w:id="1092" w:author="Cập nhật 28 - 29/9, bản 1.3.12 (Claude)" w:date="2026-09-29T09:02:01Z"/>
+                <w:rFonts w:asciiTheme="majorHAnsi" w:hAnsiTheme="majorHAnsi" w:cstheme="majorHAnsi"/>
+                <w:sz w:val="28"/>
+                <w:szCs w:val="28"/>
+              </w:rPr>
+            </w:pPr>
+            <w:ins w:id="1091" w:author="Cập nhật 28 - 29/9, bản 1.3.12 (Claude)" w:date="2026-09-29T09:02:01Z">
               <w:r>
                 <w:rPr>
                   <w:rFonts w:asciiTheme="majorHAnsi" w:hAnsiTheme="majorHAnsi" w:cstheme="majorHAnsi"/>
                   <w:sz w:val="24"/>
                   <w:szCs w:val="24"/>
                 </w:rPr>
-                <w:t xml:space="preserve">Đã có văn bản: Quyết định số 2119/QĐ-CĐKT ngày 28/9/2026 ban hành Danh mục sản phẩm, công việc chính thức (416 sản phẩm, hệ số theo từng sản phẩm); bản 1.3.3 tra hệ số theo Danh mục; cột Điểm chấm, Hệ số của kế hoạch, báo cáo giữ 4 mức theo Quyết định số 1923/QĐ-CĐKT Phụ lục I, II (bản 1.3.4); quy ước nhân với hệ số mức độ công việc chưa có văn bản, giữ cảnh báo</w:t>
+                <w:t xml:space="preserve">Đã có văn bản: Quyết định số 2119/QĐ-CĐKT ban hành Danh mục sản phẩm, công việc chính thức (416 sản phẩm, hệ số theo từng sản phẩm); bản 1.3.3 tra hệ số theo Danh mục; cột Điểm chấm, Hệ số của kế hoạch, báo cáo giữ 4 mức theo Quyết định số 1923/QĐ-CĐKT Phụ lục I, II (bản 1.3.4); quy ước nhân với hệ số mức độ công việc chưa có văn bản, giữ cảnh báo</w:t>
               </w:r>
             </w:ins>
           </w:p>
@@ -7326,13 +7484,13 @@
               <w:widowControl w:val="0"/>
               <w:jc w:val="both"/>
               <w:rPr>
-                <w:ins w:id="1083" w:author="Cập nhật 28 - 29/9, bản 1.3.12 (Claude)" w:date="2026-09-29T08:21:37Z"/>
-                <w:rFonts w:asciiTheme="majorHAnsi" w:hAnsiTheme="majorHAnsi" w:cstheme="majorHAnsi"/>
-                <w:sz w:val="28"/>
-                <w:szCs w:val="28"/>
-              </w:rPr>
-            </w:pPr>
-            <w:ins w:id="1082" w:author="Cập nhật 28 - 29/9, bản 1.3.12 (Claude)" w:date="2026-09-29T08:21:37Z">
+                <w:ins w:id="1094" w:author="Cập nhật 28 - 29/9, bản 1.3.12 (Claude)" w:date="2026-09-29T09:02:01Z"/>
+                <w:rFonts w:asciiTheme="majorHAnsi" w:hAnsiTheme="majorHAnsi" w:cstheme="majorHAnsi"/>
+                <w:sz w:val="28"/>
+                <w:szCs w:val="28"/>
+              </w:rPr>
+            </w:pPr>
+            <w:ins w:id="1093" w:author="Cập nhật 28 - 29/9, bản 1.3.12 (Claude)" w:date="2026-09-29T09:02:01Z">
               <w:r>
                 <w:rPr>
                   <w:rFonts w:asciiTheme="majorHAnsi" w:hAnsiTheme="majorHAnsi" w:cstheme="majorHAnsi"/>
@@ -7348,7 +7506,7 @@
       <w:tr>
         <w:trPr>
           <w:jc w:val="center"/>
-          <w:ins w:id="1084" w:author="Cập nhật 28 - 29/9, bản 1.3.12 (Claude)" w:date="2026-09-29T08:21:37Z"/>
+          <w:ins w:id="1095" w:author="Cập nhật 28 - 29/9, bản 1.3.12 (Claude)" w:date="2026-09-29T09:02:01Z"/>
         </w:trPr>
         <w:tc>
           <w:tcPr>
@@ -7360,14 +7518,14 @@
               <w:widowControl w:val="0"/>
               <w:jc w:val="center"/>
               <w:rPr>
-                <w:ins w:id="1086" w:author="Cập nhật 28 - 29/9, bản 1.3.12 (Claude)" w:date="2026-09-29T08:21:37Z"/>
-                <w:ins w:id="1077" w:author="Cập nhật 28 - 29/9, bản 1.3.12 (Claude)" w:date="2026-09-29T08:21:37Z"/>
-                <w:rFonts w:asciiTheme="majorHAnsi" w:hAnsiTheme="majorHAnsi" w:cstheme="majorHAnsi"/>
-                <w:sz w:val="28"/>
-                <w:szCs w:val="28"/>
-              </w:rPr>
-            </w:pPr>
-            <w:ins w:id="1085" w:author="Cập nhật 28 - 29/9, bản 1.3.12 (Claude)" w:date="2026-09-29T08:21:37Z">
+                <w:ins w:id="1097" w:author="Cập nhật 28 - 29/9, bản 1.3.12 (Claude)" w:date="2026-09-29T09:02:01Z"/>
+                <w:ins w:id="1088" w:author="Cập nhật 28 - 29/9, bản 1.3.12 (Claude)" w:date="2026-09-29T09:02:01Z"/>
+                <w:rFonts w:asciiTheme="majorHAnsi" w:hAnsiTheme="majorHAnsi" w:cstheme="majorHAnsi"/>
+                <w:sz w:val="28"/>
+                <w:szCs w:val="28"/>
+              </w:rPr>
+            </w:pPr>
+            <w:ins w:id="1096" w:author="Cập nhật 28 - 29/9, bản 1.3.12 (Claude)" w:date="2026-09-29T09:02:01Z">
               <w:r>
                 <w:rPr>
                   <w:rFonts w:asciiTheme="majorHAnsi" w:hAnsiTheme="majorHAnsi" w:cstheme="majorHAnsi"/>
@@ -7389,14 +7547,14 @@
               <w:widowControl w:val="0"/>
               <w:jc w:val="both"/>
               <w:rPr>
-                <w:ins w:id="1088" w:author="Cập nhật 28 - 29/9, bản 1.3.12 (Claude)" w:date="2026-09-29T08:21:37Z"/>
-                <w:ins w:id="1079" w:author="Cập nhật 28 - 29/9, bản 1.3.12 (Claude)" w:date="2026-09-29T08:21:37Z"/>
-                <w:rFonts w:asciiTheme="majorHAnsi" w:hAnsiTheme="majorHAnsi" w:cstheme="majorHAnsi"/>
-                <w:sz w:val="28"/>
-                <w:szCs w:val="28"/>
-              </w:rPr>
-            </w:pPr>
-            <w:ins w:id="1087" w:author="Cập nhật 28 - 29/9, bản 1.3.12 (Claude)" w:date="2026-09-29T08:21:37Z">
+                <w:ins w:id="1099" w:author="Cập nhật 28 - 29/9, bản 1.3.12 (Claude)" w:date="2026-09-29T09:02:01Z"/>
+                <w:ins w:id="1090" w:author="Cập nhật 28 - 29/9, bản 1.3.12 (Claude)" w:date="2026-09-29T09:02:01Z"/>
+                <w:rFonts w:asciiTheme="majorHAnsi" w:hAnsiTheme="majorHAnsi" w:cstheme="majorHAnsi"/>
+                <w:sz w:val="28"/>
+                <w:szCs w:val="28"/>
+              </w:rPr>
+            </w:pPr>
+            <w:ins w:id="1098" w:author="Cập nhật 28 - 29/9, bản 1.3.12 (Claude)" w:date="2026-09-29T09:02:01Z">
               <w:r>
                 <w:rPr>
                   <w:rFonts w:asciiTheme="majorHAnsi" w:hAnsiTheme="majorHAnsi" w:cstheme="majorHAnsi"/>
@@ -7418,14 +7576,14 @@
               <w:widowControl w:val="0"/>
               <w:jc w:val="both"/>
               <w:rPr>
-                <w:ins w:id="1090" w:author="Cập nhật 28 - 29/9, bản 1.3.12 (Claude)" w:date="2026-09-29T08:21:37Z"/>
-                <w:ins w:id="1081" w:author="Cập nhật 28 - 29/9, bản 1.3.12 (Claude)" w:date="2026-09-29T08:21:37Z"/>
-                <w:rFonts w:asciiTheme="majorHAnsi" w:hAnsiTheme="majorHAnsi" w:cstheme="majorHAnsi"/>
-                <w:sz w:val="28"/>
-                <w:szCs w:val="28"/>
-              </w:rPr>
-            </w:pPr>
-            <w:ins w:id="1089" w:author="Cập nhật 28 - 29/9, bản 1.3.12 (Claude)" w:date="2026-09-29T08:21:37Z">
+                <w:ins w:id="1101" w:author="Cập nhật 28 - 29/9, bản 1.3.12 (Claude)" w:date="2026-09-29T09:02:01Z"/>
+                <w:ins w:id="1092" w:author="Cập nhật 28 - 29/9, bản 1.3.12 (Claude)" w:date="2026-09-29T09:02:01Z"/>
+                <w:rFonts w:asciiTheme="majorHAnsi" w:hAnsiTheme="majorHAnsi" w:cstheme="majorHAnsi"/>
+                <w:sz w:val="28"/>
+                <w:szCs w:val="28"/>
+              </w:rPr>
+            </w:pPr>
+            <w:ins w:id="1100" w:author="Cập nhật 28 - 29/9, bản 1.3.12 (Claude)" w:date="2026-09-29T09:02:01Z">
               <w:r>
                 <w:rPr>
                   <w:rFonts w:asciiTheme="majorHAnsi" w:hAnsiTheme="majorHAnsi" w:cstheme="majorHAnsi"/>
@@ -7447,14 +7605,14 @@
               <w:widowControl w:val="0"/>
               <w:jc w:val="both"/>
               <w:rPr>
-                <w:ins w:id="1092" w:author="Cập nhật 28 - 29/9, bản 1.3.12 (Claude)" w:date="2026-09-29T08:21:37Z"/>
-                <w:ins w:id="1083" w:author="Cập nhật 28 - 29/9, bản 1.3.12 (Claude)" w:date="2026-09-29T08:21:37Z"/>
-                <w:rFonts w:asciiTheme="majorHAnsi" w:hAnsiTheme="majorHAnsi" w:cstheme="majorHAnsi"/>
-                <w:sz w:val="28"/>
-                <w:szCs w:val="28"/>
-              </w:rPr>
-            </w:pPr>
-            <w:ins w:id="1091" w:author="Cập nhật 28 - 29/9, bản 1.3.12 (Claude)" w:date="2026-09-29T08:21:37Z">
+                <w:ins w:id="1103" w:author="Cập nhật 28 - 29/9, bản 1.3.12 (Claude)" w:date="2026-09-29T09:02:01Z"/>
+                <w:ins w:id="1094" w:author="Cập nhật 28 - 29/9, bản 1.3.12 (Claude)" w:date="2026-09-29T09:02:01Z"/>
+                <w:rFonts w:asciiTheme="majorHAnsi" w:hAnsiTheme="majorHAnsi" w:cstheme="majorHAnsi"/>
+                <w:sz w:val="28"/>
+                <w:szCs w:val="28"/>
+              </w:rPr>
+            </w:pPr>
+            <w:ins w:id="1102" w:author="Cập nhật 28 - 29/9, bản 1.3.12 (Claude)" w:date="2026-09-29T09:02:01Z">
               <w:r>
                 <w:rPr>
                   <w:rFonts w:asciiTheme="majorHAnsi" w:hAnsiTheme="majorHAnsi" w:cstheme="majorHAnsi"/>
@@ -7470,7 +7628,7 @@
       <w:tr>
         <w:trPr>
           <w:jc w:val="center"/>
-          <w:ins w:id="1093" w:author="Cập nhật 28 - 29/9, bản 1.3.12 (Claude)" w:date="2026-09-29T08:21:37Z"/>
+          <w:ins w:id="1104" w:author="Cập nhật 28 - 29/9, bản 1.3.12 (Claude)" w:date="2026-09-29T09:02:01Z"/>
         </w:trPr>
         <w:tc>
           <w:tcPr>
@@ -7482,15 +7640,15 @@
               <w:widowControl w:val="0"/>
               <w:jc w:val="center"/>
               <w:rPr>
-                <w:ins w:id="1095" w:author="Cập nhật 28 - 29/9, bản 1.3.12 (Claude)" w:date="2026-09-29T08:21:37Z"/>
-                <w:ins w:id="1086" w:author="Cập nhật 28 - 29/9, bản 1.3.12 (Claude)" w:date="2026-09-29T08:21:37Z"/>
-                <w:ins w:id="1077" w:author="Cập nhật 28 - 29/9, bản 1.3.12 (Claude)" w:date="2026-09-29T08:21:37Z"/>
-                <w:rFonts w:asciiTheme="majorHAnsi" w:hAnsiTheme="majorHAnsi" w:cstheme="majorHAnsi"/>
-                <w:sz w:val="28"/>
-                <w:szCs w:val="28"/>
-              </w:rPr>
-            </w:pPr>
-            <w:ins w:id="1094" w:author="Cập nhật 28 - 29/9, bản 1.3.12 (Claude)" w:date="2026-09-29T08:21:37Z">
+                <w:ins w:id="1106" w:author="Cập nhật 28 - 29/9, bản 1.3.12 (Claude)" w:date="2026-09-29T09:02:01Z"/>
+                <w:ins w:id="1097" w:author="Cập nhật 28 - 29/9, bản 1.3.12 (Claude)" w:date="2026-09-29T09:02:01Z"/>
+                <w:ins w:id="1088" w:author="Cập nhật 28 - 29/9, bản 1.3.12 (Claude)" w:date="2026-09-29T09:02:01Z"/>
+                <w:rFonts w:asciiTheme="majorHAnsi" w:hAnsiTheme="majorHAnsi" w:cstheme="majorHAnsi"/>
+                <w:sz w:val="28"/>
+                <w:szCs w:val="28"/>
+              </w:rPr>
+            </w:pPr>
+            <w:ins w:id="1105" w:author="Cập nhật 28 - 29/9, bản 1.3.12 (Claude)" w:date="2026-09-29T09:02:01Z">
               <w:r>
                 <w:rPr>
                   <w:rFonts w:asciiTheme="majorHAnsi" w:hAnsiTheme="majorHAnsi" w:cstheme="majorHAnsi"/>
@@ -7512,15 +7670,15 @@
               <w:widowControl w:val="0"/>
               <w:jc w:val="both"/>
               <w:rPr>
-                <w:ins w:id="1097" w:author="Cập nhật 28 - 29/9, bản 1.3.12 (Claude)" w:date="2026-09-29T08:21:37Z"/>
-                <w:ins w:id="1088" w:author="Cập nhật 28 - 29/9, bản 1.3.12 (Claude)" w:date="2026-09-29T08:21:37Z"/>
-                <w:ins w:id="1079" w:author="Cập nhật 28 - 29/9, bản 1.3.12 (Claude)" w:date="2026-09-29T08:21:37Z"/>
-                <w:rFonts w:asciiTheme="majorHAnsi" w:hAnsiTheme="majorHAnsi" w:cstheme="majorHAnsi"/>
-                <w:sz w:val="28"/>
-                <w:szCs w:val="28"/>
-              </w:rPr>
-            </w:pPr>
-            <w:ins w:id="1096" w:author="Cập nhật 28 - 29/9, bản 1.3.12 (Claude)" w:date="2026-09-29T08:21:37Z">
+                <w:ins w:id="1108" w:author="Cập nhật 28 - 29/9, bản 1.3.12 (Claude)" w:date="2026-09-29T09:02:01Z"/>
+                <w:ins w:id="1099" w:author="Cập nhật 28 - 29/9, bản 1.3.12 (Claude)" w:date="2026-09-29T09:02:01Z"/>
+                <w:ins w:id="1090" w:author="Cập nhật 28 - 29/9, bản 1.3.12 (Claude)" w:date="2026-09-29T09:02:01Z"/>
+                <w:rFonts w:asciiTheme="majorHAnsi" w:hAnsiTheme="majorHAnsi" w:cstheme="majorHAnsi"/>
+                <w:sz w:val="28"/>
+                <w:szCs w:val="28"/>
+              </w:rPr>
+            </w:pPr>
+            <w:ins w:id="1107" w:author="Cập nhật 28 - 29/9, bản 1.3.12 (Claude)" w:date="2026-09-29T09:02:01Z">
               <w:r>
                 <w:rPr>
                   <w:rFonts w:asciiTheme="majorHAnsi" w:hAnsiTheme="majorHAnsi" w:cstheme="majorHAnsi"/>
@@ -7542,15 +7700,15 @@
               <w:widowControl w:val="0"/>
               <w:jc w:val="both"/>
               <w:rPr>
-                <w:ins w:id="1099" w:author="Cập nhật 28 - 29/9, bản 1.3.12 (Claude)" w:date="2026-09-29T08:21:37Z"/>
-                <w:ins w:id="1090" w:author="Cập nhật 28 - 29/9, bản 1.3.12 (Claude)" w:date="2026-09-29T08:21:37Z"/>
-                <w:ins w:id="1081" w:author="Cập nhật 28 - 29/9, bản 1.3.12 (Claude)" w:date="2026-09-29T08:21:37Z"/>
-                <w:rFonts w:asciiTheme="majorHAnsi" w:hAnsiTheme="majorHAnsi" w:cstheme="majorHAnsi"/>
-                <w:sz w:val="28"/>
-                <w:szCs w:val="28"/>
-              </w:rPr>
-            </w:pPr>
-            <w:ins w:id="1098" w:author="Cập nhật 28 - 29/9, bản 1.3.12 (Claude)" w:date="2026-09-29T08:21:37Z">
+                <w:ins w:id="1110" w:author="Cập nhật 28 - 29/9, bản 1.3.12 (Claude)" w:date="2026-09-29T09:02:01Z"/>
+                <w:ins w:id="1101" w:author="Cập nhật 28 - 29/9, bản 1.3.12 (Claude)" w:date="2026-09-29T09:02:01Z"/>
+                <w:ins w:id="1092" w:author="Cập nhật 28 - 29/9, bản 1.3.12 (Claude)" w:date="2026-09-29T09:02:01Z"/>
+                <w:rFonts w:asciiTheme="majorHAnsi" w:hAnsiTheme="majorHAnsi" w:cstheme="majorHAnsi"/>
+                <w:sz w:val="28"/>
+                <w:szCs w:val="28"/>
+              </w:rPr>
+            </w:pPr>
+            <w:ins w:id="1109" w:author="Cập nhật 28 - 29/9, bản 1.3.12 (Claude)" w:date="2026-09-29T09:02:01Z">
               <w:r>
                 <w:rPr>
                   <w:rFonts w:asciiTheme="majorHAnsi" w:hAnsiTheme="majorHAnsi" w:cstheme="majorHAnsi"/>
@@ -7572,15 +7730,15 @@
               <w:widowControl w:val="0"/>
               <w:jc w:val="both"/>
               <w:rPr>
-                <w:ins w:id="1101" w:author="Cập nhật 28 - 29/9, bản 1.3.12 (Claude)" w:date="2026-09-29T08:21:37Z"/>
-                <w:ins w:id="1092" w:author="Cập nhật 28 - 29/9, bản 1.3.12 (Claude)" w:date="2026-09-29T08:21:37Z"/>
-                <w:ins w:id="1083" w:author="Cập nhật 28 - 29/9, bản 1.3.12 (Claude)" w:date="2026-09-29T08:21:37Z"/>
-                <w:rFonts w:asciiTheme="majorHAnsi" w:hAnsiTheme="majorHAnsi" w:cstheme="majorHAnsi"/>
-                <w:sz w:val="28"/>
-                <w:szCs w:val="28"/>
-              </w:rPr>
-            </w:pPr>
-            <w:ins w:id="1100" w:author="Cập nhật 28 - 29/9, bản 1.3.12 (Claude)" w:date="2026-09-29T08:21:37Z">
+                <w:ins w:id="1112" w:author="Cập nhật 28 - 29/9, bản 1.3.12 (Claude)" w:date="2026-09-29T09:02:01Z"/>
+                <w:ins w:id="1103" w:author="Cập nhật 28 - 29/9, bản 1.3.12 (Claude)" w:date="2026-09-29T09:02:01Z"/>
+                <w:ins w:id="1094" w:author="Cập nhật 28 - 29/9, bản 1.3.12 (Claude)" w:date="2026-09-29T09:02:01Z"/>
+                <w:rFonts w:asciiTheme="majorHAnsi" w:hAnsiTheme="majorHAnsi" w:cstheme="majorHAnsi"/>
+                <w:sz w:val="28"/>
+                <w:szCs w:val="28"/>
+              </w:rPr>
+            </w:pPr>
+            <w:ins w:id="1111" w:author="Cập nhật 28 - 29/9, bản 1.3.12 (Claude)" w:date="2026-09-29T09:02:01Z">
               <w:r>
                 <w:rPr>
                   <w:rFonts w:asciiTheme="majorHAnsi" w:hAnsiTheme="majorHAnsi" w:cstheme="majorHAnsi"/>
@@ -7596,7 +7754,7 @@
       <w:tr>
         <w:trPr>
           <w:jc w:val="center"/>
-          <w:ins w:id="1102" w:author="Cập nhật 28 - 29/9, bản 1.3.12 (Claude)" w:date="2026-09-29T08:21:37Z"/>
+          <w:ins w:id="1113" w:author="Cập nhật 28 - 29/9, bản 1.3.12 (Claude)" w:date="2026-09-29T09:02:01Z"/>
         </w:trPr>
         <w:tc>
           <w:tcPr>
@@ -7608,16 +7766,16 @@
               <w:widowControl w:val="0"/>
               <w:jc w:val="center"/>
               <w:rPr>
-                <w:ins w:id="1104" w:author="Cập nhật 28 - 29/9, bản 1.3.12 (Claude)" w:date="2026-09-29T08:21:37Z"/>
-                <w:ins w:id="1095" w:author="Cập nhật 28 - 29/9, bản 1.3.12 (Claude)" w:date="2026-09-29T08:21:37Z"/>
-                <w:ins w:id="1086" w:author="Cập nhật 28 - 29/9, bản 1.3.12 (Claude)" w:date="2026-09-29T08:21:37Z"/>
-                <w:ins w:id="1077" w:author="Cập nhật 28 - 29/9, bản 1.3.12 (Claude)" w:date="2026-09-29T08:21:37Z"/>
-                <w:rFonts w:asciiTheme="majorHAnsi" w:hAnsiTheme="majorHAnsi" w:cstheme="majorHAnsi"/>
-                <w:sz w:val="28"/>
-                <w:szCs w:val="28"/>
-              </w:rPr>
-            </w:pPr>
-            <w:ins w:id="1103" w:author="Cập nhật 28 - 29/9, bản 1.3.12 (Claude)" w:date="2026-09-29T08:21:37Z">
+                <w:ins w:id="1115" w:author="Cập nhật 28 - 29/9, bản 1.3.12 (Claude)" w:date="2026-09-29T09:02:01Z"/>
+                <w:ins w:id="1106" w:author="Cập nhật 28 - 29/9, bản 1.3.12 (Claude)" w:date="2026-09-29T09:02:01Z"/>
+                <w:ins w:id="1097" w:author="Cập nhật 28 - 29/9, bản 1.3.12 (Claude)" w:date="2026-09-29T09:02:01Z"/>
+                <w:ins w:id="1088" w:author="Cập nhật 28 - 29/9, bản 1.3.12 (Claude)" w:date="2026-09-29T09:02:01Z"/>
+                <w:rFonts w:asciiTheme="majorHAnsi" w:hAnsiTheme="majorHAnsi" w:cstheme="majorHAnsi"/>
+                <w:sz w:val="28"/>
+                <w:szCs w:val="28"/>
+              </w:rPr>
+            </w:pPr>
+            <w:ins w:id="1114" w:author="Cập nhật 28 - 29/9, bản 1.3.12 (Claude)" w:date="2026-09-29T09:02:01Z">
               <w:r>
                 <w:rPr>
                   <w:rFonts w:asciiTheme="majorHAnsi" w:hAnsiTheme="majorHAnsi" w:cstheme="majorHAnsi"/>
@@ -7639,16 +7797,16 @@
               <w:widowControl w:val="0"/>
               <w:jc w:val="both"/>
               <w:rPr>
-                <w:ins w:id="1106" w:author="Cập nhật 28 - 29/9, bản 1.3.12 (Claude)" w:date="2026-09-29T08:21:37Z"/>
-                <w:ins w:id="1097" w:author="Cập nhật 28 - 29/9, bản 1.3.12 (Claude)" w:date="2026-09-29T08:21:37Z"/>
-                <w:ins w:id="1088" w:author="Cập nhật 28 - 29/9, bản 1.3.12 (Claude)" w:date="2026-09-29T08:21:37Z"/>
-                <w:ins w:id="1079" w:author="Cập nhật 28 - 29/9, bản 1.3.12 (Claude)" w:date="2026-09-29T08:21:37Z"/>
-                <w:rFonts w:asciiTheme="majorHAnsi" w:hAnsiTheme="majorHAnsi" w:cstheme="majorHAnsi"/>
-                <w:sz w:val="28"/>
-                <w:szCs w:val="28"/>
-              </w:rPr>
-            </w:pPr>
-            <w:ins w:id="1105" w:author="Cập nhật 28 - 29/9, bản 1.3.12 (Claude)" w:date="2026-09-29T08:21:37Z">
+                <w:ins w:id="1117" w:author="Cập nhật 28 - 29/9, bản 1.3.12 (Claude)" w:date="2026-09-29T09:02:01Z"/>
+                <w:ins w:id="1108" w:author="Cập nhật 28 - 29/9, bản 1.3.12 (Claude)" w:date="2026-09-29T09:02:01Z"/>
+                <w:ins w:id="1099" w:author="Cập nhật 28 - 29/9, bản 1.3.12 (Claude)" w:date="2026-09-29T09:02:01Z"/>
+                <w:ins w:id="1090" w:author="Cập nhật 28 - 29/9, bản 1.3.12 (Claude)" w:date="2026-09-29T09:02:01Z"/>
+                <w:rFonts w:asciiTheme="majorHAnsi" w:hAnsiTheme="majorHAnsi" w:cstheme="majorHAnsi"/>
+                <w:sz w:val="28"/>
+                <w:szCs w:val="28"/>
+              </w:rPr>
+            </w:pPr>
+            <w:ins w:id="1116" w:author="Cập nhật 28 - 29/9, bản 1.3.12 (Claude)" w:date="2026-09-29T09:02:01Z">
               <w:r>
                 <w:rPr>
                   <w:rFonts w:asciiTheme="majorHAnsi" w:hAnsiTheme="majorHAnsi" w:cstheme="majorHAnsi"/>
@@ -7670,16 +7828,16 @@
               <w:widowControl w:val="0"/>
               <w:jc w:val="both"/>
               <w:rPr>
-                <w:ins w:id="1108" w:author="Cập nhật 28 - 29/9, bản 1.3.12 (Claude)" w:date="2026-09-29T08:21:37Z"/>
-                <w:ins w:id="1099" w:author="Cập nhật 28 - 29/9, bản 1.3.12 (Claude)" w:date="2026-09-29T08:21:37Z"/>
-                <w:ins w:id="1090" w:author="Cập nhật 28 - 29/9, bản 1.3.12 (Claude)" w:date="2026-09-29T08:21:37Z"/>
-                <w:ins w:id="1081" w:author="Cập nhật 28 - 29/9, bản 1.3.12 (Claude)" w:date="2026-09-29T08:21:37Z"/>
-                <w:rFonts w:asciiTheme="majorHAnsi" w:hAnsiTheme="majorHAnsi" w:cstheme="majorHAnsi"/>
-                <w:sz w:val="28"/>
-                <w:szCs w:val="28"/>
-              </w:rPr>
-            </w:pPr>
-            <w:ins w:id="1107" w:author="Cập nhật 28 - 29/9, bản 1.3.12 (Claude)" w:date="2026-09-29T08:21:37Z">
+                <w:ins w:id="1119" w:author="Cập nhật 28 - 29/9, bản 1.3.12 (Claude)" w:date="2026-09-29T09:02:01Z"/>
+                <w:ins w:id="1110" w:author="Cập nhật 28 - 29/9, bản 1.3.12 (Claude)" w:date="2026-09-29T09:02:01Z"/>
+                <w:ins w:id="1101" w:author="Cập nhật 28 - 29/9, bản 1.3.12 (Claude)" w:date="2026-09-29T09:02:01Z"/>
+                <w:ins w:id="1092" w:author="Cập nhật 28 - 29/9, bản 1.3.12 (Claude)" w:date="2026-09-29T09:02:01Z"/>
+                <w:rFonts w:asciiTheme="majorHAnsi" w:hAnsiTheme="majorHAnsi" w:cstheme="majorHAnsi"/>
+                <w:sz w:val="28"/>
+                <w:szCs w:val="28"/>
+              </w:rPr>
+            </w:pPr>
+            <w:ins w:id="1118" w:author="Cập nhật 28 - 29/9, bản 1.3.12 (Claude)" w:date="2026-09-29T09:02:01Z">
               <w:r>
                 <w:rPr>
                   <w:rFonts w:asciiTheme="majorHAnsi" w:hAnsiTheme="majorHAnsi" w:cstheme="majorHAnsi"/>
@@ -7701,16 +7859,16 @@
               <w:widowControl w:val="0"/>
               <w:jc w:val="both"/>
               <w:rPr>
-                <w:ins w:id="1110" w:author="Cập nhật 28 - 29/9, bản 1.3.12 (Claude)" w:date="2026-09-29T08:21:37Z"/>
-                <w:ins w:id="1101" w:author="Cập nhật 28 - 29/9, bản 1.3.12 (Claude)" w:date="2026-09-29T08:21:37Z"/>
-                <w:ins w:id="1092" w:author="Cập nhật 28 - 29/9, bản 1.3.12 (Claude)" w:date="2026-09-29T08:21:37Z"/>
-                <w:ins w:id="1083" w:author="Cập nhật 28 - 29/9, bản 1.3.12 (Claude)" w:date="2026-09-29T08:21:37Z"/>
-                <w:rFonts w:asciiTheme="majorHAnsi" w:hAnsiTheme="majorHAnsi" w:cstheme="majorHAnsi"/>
-                <w:sz w:val="28"/>
-                <w:szCs w:val="28"/>
-              </w:rPr>
-            </w:pPr>
-            <w:ins w:id="1109" w:author="Cập nhật 28 - 29/9, bản 1.3.12 (Claude)" w:date="2026-09-29T08:21:37Z">
+                <w:ins w:id="1121" w:author="Cập nhật 28 - 29/9, bản 1.3.12 (Claude)" w:date="2026-09-29T09:02:01Z"/>
+                <w:ins w:id="1112" w:author="Cập nhật 28 - 29/9, bản 1.3.12 (Claude)" w:date="2026-09-29T09:02:01Z"/>
+                <w:ins w:id="1103" w:author="Cập nhật 28 - 29/9, bản 1.3.12 (Claude)" w:date="2026-09-29T09:02:01Z"/>
+                <w:ins w:id="1094" w:author="Cập nhật 28 - 29/9, bản 1.3.12 (Claude)" w:date="2026-09-29T09:02:01Z"/>
+                <w:rFonts w:asciiTheme="majorHAnsi" w:hAnsiTheme="majorHAnsi" w:cstheme="majorHAnsi"/>
+                <w:sz w:val="28"/>
+                <w:szCs w:val="28"/>
+              </w:rPr>
+            </w:pPr>
+            <w:ins w:id="1120" w:author="Cập nhật 28 - 29/9, bản 1.3.12 (Claude)" w:date="2026-09-29T09:02:01Z">
               <w:r>
                 <w:rPr>
                   <w:rFonts w:asciiTheme="majorHAnsi" w:hAnsiTheme="majorHAnsi" w:cstheme="majorHAnsi"/>
@@ -7726,7 +7884,7 @@
       <w:tr>
         <w:trPr>
           <w:jc w:val="center"/>
-          <w:ins w:id="1111" w:author="Cập nhật 28 - 29/9, bản 1.3.12 (Claude)" w:date="2026-09-29T08:21:37Z"/>
+          <w:ins w:id="1122" w:author="Cập nhật 28 - 29/9, bản 1.3.12 (Claude)" w:date="2026-09-29T09:02:01Z"/>
         </w:trPr>
         <w:tc>
           <w:tcPr>
@@ -7738,17 +7896,17 @@
               <w:widowControl w:val="0"/>
               <w:jc w:val="center"/>
               <w:rPr>
-                <w:ins w:id="1113" w:author="Cập nhật 28 - 29/9, bản 1.3.12 (Claude)" w:date="2026-09-29T08:21:37Z"/>
-                <w:ins w:id="1104" w:author="Cập nhật 28 - 29/9, bản 1.3.12 (Claude)" w:date="2026-09-29T08:21:37Z"/>
-                <w:ins w:id="1095" w:author="Cập nhật 28 - 29/9, bản 1.3.12 (Claude)" w:date="2026-09-29T08:21:37Z"/>
-                <w:ins w:id="1086" w:author="Cập nhật 28 - 29/9, bản 1.3.12 (Claude)" w:date="2026-09-29T08:21:37Z"/>
-                <w:ins w:id="1077" w:author="Cập nhật 28 - 29/9, bản 1.3.12 (Claude)" w:date="2026-09-29T08:21:37Z"/>
-                <w:rFonts w:asciiTheme="majorHAnsi" w:hAnsiTheme="majorHAnsi" w:cstheme="majorHAnsi"/>
-                <w:sz w:val="28"/>
-                <w:szCs w:val="28"/>
-              </w:rPr>
-            </w:pPr>
-            <w:ins w:id="1112" w:author="Cập nhật 28 - 29/9, bản 1.3.12 (Claude)" w:date="2026-09-29T08:21:37Z">
+                <w:ins w:id="1124" w:author="Cập nhật 28 - 29/9, bản 1.3.12 (Claude)" w:date="2026-09-29T09:02:01Z"/>
+                <w:ins w:id="1115" w:author="Cập nhật 28 - 29/9, bản 1.3.12 (Claude)" w:date="2026-09-29T09:02:01Z"/>
+                <w:ins w:id="1106" w:author="Cập nhật 28 - 29/9, bản 1.3.12 (Claude)" w:date="2026-09-29T09:02:01Z"/>
+                <w:ins w:id="1097" w:author="Cập nhật 28 - 29/9, bản 1.3.12 (Claude)" w:date="2026-09-29T09:02:01Z"/>
+                <w:ins w:id="1088" w:author="Cập nhật 28 - 29/9, bản 1.3.12 (Claude)" w:date="2026-09-29T09:02:01Z"/>
+                <w:rFonts w:asciiTheme="majorHAnsi" w:hAnsiTheme="majorHAnsi" w:cstheme="majorHAnsi"/>
+                <w:sz w:val="28"/>
+                <w:szCs w:val="28"/>
+              </w:rPr>
+            </w:pPr>
+            <w:ins w:id="1123" w:author="Cập nhật 28 - 29/9, bản 1.3.12 (Claude)" w:date="2026-09-29T09:02:01Z">
               <w:r>
                 <w:rPr>
                   <w:rFonts w:asciiTheme="majorHAnsi" w:hAnsiTheme="majorHAnsi" w:cstheme="majorHAnsi"/>
@@ -7770,17 +7928,17 @@
               <w:widowControl w:val="0"/>
               <w:jc w:val="both"/>
               <w:rPr>
-                <w:ins w:id="1115" w:author="Cập nhật 28 - 29/9, bản 1.3.12 (Claude)" w:date="2026-09-29T08:21:37Z"/>
-                <w:ins w:id="1106" w:author="Cập nhật 28 - 29/9, bản 1.3.12 (Claude)" w:date="2026-09-29T08:21:37Z"/>
-                <w:ins w:id="1097" w:author="Cập nhật 28 - 29/9, bản 1.3.12 (Claude)" w:date="2026-09-29T08:21:37Z"/>
-                <w:ins w:id="1088" w:author="Cập nhật 28 - 29/9, bản 1.3.12 (Claude)" w:date="2026-09-29T08:21:37Z"/>
-                <w:ins w:id="1079" w:author="Cập nhật 28 - 29/9, bản 1.3.12 (Claude)" w:date="2026-09-29T08:21:37Z"/>
-                <w:rFonts w:asciiTheme="majorHAnsi" w:hAnsiTheme="majorHAnsi" w:cstheme="majorHAnsi"/>
-                <w:sz w:val="28"/>
-                <w:szCs w:val="28"/>
-              </w:rPr>
-            </w:pPr>
-            <w:ins w:id="1114" w:author="Cập nhật 28 - 29/9, bản 1.3.12 (Claude)" w:date="2026-09-29T08:21:37Z">
+                <w:ins w:id="1126" w:author="Cập nhật 28 - 29/9, bản 1.3.12 (Claude)" w:date="2026-09-29T09:02:01Z"/>
+                <w:ins w:id="1117" w:author="Cập nhật 28 - 29/9, bản 1.3.12 (Claude)" w:date="2026-09-29T09:02:01Z"/>
+                <w:ins w:id="1108" w:author="Cập nhật 28 - 29/9, bản 1.3.12 (Claude)" w:date="2026-09-29T09:02:01Z"/>
+                <w:ins w:id="1099" w:author="Cập nhật 28 - 29/9, bản 1.3.12 (Claude)" w:date="2026-09-29T09:02:01Z"/>
+                <w:ins w:id="1090" w:author="Cập nhật 28 - 29/9, bản 1.3.12 (Claude)" w:date="2026-09-29T09:02:01Z"/>
+                <w:rFonts w:asciiTheme="majorHAnsi" w:hAnsiTheme="majorHAnsi" w:cstheme="majorHAnsi"/>
+                <w:sz w:val="28"/>
+                <w:szCs w:val="28"/>
+              </w:rPr>
+            </w:pPr>
+            <w:ins w:id="1125" w:author="Cập nhật 28 - 29/9, bản 1.3.12 (Claude)" w:date="2026-09-29T09:02:01Z">
               <w:r>
                 <w:rPr>
                   <w:rFonts w:asciiTheme="majorHAnsi" w:hAnsiTheme="majorHAnsi" w:cstheme="majorHAnsi"/>
@@ -7802,17 +7960,17 @@
               <w:widowControl w:val="0"/>
               <w:jc w:val="both"/>
               <w:rPr>
-                <w:ins w:id="1117" w:author="Cập nhật 28 - 29/9, bản 1.3.12 (Claude)" w:date="2026-09-29T08:21:37Z"/>
-                <w:ins w:id="1108" w:author="Cập nhật 28 - 29/9, bản 1.3.12 (Claude)" w:date="2026-09-29T08:21:37Z"/>
-                <w:ins w:id="1099" w:author="Cập nhật 28 - 29/9, bản 1.3.12 (Claude)" w:date="2026-09-29T08:21:37Z"/>
-                <w:ins w:id="1090" w:author="Cập nhật 28 - 29/9, bản 1.3.12 (Claude)" w:date="2026-09-29T08:21:37Z"/>
-                <w:ins w:id="1081" w:author="Cập nhật 28 - 29/9, bản 1.3.12 (Claude)" w:date="2026-09-29T08:21:37Z"/>
-                <w:rFonts w:asciiTheme="majorHAnsi" w:hAnsiTheme="majorHAnsi" w:cstheme="majorHAnsi"/>
-                <w:sz w:val="28"/>
-                <w:szCs w:val="28"/>
-              </w:rPr>
-            </w:pPr>
-            <w:ins w:id="1116" w:author="Cập nhật 28 - 29/9, bản 1.3.12 (Claude)" w:date="2026-09-29T08:21:37Z">
+                <w:ins w:id="1128" w:author="Cập nhật 28 - 29/9, bản 1.3.12 (Claude)" w:date="2026-09-29T09:02:01Z"/>
+                <w:ins w:id="1119" w:author="Cập nhật 28 - 29/9, bản 1.3.12 (Claude)" w:date="2026-09-29T09:02:01Z"/>
+                <w:ins w:id="1110" w:author="Cập nhật 28 - 29/9, bản 1.3.12 (Claude)" w:date="2026-09-29T09:02:01Z"/>
+                <w:ins w:id="1101" w:author="Cập nhật 28 - 29/9, bản 1.3.12 (Claude)" w:date="2026-09-29T09:02:01Z"/>
+                <w:ins w:id="1092" w:author="Cập nhật 28 - 29/9, bản 1.3.12 (Claude)" w:date="2026-09-29T09:02:01Z"/>
+                <w:rFonts w:asciiTheme="majorHAnsi" w:hAnsiTheme="majorHAnsi" w:cstheme="majorHAnsi"/>
+                <w:sz w:val="28"/>
+                <w:szCs w:val="28"/>
+              </w:rPr>
+            </w:pPr>
+            <w:ins w:id="1127" w:author="Cập nhật 28 - 29/9, bản 1.3.12 (Claude)" w:date="2026-09-29T09:02:01Z">
               <w:r>
                 <w:rPr>
                   <w:rFonts w:asciiTheme="majorHAnsi" w:hAnsiTheme="majorHAnsi" w:cstheme="majorHAnsi"/>
@@ -7834,17 +7992,17 @@
               <w:widowControl w:val="0"/>
               <w:jc w:val="both"/>
               <w:rPr>
-                <w:ins w:id="1119" w:author="Cập nhật 28 - 29/9, bản 1.3.12 (Claude)" w:date="2026-09-29T08:21:37Z"/>
-                <w:ins w:id="1110" w:author="Cập nhật 28 - 29/9, bản 1.3.12 (Claude)" w:date="2026-09-29T08:21:37Z"/>
-                <w:ins w:id="1101" w:author="Cập nhật 28 - 29/9, bản 1.3.12 (Claude)" w:date="2026-09-29T08:21:37Z"/>
-                <w:ins w:id="1092" w:author="Cập nhật 28 - 29/9, bản 1.3.12 (Claude)" w:date="2026-09-29T08:21:37Z"/>
-                <w:ins w:id="1083" w:author="Cập nhật 28 - 29/9, bản 1.3.12 (Claude)" w:date="2026-09-29T08:21:37Z"/>
-                <w:rFonts w:asciiTheme="majorHAnsi" w:hAnsiTheme="majorHAnsi" w:cstheme="majorHAnsi"/>
-                <w:sz w:val="28"/>
-                <w:szCs w:val="28"/>
-              </w:rPr>
-            </w:pPr>
-            <w:ins w:id="1118" w:author="Cập nhật 28 - 29/9, bản 1.3.12 (Claude)" w:date="2026-09-29T08:21:37Z">
+                <w:ins w:id="1130" w:author="Cập nhật 28 - 29/9, bản 1.3.12 (Claude)" w:date="2026-09-29T09:02:01Z"/>
+                <w:ins w:id="1121" w:author="Cập nhật 28 - 29/9, bản 1.3.12 (Claude)" w:date="2026-09-29T09:02:01Z"/>
+                <w:ins w:id="1112" w:author="Cập nhật 28 - 29/9, bản 1.3.12 (Claude)" w:date="2026-09-29T09:02:01Z"/>
+                <w:ins w:id="1103" w:author="Cập nhật 28 - 29/9, bản 1.3.12 (Claude)" w:date="2026-09-29T09:02:01Z"/>
+                <w:ins w:id="1094" w:author="Cập nhật 28 - 29/9, bản 1.3.12 (Claude)" w:date="2026-09-29T09:02:01Z"/>
+                <w:rFonts w:asciiTheme="majorHAnsi" w:hAnsiTheme="majorHAnsi" w:cstheme="majorHAnsi"/>
+                <w:sz w:val="28"/>
+                <w:szCs w:val="28"/>
+              </w:rPr>
+            </w:pPr>
+            <w:ins w:id="1129" w:author="Cập nhật 28 - 29/9, bản 1.3.12 (Claude)" w:date="2026-09-29T09:02:01Z">
               <w:r>
                 <w:rPr>
                   <w:rFonts w:asciiTheme="majorHAnsi" w:hAnsiTheme="majorHAnsi" w:cstheme="majorHAnsi"/>
@@ -7974,7 +8132,7 @@
         </w:rPr>
         <w:t xml:space="preserve">- Tài liệu đầu vào: Thông báo số 736/TB-CĐKT, Thông báo số 817/TB-CĐKT, </w:t>
       </w:r>
-      <w:del w:id="1120" w:author="Cập nhật 28 - 29/9, bản 1.3.12 (Claude)" w:date="2026-09-29T08:21:37Z">
+      <w:del w:id="1131" w:author="Cập nhật 28 - 29/9, bản 1.3.12 (Claude)" w:date="2026-09-29T09:02:01Z">
         <w:r>
           <w:rPr>
             <w:rFonts w:asciiTheme="majorHAnsi" w:hAnsiTheme="majorHAnsi" w:cstheme="majorHAnsi"/>
@@ -7985,7 +8143,7 @@
           <w:delText xml:space="preserve">Quyết định số 1923/QĐ-CĐKT, Thông báo số 1052/TB-CĐKT, mẫu Phụ lục</w:delText>
         </w:r>
       </w:del>
-      <w:ins w:id="1121" w:author="Cập nhật 28 - 29/9, bản 1.3.12 (Claude)" w:date="2026-09-29T08:21:37Z">
+      <w:ins w:id="1132" w:author="Cập nhật 28 - 29/9, bản 1.3.12 (Claude)" w:date="2026-09-29T09:02:01Z">
         <w:r>
           <w:rPr>
             <w:rFonts w:asciiTheme="majorHAnsi" w:hAnsiTheme="majorHAnsi" w:cstheme="majorHAnsi"/>
@@ -8128,14 +8286,14 @@
         <w:ind w:firstLine="720"/>
         <w:jc w:val="both"/>
         <w:rPr>
-          <w:ins w:id="1123" w:author="Cập nhật 28 - 29/9, bản 1.3.12 (Claude)" w:date="2026-09-29T08:21:37Z"/>
+          <w:ins w:id="1134" w:author="Cập nhật 28 - 29/9, bản 1.3.12 (Claude)" w:date="2026-09-29T09:02:01Z"/>
           <w:rFonts w:asciiTheme="majorHAnsi" w:hAnsiTheme="majorHAnsi" w:cstheme="majorHAnsi"/>
           <w:sz w:val="28"/>
           <w:szCs w:val="28"/>
           <w:shd w:val="clear" w:color="auto" w:fill="FFFFFF"/>
         </w:rPr>
       </w:pPr>
-      <w:ins w:id="1122" w:author="Cập nhật 28 - 29/9, bản 1.3.12 (Claude)" w:date="2026-09-29T08:21:37Z">
+      <w:ins w:id="1133" w:author="Cập nhật 28 - 29/9, bản 1.3.12 (Claude)" w:date="2026-09-29T09:02:01Z">
         <w:r>
           <w:rPr>
             <w:rFonts w:asciiTheme="majorHAnsi" w:hAnsiTheme="majorHAnsi" w:cstheme="majorHAnsi"/>
@@ -8183,7 +8341,7 @@
         </w:rPr>
         <w:t xml:space="preserve">(i) thẩm định độc lập bổ sung </w:t>
       </w:r>
-      <w:del w:id="1124" w:author="Cập nhật 28 - 29/9, bản 1.3.12 (Claude)" w:date="2026-09-29T08:21:37Z">
+      <w:del w:id="1135" w:author="Cập nhật 28 - 29/9, bản 1.3.12 (Claude)" w:date="2026-09-29T09:02:01Z">
         <w:r>
           <w:rPr>
             <w:rFonts w:asciiTheme="majorHAnsi" w:hAnsiTheme="majorHAnsi" w:cstheme="majorHAnsi"/>
@@ -8196,7 +8354,7 @@
           <w:delText xml:space="preserve">(vòng 5) trên tệp plugin bản 1.3.2 để xác nhận</w:delText>
         </w:r>
       </w:del>
-      <w:ins w:id="1125" w:author="Cập nhật 28 - 29/9, bản 1.3.12 (Claude)" w:date="2026-09-29T08:21:37Z">
+      <w:ins w:id="1136" w:author="Cập nhật 28 - 29/9, bản 1.3.12 (Claude)" w:date="2026-09-29T09:02:01Z">
         <w:r>
           <w:rPr>
             <w:rFonts w:asciiTheme="majorHAnsi" w:hAnsiTheme="majorHAnsi" w:cstheme="majorHAnsi"/>
@@ -8231,7 +8389,7 @@
         </w:rPr>
         <w:t xml:space="preserve">; (ii) kiểm thử nghiệm thu trên Claude (trò chuyện) và Claude Cowork; (iii) kiểm kê, thu hồi phiên bản cũ ở cấp tổ chức; phân quyền chỉ đọc kho KTC-Database có biên bản; (iv) rà soát bằng Skill “ktc-ra-soat-897” phần sửa đổi lần 3 của dự thảo Thông báo, Tài liệu hướng dẫn (2 vòng đối với Thông báo bản 5, Tài liệu hướng dẫn bản 4 đã thực hiện; Thông báo số 917/TB-CĐKT, 924/TB-CĐKT, 948/TB-CĐKT </w:t>
       </w:r>
-      <w:del w:id="1126" w:author="Cập nhật 28 - 29/9, bản 1.3.12 (Claude)" w:date="2026-09-29T08:21:37Z">
+      <w:del w:id="1137" w:author="Cập nhật 28 - 29/9, bản 1.3.12 (Claude)" w:date="2026-09-29T09:02:01Z">
         <w:r>
           <w:rPr>
             <w:rFonts w:asciiTheme="majorHAnsi" w:hAnsiTheme="majorHAnsi" w:cstheme="majorHAnsi"/>
@@ -8244,7 +8402,7 @@
           <w:delText xml:space="preserve">đã đối chiếu bản gốc ngày 27/9/2026)</w:delText>
         </w:r>
       </w:del>
-      <w:ins w:id="1127" w:author="Cập nhật 28 - 29/9, bản 1.3.12 (Claude)" w:date="2026-09-29T08:21:37Z">
+      <w:ins w:id="1138" w:author="Cập nhật 28 - 29/9, bản 1.3.12 (Claude)" w:date="2026-09-29T09:02:01Z">
         <w:r>
           <w:rPr>
             <w:rFonts w:asciiTheme="majorHAnsi" w:hAnsiTheme="majorHAnsi" w:cstheme="majorHAnsi"/>
@@ -8254,7 +8412,7 @@
             <w:szCs w:val="28"/>
             <w:shd w:val="clear" w:color="auto" w:fill="FFFFFF"/>
           </w:rPr>
-          <w:t xml:space="preserve">đã đối chiếu bản gốc ngày 27/9/2026; phần cập nhật ngày 28 - 29/9/2026 chưa rà soát bằng Skill “ktc-ra-soat-897”)</w:t>
+          <w:t xml:space="preserve">đã đối chiếu bản gốc ngày 27/9/2026; phần cập nhật ngày 28 - 29/9/2026 đã rà soát bổ sung (vòng 4) ngày 29/9/2026)</w:t>
         </w:r>
       </w:ins>
       <w:r>

</xml_diff>